<commit_message>
Integra el modelo B, estados explícitos del solver y mediciones nuevas
- Modelo B (sin subrutas explícitas) como predeterminado; A se conserva
  para reproducir la evidencia histórica y C queda como experimento.
- Estados del solver: óptimo probado, factible sin prueba, sin solución
  factible y fallo; no se reconstruyen rutas desde valores fraccionarios.
- Tiempos separados (construcción, solución, reconstrucción) y pruebas.
- Mediciones nuevas del modelo B y comparación A/B/C en results/.
- Verificadores, metodología, coherencia e inventario actualizados;
  enlaces al documento editable retirados; hash del informe sincronizado.

Co-Authored-By: Claude Sonnet 5.5 <noreply@anthropic.com>
</commit_message>
<xml_diff>
--- a/docs/Reto_CVRP_revisado.docx
+++ b/docs/Reto_CVRP_revisado.docx
@@ -296,8 +296,6 @@
         <w:jc w:val="center"/>
         <w:rPr>
           <w:rFonts w:ascii="Times" w:cs="Times" w:eastAsia="Times" w:hAnsi="Times"/>
-          <w:sz w:val="32"/>
-          <w:szCs w:val="32"/>
         </w:rPr>
       </w:pPr>
       <w:r>
@@ -309,6 +307,13 @@
         </w:rPr>
         <w:br w:type="textWrapping"/>
         <w:br w:type="textWrapping"/>
+      </w:r>
+      <w:r>
+        <w:rPr>
+          <w:rFonts w:ascii="Times" w:cs="Times" w:eastAsia="Times" w:hAnsi="Times"/>
+          <w:rtl w:val="0"/>
+        </w:rPr>
+        <w:t xml:space="preserve">Leo-issacs/cvrp-logistica-urbana: CVRP de logística urbana: modelo exacto de arcos y carga vs. Clarke-Wright + 2-opt (reto académico)</w:t>
       </w:r>
     </w:p>
     <w:p>
@@ -11813,12 +11818,12 @@
           <wp:inline distB="114300" distT="114300" distL="114300" distR="114300">
             <wp:extent cx="2540000" cy="571500"/>
             <wp:effectExtent b="0" l="0" r="0" t="0"/>
-            <wp:docPr descr="(1) Minimizar la distancia total de los arcos seleccionados." id="1" name="image6.png"/>
+            <wp:docPr descr="(1) Minimizar la distancia total de los arcos seleccionados." id="1" name="image12.png"/>
             <a:graphic>
               <a:graphicData uri="http://schemas.openxmlformats.org/drawingml/2006/picture">
                 <pic:pic>
                   <pic:nvPicPr>
-                    <pic:cNvPr descr="(1) Minimizar la distancia total de los arcos seleccionados." id="0" name="image6.png"/>
+                    <pic:cNvPr descr="(1) Minimizar la distancia total de los arcos seleccionados." id="0" name="image12.png"/>
                     <pic:cNvPicPr preferRelativeResize="0"/>
                   </pic:nvPicPr>
                   <pic:blipFill>
@@ -11883,12 +11888,12 @@
           <wp:inline distB="114300" distT="114300" distL="114300" distR="114300">
             <wp:extent cx="2768600" cy="571500"/>
             <wp:effectExtent b="0" l="0" r="0" t="0"/>
-            <wp:docPr descr="(2) Cada cliente recibe una única visita." id="5" name="image8.png"/>
+            <wp:docPr descr="(2) Cada cliente recibe una única visita." id="5" name="image6.png"/>
             <a:graphic>
               <a:graphicData uri="http://schemas.openxmlformats.org/drawingml/2006/picture">
                 <pic:pic>
                   <pic:nvPicPr>
-                    <pic:cNvPr descr="(2) Cada cliente recibe una única visita." id="0" name="image8.png"/>
+                    <pic:cNvPr descr="(2) Cada cliente recibe una única visita." id="0" name="image6.png"/>
                     <pic:cNvPicPr preferRelativeResize="0"/>
                   </pic:nvPicPr>
                   <pic:blipFill>
@@ -11953,12 +11958,12 @@
           <wp:inline distB="114300" distT="114300" distL="114300" distR="114300">
             <wp:extent cx="3492500" cy="571500"/>
             <wp:effectExtent b="0" l="0" r="0" t="0"/>
-            <wp:docPr descr="(3) Conservación del recorrido: por cada llegada hay una salida." id="13" name="image7.png"/>
+            <wp:docPr descr="(3) Conservación del recorrido: por cada llegada hay una salida." id="13" name="image11.png"/>
             <a:graphic>
               <a:graphicData uri="http://schemas.openxmlformats.org/drawingml/2006/picture">
                 <pic:pic>
                   <pic:nvPicPr>
-                    <pic:cNvPr descr="(3) Conservación del recorrido: por cada llegada hay una salida." id="0" name="image7.png"/>
+                    <pic:cNvPr descr="(3) Conservación del recorrido: por cada llegada hay una salida." id="0" name="image11.png"/>
                     <pic:cNvPicPr preferRelativeResize="0"/>
                   </pic:nvPicPr>
                   <pic:blipFill>
@@ -12023,12 +12028,12 @@
           <wp:inline distB="114300" distT="114300" distL="114300" distR="114300">
             <wp:extent cx="4965700" cy="571500"/>
             <wp:effectExtent b="0" l="0" r="0" t="0"/>
-            <wp:docPr descr="(4) Salidas y regresos al depósito; cota inferior de rutas." id="3" name="image10.png"/>
+            <wp:docPr descr="(4) Salidas y regresos al depósito; cota inferior de rutas." id="3" name="image5.png"/>
             <a:graphic>
               <a:graphicData uri="http://schemas.openxmlformats.org/drawingml/2006/picture">
                 <pic:pic>
                   <pic:nvPicPr>
-                    <pic:cNvPr descr="(4) Salidas y regresos al depósito; cota inferior de rutas." id="0" name="image10.png"/>
+                    <pic:cNvPr descr="(4) Salidas y regresos al depósito; cota inferior de rutas." id="0" name="image5.png"/>
                     <pic:cNvPicPr preferRelativeResize="0"/>
                   </pic:nvPicPr>
                   <pic:blipFill>
@@ -12093,12 +12098,12 @@
           <wp:inline distB="114300" distT="114300" distL="114300" distR="114300">
             <wp:extent cx="3810000" cy="571500"/>
             <wp:effectExtent b="0" l="0" r="0" t="0"/>
-            <wp:docPr descr="(5) Balance de producto: carga que llega menos carga que sale igual a la entrega." id="11" name="image9.png"/>
+            <wp:docPr descr="(5) Balance de producto: carga que llega menos carga que sale igual a la entrega." id="11" name="image13.png"/>
             <a:graphic>
               <a:graphicData uri="http://schemas.openxmlformats.org/drawingml/2006/picture">
                 <pic:pic>
                   <pic:nvPicPr>
-                    <pic:cNvPr descr="(5) Balance de producto: carga que llega menos carga que sale igual a la entrega." id="0" name="image9.png"/>
+                    <pic:cNvPr descr="(5) Balance de producto: carga que llega menos carga que sale igual a la entrega." id="0" name="image13.png"/>
                     <pic:cNvPicPr preferRelativeResize="0"/>
                   </pic:nvPicPr>
                   <pic:blipFill>
@@ -12163,12 +12168,12 @@
           <wp:inline distB="114300" distT="114300" distL="114300" distR="114300">
             <wp:extent cx="3644900" cy="368300"/>
             <wp:effectExtent b="0" l="0" r="0" t="0"/>
-            <wp:docPr descr="(6) Capacidad y vínculo entre carga y recorrido; sin arco no se transporta producto." id="10" name="image11.png"/>
+            <wp:docPr descr="(6) Capacidad y vínculo entre carga y recorrido; sin arco no se transporta producto." id="10" name="image8.png"/>
             <a:graphic>
               <a:graphicData uri="http://schemas.openxmlformats.org/drawingml/2006/picture">
                 <pic:pic>
                   <pic:nvPicPr>
-                    <pic:cNvPr descr="(6) Capacidad y vínculo entre carga y recorrido; sin arco no se transporta producto." id="0" name="image11.png"/>
+                    <pic:cNvPr descr="(6) Capacidad y vínculo entre carga y recorrido; sin arco no se transporta producto." id="0" name="image8.png"/>
                     <pic:cNvPicPr preferRelativeResize="0"/>
                   </pic:nvPicPr>
                   <pic:blipFill>
@@ -12233,12 +12238,12 @@
           <wp:inline distB="114300" distT="114300" distL="114300" distR="114300">
             <wp:extent cx="4419600" cy="571500"/>
             <wp:effectExtent b="0" l="0" r="0" t="0"/>
-            <wp:docPr descr="(7) Regreso vacío y carga total despachada desde el depósito." id="15" name="image13.png"/>
+            <wp:docPr descr="(7) Regreso vacío y carga total despachada desde el depósito." id="15" name="image9.png"/>
             <a:graphic>
               <a:graphicData uri="http://schemas.openxmlformats.org/drawingml/2006/picture">
                 <pic:pic>
                   <pic:nvPicPr>
-                    <pic:cNvPr descr="(7) Regreso vacío y carga total despachada desde el depósito." id="0" name="image13.png"/>
+                    <pic:cNvPr descr="(7) Regreso vacío y carga total despachada desde el depósito." id="0" name="image9.png"/>
                     <pic:cNvPicPr preferRelativeResize="0"/>
                   </pic:nvPicPr>
                   <pic:blipFill>
@@ -12303,12 +12308,12 @@
           <wp:inline distB="114300" distT="114300" distL="114300" distR="114300">
             <wp:extent cx="4394200" cy="571500"/>
             <wp:effectExtent b="0" l="0" r="0" t="0"/>
-            <wp:docPr descr="(8) Eliminación explícita de ciclos que sólo contienen clientes." id="2" name="image12.png"/>
+            <wp:docPr descr="(8) Eliminación explícita de ciclos que sólo contienen clientes." id="2" name="image7.png"/>
             <a:graphic>
               <a:graphicData uri="http://schemas.openxmlformats.org/drawingml/2006/picture">
                 <pic:pic>
                   <pic:nvPicPr>
-                    <pic:cNvPr descr="(8) Eliminación explícita de ciclos que sólo contienen clientes." id="0" name="image12.png"/>
+                    <pic:cNvPr descr="(8) Eliminación explícita de ciclos que sólo contienen clientes." id="0" name="image7.png"/>
                     <pic:cNvPicPr preferRelativeResize="0"/>
                   </pic:nvPicPr>
                   <pic:blipFill>
@@ -12673,58 +12678,6 @@
           <w:rtl w:val="0"/>
         </w:rPr>
         <w:t xml:space="preserve">4.5. Implementación y comprobación</w:t>
-      </w:r>
-    </w:p>
-    <w:p>
-      <w:pPr>
-        <w:spacing w:after="140" w:line="288" w:lineRule="auto"/>
-        <w:jc w:val="both"/>
-        <w:rPr>
-          <w:sz w:val="21"/>
-          <w:szCs w:val="21"/>
-        </w:rPr>
-      </w:pPr>
-      <w:r>
-        <w:rPr>
-          <w:sz w:val="21"/>
-          <w:szCs w:val="21"/>
-          <w:rtl w:val="0"/>
-        </w:rPr>
-        <w:t xml:space="preserve">Se revisó el archivo modelo_exacto.py del repositorio Sebastian-aleman/SP_Algoritmos-matematicos-bioinspirados (consulta: 15 de octubre de 2026). La referencia utiliza arcos xᵢ</w:t>
-      </w:r>
-      <w:r>
-        <w:rPr>
-          <w:sz w:val="21"/>
-          <w:szCs w:val="21"/>
-          <w:vertAlign w:val="subscript"/>
-          <w:rtl w:val="0"/>
-        </w:rPr>
-        <w:t xml:space="preserve">j</w:t>
-      </w:r>
-      <w:r>
-        <w:rPr>
-          <w:sz w:val="21"/>
-          <w:szCs w:val="21"/>
-          <w:rtl w:val="0"/>
-        </w:rPr>
-        <w:t xml:space="preserve"> y variables auxiliares uᵢ con restricciones MTZ de carga. Aquí se implementa una formulación propia con fᵢ</w:t>
-      </w:r>
-      <w:r>
-        <w:rPr>
-          <w:sz w:val="21"/>
-          <w:szCs w:val="21"/>
-          <w:vertAlign w:val="subscript"/>
-          <w:rtl w:val="0"/>
-        </w:rPr>
-        <w:t xml:space="preserve">j</w:t>
-      </w:r>
-      <w:r>
-        <w:rPr>
-          <w:sz w:val="21"/>
-          <w:szCs w:val="21"/>
-          <w:rtl w:val="0"/>
-        </w:rPr>
-        <w:t xml:space="preserve"> como carga física y balances de producto, para hacer visible la relación entre recorrido y entrega. Se respeta la numeración original del archivo: depósito 1 y clientes 2 a 11; la referencia usa índices internos desde 0. No se copian sus tiempos ni se mezclan resultados de versiones distintas de PuLP.</w:t>
       </w:r>
     </w:p>
     <w:p>
@@ -15477,12 +15430,12 @@
           <wp:inline distB="114300" distT="114300" distL="114300" distR="114300">
             <wp:extent cx="4381500" cy="4368800"/>
             <wp:effectExtent b="0" l="0" r="0" t="0"/>
-            <wp:docPr descr="Figura 3. Solución óptima de tres rutas certificada por particiones. Las cargas 47, 50 y 49 prueban la factibilidad de la flota mínima; no corresponden al incumbente histórico de CBC del modelo de arcos." id="7" name="image2.png"/>
+            <wp:docPr descr="Figura 3. Solución óptima de tres rutas certificada por particiones. Las cargas 47, 50 y 49 prueban la factibilidad de la flota mínima; no corresponden al incumbente histórico de CBC del modelo de arcos." id="7" name="image10.png"/>
             <a:graphic>
               <a:graphicData uri="http://schemas.openxmlformats.org/drawingml/2006/picture">
                 <pic:pic>
                   <pic:nvPicPr>
-                    <pic:cNvPr descr="Figura 3. Solución óptima de tres rutas certificada por particiones. Las cargas 47, 50 y 49 prueban la factibilidad de la flota mínima; no corresponden al incumbente histórico de CBC del modelo de arcos." id="0" name="image2.png"/>
+                    <pic:cNvPr descr="Figura 3. Solución óptima de tres rutas certificada por particiones. Las cargas 47, 50 y 49 prueban la factibilidad de la flota mínima; no corresponden al incumbente histórico de CBC del modelo de arcos." id="0" name="image10.png"/>
                     <pic:cNvPicPr preferRelativeResize="0"/>
                   </pic:nvPicPr>
                   <pic:blipFill>
@@ -16738,12 +16691,12 @@
           <wp:inline distB="114300" distT="114300" distL="114300" distR="114300">
             <wp:extent cx="4381500" cy="4445000"/>
             <wp:effectExtent b="0" l="0" r="0" t="0"/>
-            <wp:docPr descr="Figura 4. Rutas de la heurística. La agrupación de clientes difiere de la exacta aunque ambas utilizan cuatro vehículos bajo el supuesto de una ruta por vehículo." id="6" name="image5.png"/>
+            <wp:docPr descr="Figura 4. Rutas de la heurística. La agrupación de clientes difiere de la exacta aunque ambas utilizan cuatro vehículos bajo el supuesto de una ruta por vehículo." id="6" name="image2.png"/>
             <a:graphic>
               <a:graphicData uri="http://schemas.openxmlformats.org/drawingml/2006/picture">
                 <pic:pic>
                   <pic:nvPicPr>
-                    <pic:cNvPr descr="Figura 4. Rutas de la heurística. La agrupación de clientes difiere de la exacta aunque ambas utilizan cuatro vehículos bajo el supuesto de una ruta por vehículo." id="0" name="image5.png"/>
+                    <pic:cNvPr descr="Figura 4. Rutas de la heurística. La agrupación de clientes difiere de la exacta aunque ambas utilizan cuatro vehículos bajo el supuesto de una ruta por vehículo." id="0" name="image2.png"/>
                     <pic:cNvPicPr preferRelativeResize="0"/>
                   </pic:nvPicPr>
                   <pic:blipFill>
@@ -20946,13 +20899,37 @@
     </w:p>
     <w:p>
       <w:pPr>
+        <w:pStyle w:val="Heading1"/>
+        <w:keepNext w:val="0"/>
+        <w:keepLines w:val="0"/>
+        <w:spacing w:after="140" w:before="300" w:line="252.00000000000003" w:lineRule="auto"/>
+        <w:rPr>
+          <w:b w:val="1"/>
+          <w:bCs w:val="1"/>
+          <w:sz w:val="36"/>
+          <w:szCs w:val="36"/>
+        </w:rPr>
+      </w:pPr>
+      <w:bookmarkStart w:colFirst="0" w:colLast="0" w:name="_94kc2ulcxkad" w:id="25"/>
+      <w:bookmarkEnd w:id="25"/>
+      <w:r>
+        <w:rPr>
+          <w:b w:val="1"/>
+          <w:bCs w:val="1"/>
+          <w:sz w:val="36"/>
+          <w:szCs w:val="36"/>
+          <w:rtl w:val="0"/>
+        </w:rPr>
+        <w:t xml:space="preserve">Anexo A. Código de solución</w:t>
+      </w:r>
+    </w:p>
+    <w:p>
+      <w:pPr>
         <w:spacing w:after="140" w:line="288" w:lineRule="auto"/>
         <w:jc w:val="both"/>
         <w:rPr>
-          <w:color w:val="1155cc"/>
           <w:sz w:val="21"/>
           <w:szCs w:val="21"/>
-          <w:u w:val="single"/>
         </w:rPr>
       </w:pPr>
       <w:r>
@@ -20961,7 +20938,7 @@
           <w:szCs w:val="21"/>
           <w:rtl w:val="0"/>
         </w:rPr>
-        <w:t xml:space="preserve">Sebastian-aleman. (s. f.). modelo_exacto.py, en SP_Algoritmos-matematicos-bioinspirados [Código fuente; consulta: 15 de octubre de 2026]. GitHub.</w:t>
+        <w:t xml:space="preserve">El repositorio</w:t>
       </w:r>
       <w:hyperlink r:id="rId49">
         <w:r>
@@ -20974,77 +20951,6 @@
         </w:r>
       </w:hyperlink>
       <w:hyperlink r:id="rId50">
-        <w:r>
-          <w:rPr>
-            <w:color w:val="1155cc"/>
-            <w:sz w:val="21"/>
-            <w:szCs w:val="21"/>
-            <w:u w:val="single"/>
-            <w:rtl w:val="0"/>
-          </w:rPr>
-          <w:t xml:space="preserve">https://github.com/Sebastian-aleman/SP_Algoritmos-matematicos-bioinspirados/blob/main/SP%20bioinspirados/cvrp/src/modelo_exacto.py</w:t>
-        </w:r>
-      </w:hyperlink>
-      <w:r>
-        <w:rPr>
-          <w:rtl w:val="0"/>
-        </w:rPr>
-      </w:r>
-    </w:p>
-    <w:p>
-      <w:pPr>
-        <w:pStyle w:val="Heading1"/>
-        <w:keepNext w:val="0"/>
-        <w:keepLines w:val="0"/>
-        <w:spacing w:after="140" w:before="300" w:line="252.00000000000003" w:lineRule="auto"/>
-        <w:rPr>
-          <w:b w:val="1"/>
-          <w:bCs w:val="1"/>
-          <w:sz w:val="36"/>
-          <w:szCs w:val="36"/>
-        </w:rPr>
-      </w:pPr>
-      <w:bookmarkStart w:colFirst="0" w:colLast="0" w:name="_94kc2ulcxkad" w:id="25"/>
-      <w:bookmarkEnd w:id="25"/>
-      <w:r>
-        <w:rPr>
-          <w:b w:val="1"/>
-          <w:bCs w:val="1"/>
-          <w:sz w:val="36"/>
-          <w:szCs w:val="36"/>
-          <w:rtl w:val="0"/>
-        </w:rPr>
-        <w:t xml:space="preserve">Anexo A. Código de solución</w:t>
-      </w:r>
-    </w:p>
-    <w:p>
-      <w:pPr>
-        <w:spacing w:after="140" w:line="288" w:lineRule="auto"/>
-        <w:jc w:val="both"/>
-        <w:rPr>
-          <w:sz w:val="21"/>
-          <w:szCs w:val="21"/>
-        </w:rPr>
-      </w:pPr>
-      <w:r>
-        <w:rPr>
-          <w:sz w:val="21"/>
-          <w:szCs w:val="21"/>
-          <w:rtl w:val="0"/>
-        </w:rPr>
-        <w:t xml:space="preserve">El repositorio</w:t>
-      </w:r>
-      <w:hyperlink r:id="rId51">
-        <w:r>
-          <w:rPr>
-            <w:sz w:val="21"/>
-            <w:szCs w:val="21"/>
-            <w:rtl w:val="0"/>
-          </w:rPr>
-          <w:t xml:space="preserve"> </w:t>
-        </w:r>
-      </w:hyperlink>
-      <w:hyperlink r:id="rId52">
         <w:r>
           <w:rPr>
             <w:color w:val="1155cc"/>

</xml_diff>

<commit_message>
Cierra la revisión documental y unifica el diagrama del modelo B
</commit_message>
<xml_diff>
--- a/docs/Reto_CVRP_revisado.docx
+++ b/docs/Reto_CVRP_revisado.docx
@@ -306,14 +306,12 @@
           <w:rtl w:val="0"/>
         </w:rPr>
         <w:br w:type="textWrapping"/>
-        <w:br w:type="textWrapping"/>
-      </w:r>
-      <w:r>
-        <w:rPr>
-          <w:rFonts w:ascii="Times" w:cs="Times" w:eastAsia="Times" w:hAnsi="Times"/>
-          <w:rtl w:val="0"/>
-        </w:rPr>
         <w:t xml:space="preserve">Leo-issacs/cvrp-logistica-urbana: CVRP de logística urbana: modelo exacto de arcos y carga vs. Clarke-Wright + 2-opt (reto académico)</w:t>
+      </w:r>
+      <w:r>
+        <w:rPr>
+          <w:rtl w:val="0"/>
+        </w:rPr>
       </w:r>
     </w:p>
     <w:p>
@@ -12192,12 +12190,12 @@
           <wp:inline distB="114300" distT="114300" distL="114300" distR="114300">
             <wp:extent cx="2540000" cy="571500"/>
             <wp:effectExtent b="0" l="0" r="0" t="0"/>
-            <wp:docPr descr="(1) Minimizar la distancia total de los arcos seleccionados." id="12" name="image14.png"/>
+            <wp:docPr descr="(1) Minimizar la distancia total de los arcos seleccionados." id="12" name="image7.png"/>
             <a:graphic>
               <a:graphicData uri="http://schemas.openxmlformats.org/drawingml/2006/picture">
                 <pic:pic>
                   <pic:nvPicPr>
-                    <pic:cNvPr descr="(1) Minimizar la distancia total de los arcos seleccionados." id="0" name="image14.png"/>
+                    <pic:cNvPr descr="(1) Minimizar la distancia total de los arcos seleccionados." id="0" name="image7.png"/>
                     <pic:cNvPicPr preferRelativeResize="0"/>
                   </pic:nvPicPr>
                   <pic:blipFill>
@@ -12263,12 +12261,12 @@
           <wp:inline distB="114300" distT="114300" distL="114300" distR="114300">
             <wp:extent cx="2768600" cy="571500"/>
             <wp:effectExtent b="0" l="0" r="0" t="0"/>
-            <wp:docPr descr="(2) Cada cliente recibe una única visita." id="14" name="image7.png"/>
+            <wp:docPr descr="(2) Cada cliente recibe una única visita." id="14" name="image5.png"/>
             <a:graphic>
               <a:graphicData uri="http://schemas.openxmlformats.org/drawingml/2006/picture">
                 <pic:pic>
                   <pic:nvPicPr>
-                    <pic:cNvPr descr="(2) Cada cliente recibe una única visita." id="0" name="image7.png"/>
+                    <pic:cNvPr descr="(2) Cada cliente recibe una única visita." id="0" name="image5.png"/>
                     <pic:cNvPicPr preferRelativeResize="0"/>
                   </pic:nvPicPr>
                   <pic:blipFill>
@@ -12334,12 +12332,12 @@
           <wp:inline distB="114300" distT="114300" distL="114300" distR="114300">
             <wp:extent cx="3492500" cy="571500"/>
             <wp:effectExtent b="0" l="0" r="0" t="0"/>
-            <wp:docPr descr="(3) Conservación del recorrido: por cada llegada hay una salida." id="6" name="image9.png"/>
+            <wp:docPr descr="(3) Conservación del recorrido: por cada llegada hay una salida." id="6" name="image13.png"/>
             <a:graphic>
               <a:graphicData uri="http://schemas.openxmlformats.org/drawingml/2006/picture">
                 <pic:pic>
                   <pic:nvPicPr>
-                    <pic:cNvPr descr="(3) Conservación del recorrido: por cada llegada hay una salida." id="0" name="image9.png"/>
+                    <pic:cNvPr descr="(3) Conservación del recorrido: por cada llegada hay una salida." id="0" name="image13.png"/>
                     <pic:cNvPicPr preferRelativeResize="0"/>
                   </pic:nvPicPr>
                   <pic:blipFill>
@@ -12405,12 +12403,12 @@
           <wp:inline distB="114300" distT="114300" distL="114300" distR="114300">
             <wp:extent cx="4965700" cy="571500"/>
             <wp:effectExtent b="0" l="0" r="0" t="0"/>
-            <wp:docPr descr="(4) Salidas y regresos al depósito; cota inferior de rutas." id="8" name="image8.png"/>
+            <wp:docPr descr="(4) Salidas y regresos al depósito; cota inferior de rutas." id="8" name="image9.png"/>
             <a:graphic>
               <a:graphicData uri="http://schemas.openxmlformats.org/drawingml/2006/picture">
                 <pic:pic>
                   <pic:nvPicPr>
-                    <pic:cNvPr descr="(4) Salidas y regresos al depósito; cota inferior de rutas." id="0" name="image8.png"/>
+                    <pic:cNvPr descr="(4) Salidas y regresos al depósito; cota inferior de rutas." id="0" name="image9.png"/>
                     <pic:cNvPicPr preferRelativeResize="0"/>
                   </pic:nvPicPr>
                   <pic:blipFill>
@@ -12476,12 +12474,12 @@
           <wp:inline distB="114300" distT="114300" distL="114300" distR="114300">
             <wp:extent cx="3810000" cy="571500"/>
             <wp:effectExtent b="0" l="0" r="0" t="0"/>
-            <wp:docPr descr="(5) Balance de producto: carga que llega menos carga que sale igual a la entrega." id="13" name="image10.png"/>
+            <wp:docPr descr="(5) Balance de producto: carga que llega menos carga que sale igual a la entrega." id="13" name="image8.png"/>
             <a:graphic>
               <a:graphicData uri="http://schemas.openxmlformats.org/drawingml/2006/picture">
                 <pic:pic>
                   <pic:nvPicPr>
-                    <pic:cNvPr descr="(5) Balance de producto: carga que llega menos carga que sale igual a la entrega." id="0" name="image10.png"/>
+                    <pic:cNvPr descr="(5) Balance de producto: carga que llega menos carga que sale igual a la entrega." id="0" name="image8.png"/>
                     <pic:cNvPicPr preferRelativeResize="0"/>
                   </pic:nvPicPr>
                   <pic:blipFill>
@@ -12760,12 +12758,12 @@
           <wp:inline distB="114300" distT="114300" distL="114300" distR="114300">
             <wp:extent cx="3975100" cy="368300"/>
             <wp:effectExtent b="0" l="0" r="0" t="0"/>
-            <wp:docPr descr="(9) Dominio binario del recorrido y no negatividad de la carga." id="4" name="image5.png"/>
+            <wp:docPr descr="(9) Dominio binario del recorrido y no negatividad de la carga." id="4" name="image10.png"/>
             <a:graphic>
               <a:graphicData uri="http://schemas.openxmlformats.org/drawingml/2006/picture">
                 <pic:pic>
                   <pic:nvPicPr>
-                    <pic:cNvPr descr="(9) Dominio binario del recorrido y no negatividad de la carga." id="0" name="image5.png"/>
+                    <pic:cNvPr descr="(9) Dominio binario del recorrido y no negatividad de la carga." id="0" name="image10.png"/>
                     <pic:cNvPicPr preferRelativeResize="0"/>
                   </pic:nvPicPr>
                   <pic:blipFill>
@@ -12964,17 +12962,17 @@
           <wp:inline distB="114300" distT="114300" distL="114300" distR="114300">
             <wp:extent cx="5524500" cy="3530600"/>
             <wp:effectExtent b="0" l="0" r="0" t="0"/>
-            <wp:docPr descr="Figura 1. Variables de recorrido y carga conectadas con la función objetivo y las restricciones. Ejemplo: ruta 1 → 3 → 2 → 6 → 1; carga inicial 44 unidades." id="1" name="image15.png"/>
+            <wp:docPr id="1" name="image15.png"/>
             <a:graphic>
               <a:graphicData uri="http://schemas.openxmlformats.org/drawingml/2006/picture">
                 <pic:pic>
                   <pic:nvPicPr>
-                    <pic:cNvPr descr="Figura 1. Variables de recorrido y carga conectadas con la función objetivo y las restricciones. Ejemplo: ruta 1 → 3 → 2 → 6 → 1; carga inicial 44 unidades." id="0" name="image15.png"/>
+                    <pic:cNvPr id="0" name="image15.png"/>
                     <pic:cNvPicPr preferRelativeResize="0"/>
                   </pic:nvPicPr>
                   <pic:blipFill>
                     <a:blip r:embed="rId16"/>
-                    <a:srcRect b="0" l="0" r="0" t="0"/>
+                    <a:srcRect b="125" l="0" r="0" t="125"/>
                     <a:stretch>
                       <a:fillRect/>
                     </a:stretch>
@@ -13122,7 +13120,15 @@
           <w:szCs w:val="21"/>
           <w:rtl w:val="0"/>
         </w:rPr>
-        <w:t xml:space="preserve">Se establece una línea base mediante ahorros de Clarke–Wright con mejora 2-opt dentro de cada ruta. Es una heurística clásica, no un algoritmo bioinspirado. Su función en esta primera etapa es ofrecer una solución rápida y verificable con la cual comparar el método exacto.</w:t>
+        <w:t xml:space="preserve">Se adopta Clarke–Wright + 2-opt: el pseudocódigo, el Anexo A y las mediciones usan este algoritmo.</w:t>
+      </w:r>
+      <w:r>
+        <w:rPr>
+          <w:sz w:val="21"/>
+          <w:szCs w:val="21"/>
+          <w:rtl w:val="0"/>
+        </w:rPr>
+        <w:t xml:space="preserve"> Es una heurística clásica, no un algoritmo bioinspirado. Su función en esta primera etapa es ofrecer una solución rápida y verificable con la cual comparar el método exacto.</w:t>
       </w:r>
     </w:p>
     <w:p>
@@ -14728,12 +14734,12 @@
           <wp:inline distB="114300" distT="114300" distL="114300" distR="114300">
             <wp:extent cx="4673600" cy="4737100"/>
             <wp:effectExtent b="0" l="0" r="0" t="0"/>
-            <wp:docPr descr="Figura 2. Rutas de la solución exacta. Los números identifican nodos, no colores ni vehículos. Las flechas indican el sentido de visita; el cuadrado negro es el depósito." id="10" name="image3.png"/>
+            <wp:docPr descr="Figura 2. Rutas de la solución exacta. Los números identifican nodos, no colores ni vehículos. Las flechas indican el sentido de visita; el cuadrado negro es el depósito." id="10" name="image4.png"/>
             <a:graphic>
               <a:graphicData uri="http://schemas.openxmlformats.org/drawingml/2006/picture">
                 <pic:pic>
                   <pic:nvPicPr>
-                    <pic:cNvPr descr="Figura 2. Rutas de la solución exacta. Los números identifican nodos, no colores ni vehículos. Las flechas indican el sentido de visita; el cuadrado negro es el depósito." id="0" name="image3.png"/>
+                    <pic:cNvPr descr="Figura 2. Rutas de la solución exacta. Los números identifican nodos, no colores ni vehículos. Las flechas indican el sentido de visita; el cuadrado negro es el depósito." id="0" name="image4.png"/>
                     <pic:cNvPicPr preferRelativeResize="0"/>
                   </pic:nvPicPr>
                   <pic:blipFill>
@@ -15817,12 +15823,12 @@
           <wp:inline distB="114300" distT="114300" distL="114300" distR="114300">
             <wp:extent cx="4673600" cy="4648200"/>
             <wp:effectExtent b="0" l="0" r="0" t="0"/>
-            <wp:docPr descr="Figura 3. Solución óptima de tres rutas del modelo B, verificada por particiones. Cargas de 47, 50 y 49 unidades; el sentido inverso conserva el costo." id="9" name="image4.png"/>
+            <wp:docPr descr="Figura 3. Solución óptima de tres rutas del modelo B, verificada por particiones. Cargas de 47, 50 y 49 unidades; el sentido inverso conserva el costo." id="9" name="image2.png"/>
             <a:graphic>
               <a:graphicData uri="http://schemas.openxmlformats.org/drawingml/2006/picture">
                 <pic:pic>
                   <pic:nvPicPr>
-                    <pic:cNvPr descr="Figura 3. Solución óptima de tres rutas del modelo B, verificada por particiones. Cargas de 47, 50 y 49 unidades; el sentido inverso conserva el costo." id="0" name="image4.png"/>
+                    <pic:cNvPr descr="Figura 3. Solución óptima de tres rutas del modelo B, verificada por particiones. Cargas de 47, 50 y 49 unidades; el sentido inverso conserva el costo." id="0" name="image2.png"/>
                     <pic:cNvPicPr preferRelativeResize="0"/>
                   </pic:nvPicPr>
                   <pic:blipFill>
@@ -17080,12 +17086,12 @@
           <wp:inline distB="114300" distT="114300" distL="114300" distR="114300">
             <wp:extent cx="4673600" cy="4737100"/>
             <wp:effectExtent b="0" l="0" r="0" t="0"/>
-            <wp:docPr descr="Figura 4. Rutas de la heurística. La agrupación de clientes difiere de la exacta aunque ambas utilizan cuatro vehículos bajo el supuesto de una ruta por vehículo." id="15" name="image2.png"/>
+            <wp:docPr descr="Figura 4. Rutas de la heurística. La agrupación de clientes difiere de la exacta aunque ambas utilizan cuatro vehículos bajo el supuesto de una ruta por vehículo." id="15" name="image3.png"/>
             <a:graphic>
               <a:graphicData uri="http://schemas.openxmlformats.org/drawingml/2006/picture">
                 <pic:pic>
                   <pic:nvPicPr>
-                    <pic:cNvPr descr="Figura 4. Rutas de la heurística. La agrupación de clientes difiere de la exacta aunque ambas utilizan cuatro vehículos bajo el supuesto de una ruta por vehículo." id="0" name="image2.png"/>
+                    <pic:cNvPr descr="Figura 4. Rutas de la heurística. La agrupación de clientes difiere de la exacta aunque ambas utilizan cuatro vehículos bajo el supuesto de una ruta por vehículo." id="0" name="image3.png"/>
                     <pic:cNvPicPr preferRelativeResize="0"/>
                   </pic:nvPicPr>
                   <pic:blipFill>
@@ -20846,12 +20852,12 @@
           <wp:inline distB="114300" distT="114300" distL="114300" distR="114300">
             <wp:extent cx="5524500" cy="2489200"/>
             <wp:effectExtent b="0" l="0" r="0" t="0"/>
-            <wp:docPr descr="Figura 5. Distancia y tiempo medio del modelo B sin flota fija y de Clarke–Wright + 2-opt. Medición principal del 15 de octubre de 2026; tiempos en escala logarítmica." id="2" name="image13.png"/>
+            <wp:docPr descr="Figura 5. Distancia y tiempo medio del modelo B sin flota fija y de Clarke–Wright + 2-opt. Medición principal del 15 de octubre de 2026; tiempos en escala logarítmica." id="2" name="image14.png"/>
             <a:graphic>
               <a:graphicData uri="http://schemas.openxmlformats.org/drawingml/2006/picture">
                 <pic:pic>
                   <pic:nvPicPr>
-                    <pic:cNvPr descr="Figura 5. Distancia y tiempo medio del modelo B sin flota fija y de Clarke–Wright + 2-opt. Medición principal del 15 de octubre de 2026; tiempos en escala logarítmica." id="0" name="image13.png"/>
+                    <pic:cNvPr descr="Figura 5. Distancia y tiempo medio del modelo B sin flota fija y de Clarke–Wright + 2-opt. Medición principal del 15 de octubre de 2026; tiempos en escala logarítmica." id="0" name="image14.png"/>
                     <pic:cNvPicPr preferRelativeResize="0"/>
                   </pic:nvPicPr>
                   <pic:blipFill>

</xml_diff>

<commit_message>
Revisa la narrativa del informe y publica la entrega LaTeX
</commit_message>
<xml_diff>
--- a/docs/Reto_CVRP_revisado.docx
+++ b/docs/Reto_CVRP_revisado.docx
@@ -22,7 +22,7 @@
           <wp:inline distB="0" distT="0" distL="0" distR="0">
             <wp:extent cx="4927160" cy="1296538"/>
             <wp:effectExtent b="0" l="0" r="0" t="0"/>
-            <wp:docPr id="3" name="image1.png"/>
+            <wp:docPr id="9" name="image1.png"/>
             <a:graphic>
               <a:graphicData uri="http://schemas.openxmlformats.org/drawingml/2006/picture">
                 <pic:pic>
@@ -372,7 +372,7 @@
           <w:szCs w:val="36"/>
         </w:rPr>
       </w:pPr>
-      <w:bookmarkStart w:colFirst="0" w:colLast="0" w:name="_whlkcjcc6fwv" w:id="0"/>
+      <w:bookmarkStart w:colFirst="0" w:colLast="0" w:name="_syd3lvv7wmr8" w:id="0"/>
       <w:bookmarkEnd w:id="0"/>
       <w:r>
         <w:rPr>
@@ -400,7 +400,7 @@
           <w:szCs w:val="21"/>
           <w:rtl w:val="0"/>
         </w:rPr>
-        <w:t xml:space="preserve">El crecimiento de las compras en línea exige distribuir numerosos pedidos en espacios urbanos limitados. La situación planteada en la actividad describe dificultades de estacionamiento, congestión, costos de reparto y presión por entregar con rapidez. La percepción inicial es que estos problemas no se resuelven únicamente aumentando la flota: también requieren decidir qué clientes atenderá cada vehículo, en qué orden y con qué carga. La nota de Sherman (2018), incluida en el planteamiento del curso, se utiliza como contexto histórico; sus ejemplos no constituyen mediciones actuales de esta instancia.</w:t>
+        <w:t xml:space="preserve">El crecimiento de las compras en línea exige distribuir numerosos pedidos en espacios urbanos limitados. La situación descrita por Sherman (2018) reúne dificultades de estacionamiento, congestión, costos de reparto y presión por entregar con rapidez. Nuestra percepción inicial es que mejorar las entregas requiere coordinar la asignación de clientes, el orden de visita y la carga de los vehículos. Este informe estudia esas decisiones mediante una instancia de diez clientes y compara una solución exacta con una heurística de ahorros y mejora local.</w:t>
       </w:r>
     </w:p>
     <w:p>
@@ -416,7 +416,7 @@
           <w:szCs w:val="26"/>
         </w:rPr>
       </w:pPr>
-      <w:bookmarkStart w:colFirst="0" w:colLast="0" w:name="_o0obq9c7bsia" w:id="1"/>
+      <w:bookmarkStart w:colFirst="0" w:colLast="0" w:name="_4nemss2j2rlf" w:id="1"/>
       <w:bookmarkEnd w:id="1"/>
       <w:r>
         <w:rPr>
@@ -478,7 +478,7 @@
           <w:szCs w:val="26"/>
         </w:rPr>
       </w:pPr>
-      <w:bookmarkStart w:colFirst="0" w:colLast="0" w:name="_l0r3lpblr4rd" w:id="2"/>
+      <w:bookmarkStart w:colFirst="0" w:colLast="0" w:name="_rw4e2pse1eb8" w:id="2"/>
       <w:bookmarkEnd w:id="2"/>
       <w:r>
         <w:rPr>
@@ -506,7 +506,7 @@
           <w:szCs w:val="21"/>
           <w:rtl w:val="0"/>
         </w:rPr>
-        <w:t xml:space="preserve">El costo de última milla combina el uso de vehículos, combustible, mantenimiento, trabajo del conductor, tiempo de servicio, búsqueda de estacionamiento y posibles reintentos de entrega. Su importancia económica está documentada: McKinsey &amp; Company (2016, p. 6) señala que la última milla frecuentemente alcanza o supera el 50% del costo total de entrega de paquetes. Es una referencia sectorial de 2016, no una proporción medida en esta instancia ni una tarifa vigente para México.</w:t>
+        <w:t xml:space="preserve">El costo de última milla combina el uso de vehículos, combustible, mantenimiento, trabajo del conductor, servicio, búsqueda de estacionamiento y reintentos de entrega. McKinsey &amp; Company (2016, p. 6) señala que esta etapa frecuentemente alcanza o supera el 50% del costo total de entrega de paquetes, lo que explica el interés por mejorar su planificación.</w:t>
       </w:r>
     </w:p>
     <w:p>
@@ -524,7 +524,7 @@
           <w:szCs w:val="21"/>
           <w:rtl w:val="0"/>
         </w:rPr>
-        <w:t xml:space="preserve">La distancia no representa por sí sola todo ese costo. McKinsey &amp; Company (2018) estima que, en redes densas, el costo total del vehículo, incluido el kilometraje, representa menos del 15% del costo de última milla. Esto explica por qué ahorrar kilómetros puede ser insuficiente si aumentan los tiempos de servicio o la cantidad de vehículos. Además, Dalla Chiara y Goodchild (2020), con una muestra de 2,900 trayectos de reparto y recolección en el centro de Seattle, estimaron 2.3 minutos de búsqueda de estacionamiento por trayecto, equivalentes al 28% de su tiempo total. Es evidencia localizada; no se extrapola automáticamente a Monterrey.</w:t>
+        <w:t xml:space="preserve">La distancia representa sólo una parte del costo. McKinsey &amp; Company (2018) estima que, en redes densas, el costo total del vehículo, incluido el kilometraje, supone menos del 15% del costo de última milla. Por su parte, Dalla Chiara y Goodchild (2020) analizaron 2,900 trayectos de reparto y recolección en el centro de Seattle y estimaron 2.3 minutos de búsqueda de estacionamiento por trayecto, equivalentes al 28% de su tiempo total. Estos resultados muestran la importancia de considerar también la flota, el servicio y las condiciones de operación.</w:t>
       </w:r>
     </w:p>
     <w:p>
@@ -542,7 +542,7 @@
           <w:szCs w:val="21"/>
           <w:rtl w:val="0"/>
         </w:rPr>
-        <w:t xml:space="preserve">Para traducir las rutas a dinero se podría usar Costo = F·m + a·D + b·T + P, donde F es el costo fijo por vehículo utilizado, m el número de rutas, a el costo variable por unidad de distancia, D la distancia total, b el costo laboral por unidad de tiempo, T el tiempo operativo total y P los cargos por estacionamiento o reintentos. Cada componente debe evitar doble conteo: por ejemplo, si a ya incluye combustible, no se suma otra vez. El tiempo operativo T es distinto del tiempo que tarda el programa en encontrar una solución.</w:t>
+        <w:t xml:space="preserve">Un marco para evaluar el costo logístico es Costo = F·m + a·D + b·T + P. Aquí F representa el costo fijo por vehículo, m el número de rutas, a el costo por unidad de distancia, D la distancia total, b el costo laboral por unidad de tiempo, T el tiempo operativo y P los cargos por estacionamiento o reintentos. Los componentes se definen de forma complementaria para evitar contabilizar dos veces un mismo gasto.</w:t>
       </w:r>
     </w:p>
     <w:p>
@@ -560,7 +560,7 @@
           <w:szCs w:val="21"/>
           <w:rtl w:val="0"/>
         </w:rPr>
-        <w:t xml:space="preserve">La instancia sólo aporta coordenadas, demandas y capacidad. Por ello el objetivo resuelto es D, medido en unidades de distancia, y no un costo monetario inventado. La comparación ya muestra una decisión económica relevante: tres rutas recorren 20.175187 unidades más que cuatro. Si todos los demás componentes fueran iguales, tres rutas serían preferibles cuando el ahorro de un costo fijo F superara a·20.175187. Este umbral expresa la relación entre uso de flota y recorrido; no constituye una cotización.</w:t>
+        <w:t xml:space="preserve">Con las coordenadas, demandas y capacidad disponibles, este estudio minimiza la distancia D. La comparación entre tres y cuatro rutas permite interpretar su relación con el costo: tres rutas recorren 20.175187 unidades adicionales. Manteniendo iguales los demás componentes, esa opción sería preferible si el ahorro de un vehículo superara el costo del recorrido adicional, es decir, si F &gt; a·20.175187.</w:t>
       </w:r>
     </w:p>
     <w:p>
@@ -576,7 +576,7 @@
           <w:szCs w:val="26"/>
         </w:rPr>
       </w:pPr>
-      <w:bookmarkStart w:colFirst="0" w:colLast="0" w:name="_8meamolmnhxp" w:id="3"/>
+      <w:bookmarkStart w:colFirst="0" w:colLast="0" w:name="_pzadtqu4kiah" w:id="3"/>
       <w:bookmarkEnd w:id="3"/>
       <w:r>
         <w:rPr>
@@ -604,7 +604,7 @@
           <w:szCs w:val="21"/>
           <w:rtl w:val="0"/>
         </w:rPr>
-        <w:t xml:space="preserve">El reparto urbano genera recorridos adicionales para buscar estacionamiento, paradas frecuentes y consumo energético durante circulación y espera. Estos procesos vinculan las decisiones de ruteo con emisiones, congestión y ocupación del espacio vial. En un escenario publicado en 2020 para las 100 ciudades más grandes, el World Economic Forum proyectó que, sin intervenciones, los vehículos de reparto aumentarían 36% y las emisiones asociadas crecerían alrededor de un tercio hacia 2030, hasta 25 millones de toneladas de CO₂ anuales. Son proyecciones de ese estudio, no emisiones observadas en 2026 ni resultados de nuestro programa.</w:t>
+        <w:t xml:space="preserve">El reparto urbano genera circulación adicional para buscar estacionamiento, paradas frecuentes y consumo energético durante la circulación y la espera. Estas operaciones relacionan el ruteo con las emisiones, la congestión y la ocupación del espacio vial. En su escenario de no intervención para las 100 ciudades más grandes, el World Economic Forum (2020) proyectó hacia 2030 un aumento del 36% en los vehículos de reparto y de alrededor de un tercio en las emisiones asociadas, hasta 25 millones de toneladas de CO₂ anuales.</w:t>
       </w:r>
     </w:p>
     <w:p>
@@ -658,7 +658,7 @@
           <w:szCs w:val="21"/>
           <w:rtl w:val="0"/>
         </w:rPr>
-        <w:t xml:space="preserve">En este caso, la solución exacta reduce la distancia en 20.263383 unidades frente a la heurística, aproximadamente 5.97% del recorrido heurístico. Sólo bajo el supuesto adicional de una misma tasa constante de emisiones por unidad de distancia, sin diferencias por carga, velocidad o espera, esa reducción implicaría una disminución proporcional del componente de emisiones por recorrido. Es una relación condicional del modelo, no una medición de CO₂. Esta precisión permite usar el CVRP como primer indicador operativo sin atribuirle beneficios ambientales que los datos no demuestran.</w:t>
+        <w:t xml:space="preserve">La solución exacta reduce el recorrido en 20.263383 unidades frente a la heurística, equivalentes al 5.97% de la distancia heurística. Bajo una tasa constante de emisiones por unidad de distancia, esa reducción se traduciría proporcionalmente al componente de emisiones por recorrido. Una evaluación ambiental completa deberá incorporar además carga, velocidad, tecnología y espera, como proponen los trabajos citados.</w:t>
       </w:r>
     </w:p>
     <w:p>
@@ -674,7 +674,7 @@
           <w:szCs w:val="26"/>
         </w:rPr>
       </w:pPr>
-      <w:bookmarkStart w:colFirst="0" w:colLast="0" w:name="_2azb764vrfi" w:id="4"/>
+      <w:bookmarkStart w:colFirst="0" w:colLast="0" w:name="_3v5t6ap8ilg9" w:id="4"/>
       <w:bookmarkEnd w:id="4"/>
       <w:r>
         <w:rPr>
@@ -718,7 +718,7 @@
           <w:szCs w:val="36"/>
         </w:rPr>
       </w:pPr>
-      <w:bookmarkStart w:colFirst="0" w:colLast="0" w:name="_w59mdl44zqq1" w:id="5"/>
+      <w:bookmarkStart w:colFirst="0" w:colLast="0" w:name="_3h2onabomdrc" w:id="5"/>
       <w:bookmarkEnd w:id="5"/>
       <w:r>
         <w:rPr>
@@ -746,12 +746,11 @@
           <w:szCs w:val="21"/>
           <w:rtl w:val="0"/>
         </w:rPr>
-        <w:t xml:space="preserve">La Tabla 1 compara cinco artículos sobre ruteo capacitado y dos extensiones ambientales. Se distinguen problema, método y utilidad para esta instancia. No se equiparan sus tiempos ni sus resultados, porque emplean datos y protocolos distintos.</w:t>
+        <w:t xml:space="preserve">La Tabla 1 compara siete artículos sobre ruteo capacitado y sus extensiones ambientales. Se distinguen el problema, el método de solución y su utilidad para el caso estudiado.</w:t>
       </w:r>
     </w:p>
     <w:p>
       <w:pPr>
-        <w:keepNext w:val="1"/>
         <w:spacing w:after="180" w:before="180" w:line="252.00000000000003" w:lineRule="auto"/>
         <w:rPr>
           <w:b w:val="1"/>
@@ -774,7 +773,7 @@
     <w:tbl>
       <w:tblPr>
         <w:tblStyle w:val="Table1"/>
-        <w:tblW w:w="8895.0" w:type="dxa"/>
+        <w:tblW w:w="8910.0" w:type="dxa"/>
         <w:jc w:val="left"/>
         <w:tblBorders>
           <w:top w:color="000000" w:space="0" w:sz="0" w:val="nil"/>
@@ -788,23 +787,23 @@
         <w:tblLook w:val="0600"/>
       </w:tblPr>
       <w:tblGrid>
-        <w:gridCol w:w="1395"/>
-        <w:gridCol w:w="1950"/>
+        <w:gridCol w:w="1365"/>
+        <w:gridCol w:w="1935"/>
         <w:gridCol w:w="1980"/>
-        <w:gridCol w:w="3570"/>
+        <w:gridCol w:w="3630"/>
         <w:tblGridChange w:id="0">
           <w:tblGrid>
-            <w:gridCol w:w="1395"/>
-            <w:gridCol w:w="1950"/>
+            <w:gridCol w:w="1365"/>
+            <w:gridCol w:w="1935"/>
             <w:gridCol w:w="1980"/>
-            <w:gridCol w:w="3570"/>
+            <w:gridCol w:w="3630"/>
           </w:tblGrid>
         </w:tblGridChange>
       </w:tblGrid>
       <w:tr>
         <w:trPr>
           <w:cantSplit w:val="0"/>
-          <w:trHeight w:val="375" w:hRule="atLeast"/>
+          <w:trHeight w:val="315" w:hRule="atLeast"/>
           <w:tblHeader w:val="0"/>
         </w:trPr>
         <w:tc>
@@ -817,10 +816,10 @@
             </w:tcBorders>
             <w:shd w:fill="e9eff3" w:val="clear"/>
             <w:tcMar>
-              <w:top w:w="80.0" w:type="dxa"/>
-              <w:left w:w="80.0" w:type="dxa"/>
-              <w:bottom w:w="80.0" w:type="dxa"/>
-              <w:right w:w="80.0" w:type="dxa"/>
+              <w:top w:w="40.0" w:type="dxa"/>
+              <w:left w:w="40.0" w:type="dxa"/>
+              <w:bottom w:w="40.0" w:type="dxa"/>
+              <w:right w:w="40.0" w:type="dxa"/>
             </w:tcMar>
             <w:vAlign w:val="top"/>
           </w:tcPr>
@@ -860,10 +859,10 @@
             </w:tcBorders>
             <w:shd w:fill="e9eff3" w:val="clear"/>
             <w:tcMar>
-              <w:top w:w="80.0" w:type="dxa"/>
-              <w:left w:w="80.0" w:type="dxa"/>
-              <w:bottom w:w="80.0" w:type="dxa"/>
-              <w:right w:w="80.0" w:type="dxa"/>
+              <w:top w:w="40.0" w:type="dxa"/>
+              <w:left w:w="40.0" w:type="dxa"/>
+              <w:bottom w:w="40.0" w:type="dxa"/>
+              <w:right w:w="40.0" w:type="dxa"/>
             </w:tcMar>
             <w:vAlign w:val="top"/>
           </w:tcPr>
@@ -903,10 +902,10 @@
             </w:tcBorders>
             <w:shd w:fill="e9eff3" w:val="clear"/>
             <w:tcMar>
-              <w:top w:w="80.0" w:type="dxa"/>
-              <w:left w:w="80.0" w:type="dxa"/>
-              <w:bottom w:w="80.0" w:type="dxa"/>
-              <w:right w:w="80.0" w:type="dxa"/>
+              <w:top w:w="40.0" w:type="dxa"/>
+              <w:left w:w="40.0" w:type="dxa"/>
+              <w:bottom w:w="40.0" w:type="dxa"/>
+              <w:right w:w="40.0" w:type="dxa"/>
             </w:tcMar>
             <w:vAlign w:val="top"/>
           </w:tcPr>
@@ -946,10 +945,10 @@
             </w:tcBorders>
             <w:shd w:fill="e9eff3" w:val="clear"/>
             <w:tcMar>
-              <w:top w:w="80.0" w:type="dxa"/>
-              <w:left w:w="80.0" w:type="dxa"/>
-              <w:bottom w:w="80.0" w:type="dxa"/>
-              <w:right w:w="80.0" w:type="dxa"/>
+              <w:top w:w="40.0" w:type="dxa"/>
+              <w:left w:w="40.0" w:type="dxa"/>
+              <w:bottom w:w="40.0" w:type="dxa"/>
+              <w:right w:w="40.0" w:type="dxa"/>
             </w:tcMar>
             <w:vAlign w:val="top"/>
           </w:tcPr>
@@ -983,7 +982,7 @@
       <w:tr>
         <w:trPr>
           <w:cantSplit w:val="0"/>
-          <w:trHeight w:val="795" w:hRule="atLeast"/>
+          <w:trHeight w:val="735" w:hRule="atLeast"/>
           <w:tblHeader w:val="0"/>
         </w:trPr>
         <w:tc>
@@ -996,10 +995,10 @@
             </w:tcBorders>
             <w:shd w:fill="ffffff" w:val="clear"/>
             <w:tcMar>
-              <w:top w:w="80.0" w:type="dxa"/>
-              <w:left w:w="80.0" w:type="dxa"/>
-              <w:bottom w:w="80.0" w:type="dxa"/>
-              <w:right w:w="80.0" w:type="dxa"/>
+              <w:top w:w="40.0" w:type="dxa"/>
+              <w:left w:w="40.0" w:type="dxa"/>
+              <w:bottom w:w="40.0" w:type="dxa"/>
+              <w:right w:w="40.0" w:type="dxa"/>
             </w:tcMar>
             <w:vAlign w:val="top"/>
           </w:tcPr>
@@ -1037,10 +1036,10 @@
             </w:tcBorders>
             <w:shd w:fill="ffffff" w:val="clear"/>
             <w:tcMar>
-              <w:top w:w="80.0" w:type="dxa"/>
-              <w:left w:w="80.0" w:type="dxa"/>
-              <w:bottom w:w="80.0" w:type="dxa"/>
-              <w:right w:w="80.0" w:type="dxa"/>
+              <w:top w:w="40.0" w:type="dxa"/>
+              <w:left w:w="40.0" w:type="dxa"/>
+              <w:bottom w:w="40.0" w:type="dxa"/>
+              <w:right w:w="40.0" w:type="dxa"/>
             </w:tcMar>
             <w:vAlign w:val="top"/>
           </w:tcPr>
@@ -1078,10 +1077,10 @@
             </w:tcBorders>
             <w:shd w:fill="ffffff" w:val="clear"/>
             <w:tcMar>
-              <w:top w:w="80.0" w:type="dxa"/>
-              <w:left w:w="80.0" w:type="dxa"/>
-              <w:bottom w:w="80.0" w:type="dxa"/>
-              <w:right w:w="80.0" w:type="dxa"/>
+              <w:top w:w="40.0" w:type="dxa"/>
+              <w:left w:w="40.0" w:type="dxa"/>
+              <w:bottom w:w="40.0" w:type="dxa"/>
+              <w:right w:w="40.0" w:type="dxa"/>
             </w:tcMar>
             <w:vAlign w:val="top"/>
           </w:tcPr>
@@ -1119,10 +1118,10 @@
             </w:tcBorders>
             <w:shd w:fill="ffffff" w:val="clear"/>
             <w:tcMar>
-              <w:top w:w="80.0" w:type="dxa"/>
-              <w:left w:w="80.0" w:type="dxa"/>
-              <w:bottom w:w="80.0" w:type="dxa"/>
-              <w:right w:w="80.0" w:type="dxa"/>
+              <w:top w:w="40.0" w:type="dxa"/>
+              <w:left w:w="40.0" w:type="dxa"/>
+              <w:bottom w:w="40.0" w:type="dxa"/>
+              <w:right w:w="40.0" w:type="dxa"/>
             </w:tcMar>
             <w:vAlign w:val="top"/>
           </w:tcPr>
@@ -1154,7 +1153,7 @@
       <w:tr>
         <w:trPr>
           <w:cantSplit w:val="0"/>
-          <w:trHeight w:val="585" w:hRule="atLeast"/>
+          <w:trHeight w:val="525" w:hRule="atLeast"/>
           <w:tblHeader w:val="0"/>
         </w:trPr>
         <w:tc>
@@ -1167,10 +1166,10 @@
             </w:tcBorders>
             <w:shd w:fill="ffffff" w:val="clear"/>
             <w:tcMar>
-              <w:top w:w="80.0" w:type="dxa"/>
-              <w:left w:w="80.0" w:type="dxa"/>
-              <w:bottom w:w="80.0" w:type="dxa"/>
-              <w:right w:w="80.0" w:type="dxa"/>
+              <w:top w:w="40.0" w:type="dxa"/>
+              <w:left w:w="40.0" w:type="dxa"/>
+              <w:bottom w:w="40.0" w:type="dxa"/>
+              <w:right w:w="40.0" w:type="dxa"/>
             </w:tcMar>
             <w:vAlign w:val="top"/>
           </w:tcPr>
@@ -1208,10 +1207,10 @@
             </w:tcBorders>
             <w:shd w:fill="ffffff" w:val="clear"/>
             <w:tcMar>
-              <w:top w:w="80.0" w:type="dxa"/>
-              <w:left w:w="80.0" w:type="dxa"/>
-              <w:bottom w:w="80.0" w:type="dxa"/>
-              <w:right w:w="80.0" w:type="dxa"/>
+              <w:top w:w="40.0" w:type="dxa"/>
+              <w:left w:w="40.0" w:type="dxa"/>
+              <w:bottom w:w="40.0" w:type="dxa"/>
+              <w:right w:w="40.0" w:type="dxa"/>
             </w:tcMar>
             <w:vAlign w:val="top"/>
           </w:tcPr>
@@ -1249,10 +1248,10 @@
             </w:tcBorders>
             <w:shd w:fill="ffffff" w:val="clear"/>
             <w:tcMar>
-              <w:top w:w="80.0" w:type="dxa"/>
-              <w:left w:w="80.0" w:type="dxa"/>
-              <w:bottom w:w="80.0" w:type="dxa"/>
-              <w:right w:w="80.0" w:type="dxa"/>
+              <w:top w:w="40.0" w:type="dxa"/>
+              <w:left w:w="40.0" w:type="dxa"/>
+              <w:bottom w:w="40.0" w:type="dxa"/>
+              <w:right w:w="40.0" w:type="dxa"/>
             </w:tcMar>
             <w:vAlign w:val="top"/>
           </w:tcPr>
@@ -1290,10 +1289,10 @@
             </w:tcBorders>
             <w:shd w:fill="ffffff" w:val="clear"/>
             <w:tcMar>
-              <w:top w:w="80.0" w:type="dxa"/>
-              <w:left w:w="80.0" w:type="dxa"/>
-              <w:bottom w:w="80.0" w:type="dxa"/>
-              <w:right w:w="80.0" w:type="dxa"/>
+              <w:top w:w="40.0" w:type="dxa"/>
+              <w:left w:w="40.0" w:type="dxa"/>
+              <w:bottom w:w="40.0" w:type="dxa"/>
+              <w:right w:w="40.0" w:type="dxa"/>
             </w:tcMar>
             <w:vAlign w:val="top"/>
           </w:tcPr>
@@ -1325,7 +1324,7 @@
       <w:tr>
         <w:trPr>
           <w:cantSplit w:val="0"/>
-          <w:trHeight w:val="795" w:hRule="atLeast"/>
+          <w:trHeight w:val="735" w:hRule="atLeast"/>
           <w:tblHeader w:val="0"/>
         </w:trPr>
         <w:tc>
@@ -1338,10 +1337,10 @@
             </w:tcBorders>
             <w:shd w:fill="ffffff" w:val="clear"/>
             <w:tcMar>
-              <w:top w:w="80.0" w:type="dxa"/>
-              <w:left w:w="80.0" w:type="dxa"/>
-              <w:bottom w:w="80.0" w:type="dxa"/>
-              <w:right w:w="80.0" w:type="dxa"/>
+              <w:top w:w="40.0" w:type="dxa"/>
+              <w:left w:w="40.0" w:type="dxa"/>
+              <w:bottom w:w="40.0" w:type="dxa"/>
+              <w:right w:w="40.0" w:type="dxa"/>
             </w:tcMar>
             <w:vAlign w:val="top"/>
           </w:tcPr>
@@ -1379,10 +1378,10 @@
             </w:tcBorders>
             <w:shd w:fill="ffffff" w:val="clear"/>
             <w:tcMar>
-              <w:top w:w="80.0" w:type="dxa"/>
-              <w:left w:w="80.0" w:type="dxa"/>
-              <w:bottom w:w="80.0" w:type="dxa"/>
-              <w:right w:w="80.0" w:type="dxa"/>
+              <w:top w:w="40.0" w:type="dxa"/>
+              <w:left w:w="40.0" w:type="dxa"/>
+              <w:bottom w:w="40.0" w:type="dxa"/>
+              <w:right w:w="40.0" w:type="dxa"/>
             </w:tcMar>
             <w:vAlign w:val="top"/>
           </w:tcPr>
@@ -1420,10 +1419,10 @@
             </w:tcBorders>
             <w:shd w:fill="ffffff" w:val="clear"/>
             <w:tcMar>
-              <w:top w:w="80.0" w:type="dxa"/>
-              <w:left w:w="80.0" w:type="dxa"/>
-              <w:bottom w:w="80.0" w:type="dxa"/>
-              <w:right w:w="80.0" w:type="dxa"/>
+              <w:top w:w="40.0" w:type="dxa"/>
+              <w:left w:w="40.0" w:type="dxa"/>
+              <w:bottom w:w="40.0" w:type="dxa"/>
+              <w:right w:w="40.0" w:type="dxa"/>
             </w:tcMar>
             <w:vAlign w:val="top"/>
           </w:tcPr>
@@ -1461,10 +1460,10 @@
             </w:tcBorders>
             <w:shd w:fill="ffffff" w:val="clear"/>
             <w:tcMar>
-              <w:top w:w="80.0" w:type="dxa"/>
-              <w:left w:w="80.0" w:type="dxa"/>
-              <w:bottom w:w="80.0" w:type="dxa"/>
-              <w:right w:w="80.0" w:type="dxa"/>
+              <w:top w:w="40.0" w:type="dxa"/>
+              <w:left w:w="40.0" w:type="dxa"/>
+              <w:bottom w:w="40.0" w:type="dxa"/>
+              <w:right w:w="40.0" w:type="dxa"/>
             </w:tcMar>
             <w:vAlign w:val="top"/>
           </w:tcPr>
@@ -1496,7 +1495,7 @@
       <w:tr>
         <w:trPr>
           <w:cantSplit w:val="0"/>
-          <w:trHeight w:val="795" w:hRule="atLeast"/>
+          <w:trHeight w:val="735" w:hRule="atLeast"/>
           <w:tblHeader w:val="0"/>
         </w:trPr>
         <w:tc>
@@ -1509,10 +1508,10 @@
             </w:tcBorders>
             <w:shd w:fill="ffffff" w:val="clear"/>
             <w:tcMar>
-              <w:top w:w="80.0" w:type="dxa"/>
-              <w:left w:w="80.0" w:type="dxa"/>
-              <w:bottom w:w="80.0" w:type="dxa"/>
-              <w:right w:w="80.0" w:type="dxa"/>
+              <w:top w:w="40.0" w:type="dxa"/>
+              <w:left w:w="40.0" w:type="dxa"/>
+              <w:bottom w:w="40.0" w:type="dxa"/>
+              <w:right w:w="40.0" w:type="dxa"/>
             </w:tcMar>
             <w:vAlign w:val="top"/>
           </w:tcPr>
@@ -1550,10 +1549,10 @@
             </w:tcBorders>
             <w:shd w:fill="ffffff" w:val="clear"/>
             <w:tcMar>
-              <w:top w:w="80.0" w:type="dxa"/>
-              <w:left w:w="80.0" w:type="dxa"/>
-              <w:bottom w:w="80.0" w:type="dxa"/>
-              <w:right w:w="80.0" w:type="dxa"/>
+              <w:top w:w="40.0" w:type="dxa"/>
+              <w:left w:w="40.0" w:type="dxa"/>
+              <w:bottom w:w="40.0" w:type="dxa"/>
+              <w:right w:w="40.0" w:type="dxa"/>
             </w:tcMar>
             <w:vAlign w:val="top"/>
           </w:tcPr>
@@ -1591,10 +1590,10 @@
             </w:tcBorders>
             <w:shd w:fill="ffffff" w:val="clear"/>
             <w:tcMar>
-              <w:top w:w="80.0" w:type="dxa"/>
-              <w:left w:w="80.0" w:type="dxa"/>
-              <w:bottom w:w="80.0" w:type="dxa"/>
-              <w:right w:w="80.0" w:type="dxa"/>
+              <w:top w:w="40.0" w:type="dxa"/>
+              <w:left w:w="40.0" w:type="dxa"/>
+              <w:bottom w:w="40.0" w:type="dxa"/>
+              <w:right w:w="40.0" w:type="dxa"/>
             </w:tcMar>
             <w:vAlign w:val="top"/>
           </w:tcPr>
@@ -1632,10 +1631,10 @@
             </w:tcBorders>
             <w:shd w:fill="ffffff" w:val="clear"/>
             <w:tcMar>
-              <w:top w:w="80.0" w:type="dxa"/>
-              <w:left w:w="80.0" w:type="dxa"/>
-              <w:bottom w:w="80.0" w:type="dxa"/>
-              <w:right w:w="80.0" w:type="dxa"/>
+              <w:top w:w="40.0" w:type="dxa"/>
+              <w:left w:w="40.0" w:type="dxa"/>
+              <w:bottom w:w="40.0" w:type="dxa"/>
+              <w:right w:w="40.0" w:type="dxa"/>
             </w:tcMar>
             <w:vAlign w:val="top"/>
           </w:tcPr>
@@ -1667,7 +1666,7 @@
       <w:tr>
         <w:trPr>
           <w:cantSplit w:val="0"/>
-          <w:trHeight w:val="795" w:hRule="atLeast"/>
+          <w:trHeight w:val="525" w:hRule="atLeast"/>
           <w:tblHeader w:val="0"/>
         </w:trPr>
         <w:tc>
@@ -1680,10 +1679,10 @@
             </w:tcBorders>
             <w:shd w:fill="ffffff" w:val="clear"/>
             <w:tcMar>
-              <w:top w:w="80.0" w:type="dxa"/>
-              <w:left w:w="80.0" w:type="dxa"/>
-              <w:bottom w:w="80.0" w:type="dxa"/>
-              <w:right w:w="80.0" w:type="dxa"/>
+              <w:top w:w="40.0" w:type="dxa"/>
+              <w:left w:w="40.0" w:type="dxa"/>
+              <w:bottom w:w="40.0" w:type="dxa"/>
+              <w:right w:w="40.0" w:type="dxa"/>
             </w:tcMar>
             <w:vAlign w:val="top"/>
           </w:tcPr>
@@ -1721,10 +1720,10 @@
             </w:tcBorders>
             <w:shd w:fill="ffffff" w:val="clear"/>
             <w:tcMar>
-              <w:top w:w="80.0" w:type="dxa"/>
-              <w:left w:w="80.0" w:type="dxa"/>
-              <w:bottom w:w="80.0" w:type="dxa"/>
-              <w:right w:w="80.0" w:type="dxa"/>
+              <w:top w:w="40.0" w:type="dxa"/>
+              <w:left w:w="40.0" w:type="dxa"/>
+              <w:bottom w:w="40.0" w:type="dxa"/>
+              <w:right w:w="40.0" w:type="dxa"/>
             </w:tcMar>
             <w:vAlign w:val="top"/>
           </w:tcPr>
@@ -1762,10 +1761,10 @@
             </w:tcBorders>
             <w:shd w:fill="ffffff" w:val="clear"/>
             <w:tcMar>
-              <w:top w:w="80.0" w:type="dxa"/>
-              <w:left w:w="80.0" w:type="dxa"/>
-              <w:bottom w:w="80.0" w:type="dxa"/>
-              <w:right w:w="80.0" w:type="dxa"/>
+              <w:top w:w="40.0" w:type="dxa"/>
+              <w:left w:w="40.0" w:type="dxa"/>
+              <w:bottom w:w="40.0" w:type="dxa"/>
+              <w:right w:w="40.0" w:type="dxa"/>
             </w:tcMar>
             <w:vAlign w:val="top"/>
           </w:tcPr>
@@ -1803,10 +1802,10 @@
             </w:tcBorders>
             <w:shd w:fill="ffffff" w:val="clear"/>
             <w:tcMar>
-              <w:top w:w="80.0" w:type="dxa"/>
-              <w:left w:w="80.0" w:type="dxa"/>
-              <w:bottom w:w="80.0" w:type="dxa"/>
-              <w:right w:w="80.0" w:type="dxa"/>
+              <w:top w:w="40.0" w:type="dxa"/>
+              <w:left w:w="40.0" w:type="dxa"/>
+              <w:bottom w:w="40.0" w:type="dxa"/>
+              <w:right w:w="40.0" w:type="dxa"/>
             </w:tcMar>
             <w:vAlign w:val="top"/>
           </w:tcPr>
@@ -1838,7 +1837,7 @@
       <w:tr>
         <w:trPr>
           <w:cantSplit w:val="0"/>
-          <w:trHeight w:val="795" w:hRule="atLeast"/>
+          <w:trHeight w:val="735" w:hRule="atLeast"/>
           <w:tblHeader w:val="0"/>
         </w:trPr>
         <w:tc>
@@ -1851,10 +1850,10 @@
             </w:tcBorders>
             <w:shd w:fill="ffffff" w:val="clear"/>
             <w:tcMar>
-              <w:top w:w="80.0" w:type="dxa"/>
-              <w:left w:w="80.0" w:type="dxa"/>
-              <w:bottom w:w="80.0" w:type="dxa"/>
-              <w:right w:w="80.0" w:type="dxa"/>
+              <w:top w:w="40.0" w:type="dxa"/>
+              <w:left w:w="40.0" w:type="dxa"/>
+              <w:bottom w:w="40.0" w:type="dxa"/>
+              <w:right w:w="40.0" w:type="dxa"/>
             </w:tcMar>
             <w:vAlign w:val="top"/>
           </w:tcPr>
@@ -1892,10 +1891,10 @@
             </w:tcBorders>
             <w:shd w:fill="ffffff" w:val="clear"/>
             <w:tcMar>
-              <w:top w:w="80.0" w:type="dxa"/>
-              <w:left w:w="80.0" w:type="dxa"/>
-              <w:bottom w:w="80.0" w:type="dxa"/>
-              <w:right w:w="80.0" w:type="dxa"/>
+              <w:top w:w="40.0" w:type="dxa"/>
+              <w:left w:w="40.0" w:type="dxa"/>
+              <w:bottom w:w="40.0" w:type="dxa"/>
+              <w:right w:w="40.0" w:type="dxa"/>
             </w:tcMar>
             <w:vAlign w:val="top"/>
           </w:tcPr>
@@ -1933,10 +1932,10 @@
             </w:tcBorders>
             <w:shd w:fill="ffffff" w:val="clear"/>
             <w:tcMar>
-              <w:top w:w="80.0" w:type="dxa"/>
-              <w:left w:w="80.0" w:type="dxa"/>
-              <w:bottom w:w="80.0" w:type="dxa"/>
-              <w:right w:w="80.0" w:type="dxa"/>
+              <w:top w:w="40.0" w:type="dxa"/>
+              <w:left w:w="40.0" w:type="dxa"/>
+              <w:bottom w:w="40.0" w:type="dxa"/>
+              <w:right w:w="40.0" w:type="dxa"/>
             </w:tcMar>
             <w:vAlign w:val="top"/>
           </w:tcPr>
@@ -1974,10 +1973,10 @@
             </w:tcBorders>
             <w:shd w:fill="ffffff" w:val="clear"/>
             <w:tcMar>
-              <w:top w:w="80.0" w:type="dxa"/>
-              <w:left w:w="80.0" w:type="dxa"/>
-              <w:bottom w:w="80.0" w:type="dxa"/>
-              <w:right w:w="80.0" w:type="dxa"/>
+              <w:top w:w="40.0" w:type="dxa"/>
+              <w:left w:w="40.0" w:type="dxa"/>
+              <w:bottom w:w="40.0" w:type="dxa"/>
+              <w:right w:w="40.0" w:type="dxa"/>
             </w:tcMar>
             <w:vAlign w:val="top"/>
           </w:tcPr>
@@ -2009,7 +2008,7 @@
       <w:tr>
         <w:trPr>
           <w:cantSplit w:val="0"/>
-          <w:trHeight w:val="795" w:hRule="atLeast"/>
+          <w:trHeight w:val="525" w:hRule="atLeast"/>
           <w:tblHeader w:val="0"/>
         </w:trPr>
         <w:tc>
@@ -2022,10 +2021,10 @@
             </w:tcBorders>
             <w:shd w:fill="ffffff" w:val="clear"/>
             <w:tcMar>
-              <w:top w:w="80.0" w:type="dxa"/>
-              <w:left w:w="80.0" w:type="dxa"/>
-              <w:bottom w:w="80.0" w:type="dxa"/>
-              <w:right w:w="80.0" w:type="dxa"/>
+              <w:top w:w="40.0" w:type="dxa"/>
+              <w:left w:w="40.0" w:type="dxa"/>
+              <w:bottom w:w="40.0" w:type="dxa"/>
+              <w:right w:w="40.0" w:type="dxa"/>
             </w:tcMar>
             <w:vAlign w:val="top"/>
           </w:tcPr>
@@ -2063,10 +2062,10 @@
             </w:tcBorders>
             <w:shd w:fill="ffffff" w:val="clear"/>
             <w:tcMar>
-              <w:top w:w="80.0" w:type="dxa"/>
-              <w:left w:w="80.0" w:type="dxa"/>
-              <w:bottom w:w="80.0" w:type="dxa"/>
-              <w:right w:w="80.0" w:type="dxa"/>
+              <w:top w:w="40.0" w:type="dxa"/>
+              <w:left w:w="40.0" w:type="dxa"/>
+              <w:bottom w:w="40.0" w:type="dxa"/>
+              <w:right w:w="40.0" w:type="dxa"/>
             </w:tcMar>
             <w:vAlign w:val="top"/>
           </w:tcPr>
@@ -2104,10 +2103,10 @@
             </w:tcBorders>
             <w:shd w:fill="ffffff" w:val="clear"/>
             <w:tcMar>
-              <w:top w:w="80.0" w:type="dxa"/>
-              <w:left w:w="80.0" w:type="dxa"/>
-              <w:bottom w:w="80.0" w:type="dxa"/>
-              <w:right w:w="80.0" w:type="dxa"/>
+              <w:top w:w="40.0" w:type="dxa"/>
+              <w:left w:w="40.0" w:type="dxa"/>
+              <w:bottom w:w="40.0" w:type="dxa"/>
+              <w:right w:w="40.0" w:type="dxa"/>
             </w:tcMar>
             <w:vAlign w:val="top"/>
           </w:tcPr>
@@ -2145,10 +2144,10 @@
             </w:tcBorders>
             <w:shd w:fill="ffffff" w:val="clear"/>
             <w:tcMar>
-              <w:top w:w="80.0" w:type="dxa"/>
-              <w:left w:w="80.0" w:type="dxa"/>
-              <w:bottom w:w="80.0" w:type="dxa"/>
-              <w:right w:w="80.0" w:type="dxa"/>
+              <w:top w:w="40.0" w:type="dxa"/>
+              <w:left w:w="40.0" w:type="dxa"/>
+              <w:bottom w:w="40.0" w:type="dxa"/>
+              <w:right w:w="40.0" w:type="dxa"/>
             </w:tcMar>
             <w:vAlign w:val="top"/>
           </w:tcPr>
@@ -2211,7 +2210,7 @@
           <w:szCs w:val="21"/>
           <w:rtl w:val="0"/>
         </w:rPr>
-        <w:t xml:space="preserve">Como complemento de métodos exactos, Toth y Vigo (eds., 2014) reúnen enfoques de ramificación y acotamiento, generación de columnas y cortes para CVRP. Esta referencia permite situar la formulación por arcos y carga dentro de una familia más amplia de métodos exactos. Es un libro de apoyo y no sustituye a los cinco artículos de CVRP solicitados.</w:t>
+        <w:t xml:space="preserve">Toth y Vigo (eds., 2014) complementan estos artículos con una exposición de métodos exactos de ramificación y acotamiento, generación de columnas y cortes para el CVRP. Esta referencia sitúa la formulación por arcos y carga dentro de una familia más amplia de métodos de optimización.</w:t>
       </w:r>
     </w:p>
     <w:p>
@@ -2227,7 +2226,7 @@
           <w:szCs w:val="36"/>
         </w:rPr>
       </w:pPr>
-      <w:bookmarkStart w:colFirst="0" w:colLast="0" w:name="_3eno3m2dt332" w:id="6"/>
+      <w:bookmarkStart w:colFirst="0" w:colLast="0" w:name="_136t22pnktxi" w:id="6"/>
       <w:bookmarkEnd w:id="6"/>
       <w:r>
         <w:rPr>
@@ -2255,7 +2254,7 @@
           <w:szCs w:val="21"/>
           <w:rtl w:val="0"/>
         </w:rPr>
-        <w:t xml:space="preserve">Los tres archivos proporcionados contienen la misma instancia CVRP_10. DIMENSION = 11 incluye el depósito 1 y los clientes 2 a 11; no son once clientes. La capacidad es Q = 50 y la demanda total es 146 unidades. No se especifican kilómetros, toneladas o volumen, por lo que se reportan unidades de distancia y unidades de carga.</w:t>
+        <w:t xml:space="preserve">La instancia CVRP_10 contiene once nodos: el depósito 1 y los diez clientes 2 a 11. La capacidad por vehículo es Q = 50 y la demanda total es 146 unidades. Las coordenadas y demandas se presentan en la Tabla 2; sus magnitudes se expresan en unidades de distancia y de carga.</w:t>
       </w:r>
     </w:p>
     <w:p>
@@ -2279,7 +2278,6 @@
     </w:p>
     <w:p>
       <w:pPr>
-        <w:keepNext w:val="1"/>
         <w:spacing w:after="180" w:before="180" w:line="252.00000000000003" w:lineRule="auto"/>
         <w:rPr>
           <w:b w:val="1"/>
@@ -4899,7 +4897,7 @@
           <w:szCs w:val="26"/>
         </w:rPr>
       </w:pPr>
-      <w:bookmarkStart w:colFirst="0" w:colLast="0" w:name="_onwbisietcac" w:id="7"/>
+      <w:bookmarkStart w:colFirst="0" w:colLast="0" w:name="_kl5d3zjzxqdh" w:id="7"/>
       <w:bookmarkEnd w:id="7"/>
       <w:r>
         <w:rPr>
@@ -4947,7 +4945,7 @@
           <w:szCs w:val="21"/>
           <w:rtl w:val="0"/>
         </w:rPr>
-        <w:t xml:space="preserve">Se utiliza distancia euclidiana sin redondear en todos los cálculos principales, conforme al propósito de construir distancias a partir de coordenadas. La matriz se presenta con dos decimales únicamente para facilitar su lectura. Por ejemplo, c₁₂ = √[(50 − 20)² + (50 − 70)²] = √1300 = 36.05551275. No se usan las cifras redondeadas de la tabla para resolver el modelo.</w:t>
+        <w:t xml:space="preserve">Los cálculos principales emplean distancias euclidianas sin redondear. La Tabla 3 muestra dos decimales para facilitar la lectura; el modelo conserva la precisión completa. Por ejemplo, c₁₂ = √[(50 − 20)² + (50 − 70)²] = √1300 = 36.05551275.</w:t>
       </w:r>
     </w:p>
     <w:p>
@@ -4965,12 +4963,11 @@
           <w:szCs w:val="21"/>
           <w:rtl w:val="0"/>
         </w:rPr>
-        <w:t xml:space="preserve">Convención de distancia: la instancia emplea el identificador EUC_2D de TSPLIB (Reinelt, 1991). La FAQ de TSPLIB y la documentación de tsplib95 especifican el redondeo al entero más cercano. Aquí se declara expresamente la variante euclidiana continua como caso principal. Se resolvió también la variante entera con floor(distancia + 0.5): su óptimo es 317 unidades y conserva los cuatro grupos de clientes. No se compara 317 con 318.989487 como si ambos procedieran de la misma matriz.</w:t>
+        <w:t xml:space="preserve">El identificador EUC_2D del archivo corresponde a la convención TSPLIB de redondeo al entero más cercano (Reinelt, 1991; TSPLIB FAQ). Para estudiar la distancia geométrica se adopta aquí la variante euclidiana continua. Como comprobación de sensibilidad, la variante entera, calculada con floor(distancia + 0.5), tiene óptimo 317 y conserva los cuatro grupos de clientes. La diferencia entre ambos valores responde a la matriz de costos utilizada.</w:t>
       </w:r>
     </w:p>
     <w:p>
       <w:pPr>
-        <w:keepNext w:val="1"/>
         <w:spacing w:after="180" w:before="180" w:line="252.00000000000003" w:lineRule="auto"/>
         <w:rPr>
           <w:b w:val="1"/>
@@ -11062,7 +11059,7 @@
           <w:szCs w:val="36"/>
         </w:rPr>
       </w:pPr>
-      <w:bookmarkStart w:colFirst="0" w:colLast="0" w:name="_yys1l6ka5lbj" w:id="8"/>
+      <w:bookmarkStart w:colFirst="0" w:colLast="0" w:name="_5vih9cgvudrv" w:id="8"/>
       <w:bookmarkEnd w:id="8"/>
       <w:r>
         <w:rPr>
@@ -11088,7 +11085,7 @@
           <w:szCs w:val="26"/>
         </w:rPr>
       </w:pPr>
-      <w:bookmarkStart w:colFirst="0" w:colLast="0" w:name="_6ybwd5lb1juj" w:id="9"/>
+      <w:bookmarkStart w:colFirst="0" w:colLast="0" w:name="_wau4qf2sm0f6" w:id="9"/>
       <w:bookmarkEnd w:id="9"/>
       <w:r>
         <w:rPr>
@@ -11169,7 +11166,7 @@
           <w:szCs w:val="21"/>
           <w:rtl w:val="0"/>
         </w:rPr>
-        <w:t xml:space="preserve">Se decide qué arcos recorrer y cuánta carga transportar en cada arco, de manera que los recorridos formen rutas que salen de 1, entregan la demanda completa de cada cliente exactamente una vez y regresan a 1. Cada ruta corresponde a un vehículo en una única salida; no se permiten entregas divididas, recargas intermedias ni ciclos desconectados del depósito. El número de rutas es una decisión derivada y no se fija en tres en el caso principal. Se minimiza la suma de distancias recorridas; no se incorporan ventanas de tiempo ni costos monetarios porque la instancia no los proporciona.</w:t>
+        <w:t xml:space="preserve">Se decide qué arcos recorrer y cuánta carga transportar en ellos, de modo que cada cliente reciba su demanda completa una vez y cada vehículo salga del depósito y regrese a él. Cada ruta corresponde a una salida de un vehículo, sin entregas divididas ni recargas intermedias. El objetivo minimiza la distancia total y determina el número de rutas. Después se analiza una flota de exactamente tres vehículos.</w:t>
       </w:r>
     </w:p>
     <w:p>
@@ -11185,7 +11182,7 @@
           <w:szCs w:val="26"/>
         </w:rPr>
       </w:pPr>
-      <w:bookmarkStart w:colFirst="0" w:colLast="0" w:name="_ixownsci060x" w:id="10"/>
+      <w:bookmarkStart w:colFirst="0" w:colLast="0" w:name="_5nu0z4xgahy9" w:id="10"/>
       <w:bookmarkEnd w:id="10"/>
       <w:r>
         <w:rPr>
@@ -11237,19 +11234,19 @@
         <w:tblLook w:val="0600"/>
       </w:tblPr>
       <w:tblGrid>
-        <w:gridCol w:w="1035"/>
-        <w:gridCol w:w="7860"/>
+        <w:gridCol w:w="1050"/>
+        <w:gridCol w:w="7845"/>
         <w:tblGridChange w:id="0">
           <w:tblGrid>
-            <w:gridCol w:w="1035"/>
-            <w:gridCol w:w="7860"/>
+            <w:gridCol w:w="1050"/>
+            <w:gridCol w:w="7845"/>
           </w:tblGrid>
         </w:tblGridChange>
       </w:tblGrid>
       <w:tr>
         <w:trPr>
           <w:cantSplit w:val="0"/>
-          <w:trHeight w:val="375" w:hRule="atLeast"/>
+          <w:trHeight w:val="315" w:hRule="atLeast"/>
           <w:tblHeader w:val="0"/>
         </w:trPr>
         <w:tc>
@@ -11262,10 +11259,10 @@
             </w:tcBorders>
             <w:shd w:fill="e9eff3" w:val="clear"/>
             <w:tcMar>
-              <w:top w:w="80.0" w:type="dxa"/>
-              <w:left w:w="80.0" w:type="dxa"/>
-              <w:bottom w:w="80.0" w:type="dxa"/>
-              <w:right w:w="80.0" w:type="dxa"/>
+              <w:top w:w="40.0" w:type="dxa"/>
+              <w:left w:w="40.0" w:type="dxa"/>
+              <w:bottom w:w="40.0" w:type="dxa"/>
+              <w:right w:w="40.0" w:type="dxa"/>
             </w:tcMar>
             <w:vAlign w:val="top"/>
           </w:tcPr>
@@ -11305,10 +11302,10 @@
             </w:tcBorders>
             <w:shd w:fill="e9eff3" w:val="clear"/>
             <w:tcMar>
-              <w:top w:w="80.0" w:type="dxa"/>
-              <w:left w:w="80.0" w:type="dxa"/>
-              <w:bottom w:w="80.0" w:type="dxa"/>
-              <w:right w:w="80.0" w:type="dxa"/>
+              <w:top w:w="40.0" w:type="dxa"/>
+              <w:left w:w="40.0" w:type="dxa"/>
+              <w:bottom w:w="40.0" w:type="dxa"/>
+              <w:right w:w="40.0" w:type="dxa"/>
             </w:tcMar>
             <w:vAlign w:val="top"/>
           </w:tcPr>
@@ -11342,7 +11339,7 @@
       <w:tr>
         <w:trPr>
           <w:cantSplit w:val="0"/>
-          <w:trHeight w:val="375" w:hRule="atLeast"/>
+          <w:trHeight w:val="315" w:hRule="atLeast"/>
           <w:tblHeader w:val="0"/>
         </w:trPr>
         <w:tc>
@@ -11355,10 +11352,10 @@
             </w:tcBorders>
             <w:shd w:fill="ffffff" w:val="clear"/>
             <w:tcMar>
-              <w:top w:w="80.0" w:type="dxa"/>
-              <w:left w:w="80.0" w:type="dxa"/>
-              <w:bottom w:w="80.0" w:type="dxa"/>
-              <w:right w:w="80.0" w:type="dxa"/>
+              <w:top w:w="40.0" w:type="dxa"/>
+              <w:left w:w="40.0" w:type="dxa"/>
+              <w:bottom w:w="40.0" w:type="dxa"/>
+              <w:right w:w="40.0" w:type="dxa"/>
             </w:tcMar>
             <w:vAlign w:val="top"/>
           </w:tcPr>
@@ -11396,10 +11393,10 @@
             </w:tcBorders>
             <w:shd w:fill="ffffff" w:val="clear"/>
             <w:tcMar>
-              <w:top w:w="80.0" w:type="dxa"/>
-              <w:left w:w="80.0" w:type="dxa"/>
-              <w:bottom w:w="80.0" w:type="dxa"/>
-              <w:right w:w="80.0" w:type="dxa"/>
+              <w:top w:w="40.0" w:type="dxa"/>
+              <w:left w:w="40.0" w:type="dxa"/>
+              <w:bottom w:w="40.0" w:type="dxa"/>
+              <w:right w:w="40.0" w:type="dxa"/>
             </w:tcMar>
             <w:vAlign w:val="top"/>
           </w:tcPr>
@@ -11431,7 +11428,7 @@
       <w:tr>
         <w:trPr>
           <w:cantSplit w:val="0"/>
-          <w:trHeight w:val="390" w:hRule="atLeast"/>
+          <w:trHeight w:val="330" w:hRule="atLeast"/>
           <w:tblHeader w:val="0"/>
         </w:trPr>
         <w:tc>
@@ -11444,10 +11441,10 @@
             </w:tcBorders>
             <w:shd w:fill="ffffff" w:val="clear"/>
             <w:tcMar>
-              <w:top w:w="80.0" w:type="dxa"/>
-              <w:left w:w="80.0" w:type="dxa"/>
-              <w:bottom w:w="80.0" w:type="dxa"/>
-              <w:right w:w="80.0" w:type="dxa"/>
+              <w:top w:w="40.0" w:type="dxa"/>
+              <w:left w:w="40.0" w:type="dxa"/>
+              <w:bottom w:w="40.0" w:type="dxa"/>
+              <w:right w:w="40.0" w:type="dxa"/>
             </w:tcMar>
             <w:vAlign w:val="top"/>
           </w:tcPr>
@@ -11485,10 +11482,10 @@
             </w:tcBorders>
             <w:shd w:fill="ffffff" w:val="clear"/>
             <w:tcMar>
-              <w:top w:w="80.0" w:type="dxa"/>
-              <w:left w:w="80.0" w:type="dxa"/>
-              <w:bottom w:w="80.0" w:type="dxa"/>
-              <w:right w:w="80.0" w:type="dxa"/>
+              <w:top w:w="40.0" w:type="dxa"/>
+              <w:left w:w="40.0" w:type="dxa"/>
+              <w:bottom w:w="40.0" w:type="dxa"/>
+              <w:right w:w="40.0" w:type="dxa"/>
             </w:tcMar>
             <w:vAlign w:val="top"/>
           </w:tcPr>
@@ -11520,7 +11517,7 @@
       <w:tr>
         <w:trPr>
           <w:cantSplit w:val="0"/>
-          <w:trHeight w:val="405" w:hRule="atLeast"/>
+          <w:trHeight w:val="345" w:hRule="atLeast"/>
           <w:tblHeader w:val="0"/>
         </w:trPr>
         <w:tc>
@@ -11533,10 +11530,10 @@
             </w:tcBorders>
             <w:shd w:fill="ffffff" w:val="clear"/>
             <w:tcMar>
-              <w:top w:w="80.0" w:type="dxa"/>
-              <w:left w:w="80.0" w:type="dxa"/>
-              <w:bottom w:w="80.0" w:type="dxa"/>
-              <w:right w:w="80.0" w:type="dxa"/>
+              <w:top w:w="40.0" w:type="dxa"/>
+              <w:left w:w="40.0" w:type="dxa"/>
+              <w:bottom w:w="40.0" w:type="dxa"/>
+              <w:right w:w="40.0" w:type="dxa"/>
             </w:tcMar>
             <w:vAlign w:val="top"/>
           </w:tcPr>
@@ -11583,10 +11580,10 @@
             </w:tcBorders>
             <w:shd w:fill="ffffff" w:val="clear"/>
             <w:tcMar>
-              <w:top w:w="80.0" w:type="dxa"/>
-              <w:left w:w="80.0" w:type="dxa"/>
-              <w:bottom w:w="80.0" w:type="dxa"/>
-              <w:right w:w="80.0" w:type="dxa"/>
+              <w:top w:w="40.0" w:type="dxa"/>
+              <w:left w:w="40.0" w:type="dxa"/>
+              <w:bottom w:w="40.0" w:type="dxa"/>
+              <w:right w:w="40.0" w:type="dxa"/>
             </w:tcMar>
             <w:vAlign w:val="top"/>
           </w:tcPr>
@@ -11618,7 +11615,7 @@
       <w:tr>
         <w:trPr>
           <w:cantSplit w:val="0"/>
-          <w:trHeight w:val="405" w:hRule="atLeast"/>
+          <w:trHeight w:val="345" w:hRule="atLeast"/>
           <w:tblHeader w:val="0"/>
         </w:trPr>
         <w:tc>
@@ -11631,10 +11628,10 @@
             </w:tcBorders>
             <w:shd w:fill="ffffff" w:val="clear"/>
             <w:tcMar>
-              <w:top w:w="80.0" w:type="dxa"/>
-              <w:left w:w="80.0" w:type="dxa"/>
-              <w:bottom w:w="80.0" w:type="dxa"/>
-              <w:right w:w="80.0" w:type="dxa"/>
+              <w:top w:w="40.0" w:type="dxa"/>
+              <w:left w:w="40.0" w:type="dxa"/>
+              <w:bottom w:w="40.0" w:type="dxa"/>
+              <w:right w:w="40.0" w:type="dxa"/>
             </w:tcMar>
             <w:vAlign w:val="top"/>
           </w:tcPr>
@@ -11690,10 +11687,10 @@
             </w:tcBorders>
             <w:shd w:fill="ffffff" w:val="clear"/>
             <w:tcMar>
-              <w:top w:w="80.0" w:type="dxa"/>
-              <w:left w:w="80.0" w:type="dxa"/>
-              <w:bottom w:w="80.0" w:type="dxa"/>
-              <w:right w:w="80.0" w:type="dxa"/>
+              <w:top w:w="40.0" w:type="dxa"/>
+              <w:left w:w="40.0" w:type="dxa"/>
+              <w:bottom w:w="40.0" w:type="dxa"/>
+              <w:right w:w="40.0" w:type="dxa"/>
             </w:tcMar>
             <w:vAlign w:val="top"/>
           </w:tcPr>
@@ -11726,7 +11723,7 @@
       <w:tr>
         <w:trPr>
           <w:cantSplit w:val="0"/>
-          <w:trHeight w:val="585" w:hRule="atLeast"/>
+          <w:trHeight w:val="525" w:hRule="atLeast"/>
           <w:tblHeader w:val="0"/>
         </w:trPr>
         <w:tc>
@@ -11739,10 +11736,10 @@
             </w:tcBorders>
             <w:shd w:fill="ffffff" w:val="clear"/>
             <w:tcMar>
-              <w:top w:w="80.0" w:type="dxa"/>
-              <w:left w:w="80.0" w:type="dxa"/>
-              <w:bottom w:w="80.0" w:type="dxa"/>
-              <w:right w:w="80.0" w:type="dxa"/>
+              <w:top w:w="40.0" w:type="dxa"/>
+              <w:left w:w="40.0" w:type="dxa"/>
+              <w:bottom w:w="40.0" w:type="dxa"/>
+              <w:right w:w="40.0" w:type="dxa"/>
             </w:tcMar>
             <w:vAlign w:val="top"/>
           </w:tcPr>
@@ -11798,10 +11795,10 @@
             </w:tcBorders>
             <w:shd w:fill="ffffff" w:val="clear"/>
             <w:tcMar>
-              <w:top w:w="80.0" w:type="dxa"/>
-              <w:left w:w="80.0" w:type="dxa"/>
-              <w:bottom w:w="80.0" w:type="dxa"/>
-              <w:right w:w="80.0" w:type="dxa"/>
+              <w:top w:w="40.0" w:type="dxa"/>
+              <w:left w:w="40.0" w:type="dxa"/>
+              <w:bottom w:w="40.0" w:type="dxa"/>
+              <w:right w:w="40.0" w:type="dxa"/>
             </w:tcMar>
             <w:vAlign w:val="top"/>
           </w:tcPr>
@@ -11834,7 +11831,7 @@
       <w:tr>
         <w:trPr>
           <w:cantSplit w:val="0"/>
-          <w:trHeight w:val="660" w:hRule="atLeast"/>
+          <w:trHeight w:val="600" w:hRule="atLeast"/>
           <w:tblHeader w:val="0"/>
         </w:trPr>
         <w:tc>
@@ -11847,10 +11844,10 @@
             </w:tcBorders>
             <w:shd w:fill="ffffff" w:val="clear"/>
             <w:tcMar>
-              <w:top w:w="80.0" w:type="dxa"/>
-              <w:left w:w="80.0" w:type="dxa"/>
-              <w:bottom w:w="80.0" w:type="dxa"/>
-              <w:right w:w="80.0" w:type="dxa"/>
+              <w:top w:w="40.0" w:type="dxa"/>
+              <w:left w:w="40.0" w:type="dxa"/>
+              <w:bottom w:w="40.0" w:type="dxa"/>
+              <w:right w:w="40.0" w:type="dxa"/>
             </w:tcMar>
             <w:vAlign w:val="top"/>
           </w:tcPr>
@@ -11915,10 +11912,10 @@
             </w:tcBorders>
             <w:shd w:fill="ffffff" w:val="clear"/>
             <w:tcMar>
-              <w:top w:w="80.0" w:type="dxa"/>
-              <w:left w:w="80.0" w:type="dxa"/>
-              <w:bottom w:w="80.0" w:type="dxa"/>
-              <w:right w:w="80.0" w:type="dxa"/>
+              <w:top w:w="40.0" w:type="dxa"/>
+              <w:left w:w="40.0" w:type="dxa"/>
+              <w:bottom w:w="40.0" w:type="dxa"/>
+              <w:right w:w="40.0" w:type="dxa"/>
             </w:tcMar>
             <w:vAlign w:val="top"/>
           </w:tcPr>
@@ -11950,7 +11947,7 @@
       <w:tr>
         <w:trPr>
           <w:cantSplit w:val="0"/>
-          <w:trHeight w:val="585" w:hRule="atLeast"/>
+          <w:trHeight w:val="330" w:hRule="atLeast"/>
           <w:tblHeader w:val="0"/>
         </w:trPr>
         <w:tc>
@@ -11963,10 +11960,10 @@
             </w:tcBorders>
             <w:shd w:fill="ffffff" w:val="clear"/>
             <w:tcMar>
-              <w:top w:w="80.0" w:type="dxa"/>
-              <w:left w:w="80.0" w:type="dxa"/>
-              <w:bottom w:w="80.0" w:type="dxa"/>
-              <w:right w:w="80.0" w:type="dxa"/>
+              <w:top w:w="40.0" w:type="dxa"/>
+              <w:left w:w="40.0" w:type="dxa"/>
+              <w:bottom w:w="40.0" w:type="dxa"/>
+              <w:right w:w="40.0" w:type="dxa"/>
             </w:tcMar>
             <w:vAlign w:val="top"/>
           </w:tcPr>
@@ -12005,29 +12002,29 @@
             </w:tcBorders>
             <w:shd w:fill="ffffff" w:val="clear"/>
             <w:tcMar>
-              <w:top w:w="80.0" w:type="dxa"/>
-              <w:left w:w="80.0" w:type="dxa"/>
-              <w:bottom w:w="80.0" w:type="dxa"/>
-              <w:right w:w="80.0" w:type="dxa"/>
-            </w:tcMar>
-            <w:vAlign w:val="top"/>
-          </w:tcPr>
-          <w:p>
-            <w:pPr>
-              <w:spacing w:line="252.00000000000003" w:lineRule="auto"/>
-              <w:rPr>
-                <w:rFonts w:ascii="Courier New" w:cs="Courier New" w:eastAsia="Courier New" w:hAnsi="Courier New"/>
-                <w:sz w:val="16"/>
-                <w:szCs w:val="16"/>
-              </w:rPr>
-            </w:pPr>
-            <w:r>
-              <w:rPr>
-                <w:sz w:val="18"/>
-                <w:szCs w:val="18"/>
-                <w:rtl w:val="0"/>
-              </w:rPr>
-              <w:t xml:space="preserve">Subconjunto no vacío de clientes usado para demostrar la conectividad; no se enumeran restricciones por subconjunto en B.</w:t>
+              <w:top w:w="40.0" w:type="dxa"/>
+              <w:left w:w="40.0" w:type="dxa"/>
+              <w:bottom w:w="40.0" w:type="dxa"/>
+              <w:right w:w="40.0" w:type="dxa"/>
+            </w:tcMar>
+            <w:vAlign w:val="top"/>
+          </w:tcPr>
+          <w:p>
+            <w:pPr>
+              <w:spacing w:line="252.00000000000003" w:lineRule="auto"/>
+              <w:rPr>
+                <w:rFonts w:ascii="Courier New" w:cs="Courier New" w:eastAsia="Courier New" w:hAnsi="Courier New"/>
+                <w:sz w:val="16"/>
+                <w:szCs w:val="16"/>
+              </w:rPr>
+            </w:pPr>
+            <w:r>
+              <w:rPr>
+                <w:sz w:val="18"/>
+                <w:szCs w:val="18"/>
+                <w:rtl w:val="0"/>
+              </w:rPr>
+              <w:t xml:space="preserve">Subconjunto no vacío de clientes utilizado en la demostración de conectividad.</w:t>
             </w:r>
             <w:r>
               <w:rPr>
@@ -12040,7 +12037,7 @@
       <w:tr>
         <w:trPr>
           <w:cantSplit w:val="0"/>
-          <w:trHeight w:val="585" w:hRule="atLeast"/>
+          <w:trHeight w:val="525" w:hRule="atLeast"/>
           <w:tblHeader w:val="0"/>
         </w:trPr>
         <w:tc>
@@ -12053,10 +12050,10 @@
             </w:tcBorders>
             <w:shd w:fill="ffffff" w:val="clear"/>
             <w:tcMar>
-              <w:top w:w="80.0" w:type="dxa"/>
-              <w:left w:w="80.0" w:type="dxa"/>
-              <w:bottom w:w="80.0" w:type="dxa"/>
-              <w:right w:w="80.0" w:type="dxa"/>
+              <w:top w:w="40.0" w:type="dxa"/>
+              <w:left w:w="40.0" w:type="dxa"/>
+              <w:bottom w:w="40.0" w:type="dxa"/>
+              <w:right w:w="40.0" w:type="dxa"/>
             </w:tcMar>
             <w:vAlign w:val="top"/>
           </w:tcPr>
@@ -12094,29 +12091,29 @@
             </w:tcBorders>
             <w:shd w:fill="ffffff" w:val="clear"/>
             <w:tcMar>
-              <w:top w:w="80.0" w:type="dxa"/>
-              <w:left w:w="80.0" w:type="dxa"/>
-              <w:bottom w:w="80.0" w:type="dxa"/>
-              <w:right w:w="80.0" w:type="dxa"/>
-            </w:tcMar>
-            <w:vAlign w:val="top"/>
-          </w:tcPr>
-          <w:p>
-            <w:pPr>
-              <w:spacing w:line="252.00000000000003" w:lineRule="auto"/>
-              <w:rPr>
-                <w:rFonts w:ascii="Courier New" w:cs="Courier New" w:eastAsia="Courier New" w:hAnsi="Courier New"/>
-                <w:sz w:val="16"/>
-                <w:szCs w:val="16"/>
-              </w:rPr>
-            </w:pPr>
-            <w:r>
-              <w:rPr>
-                <w:sz w:val="18"/>
-                <w:szCs w:val="18"/>
-                <w:rtl w:val="0"/>
-              </w:rPr>
-              <w:t xml:space="preserve">Resultados derivados: distancia total, carga inicial de una ruta y porcentaje de capacidad no utilizada. No son nuevas decisiones independientes.</w:t>
+              <w:top w:w="40.0" w:type="dxa"/>
+              <w:left w:w="40.0" w:type="dxa"/>
+              <w:bottom w:w="40.0" w:type="dxa"/>
+              <w:right w:w="40.0" w:type="dxa"/>
+            </w:tcMar>
+            <w:vAlign w:val="top"/>
+          </w:tcPr>
+          <w:p>
+            <w:pPr>
+              <w:spacing w:line="252.00000000000003" w:lineRule="auto"/>
+              <w:rPr>
+                <w:rFonts w:ascii="Courier New" w:cs="Courier New" w:eastAsia="Courier New" w:hAnsi="Courier New"/>
+                <w:sz w:val="16"/>
+                <w:szCs w:val="16"/>
+              </w:rPr>
+            </w:pPr>
+            <w:r>
+              <w:rPr>
+                <w:sz w:val="18"/>
+                <w:szCs w:val="18"/>
+                <w:rtl w:val="0"/>
+              </w:rPr>
+              <w:t xml:space="preserve">Resultados derivados: distancia total, carga inicial de una ruta y porcentaje de capacidad no utilizada.</w:t>
             </w:r>
             <w:r>
               <w:rPr>
@@ -12140,7 +12137,7 @@
           <w:szCs w:val="26"/>
         </w:rPr>
       </w:pPr>
-      <w:bookmarkStart w:colFirst="0" w:colLast="0" w:name="_zf0g56948j8m" w:id="11"/>
+      <w:bookmarkStart w:colFirst="0" w:colLast="0" w:name="_vsfyso36if7v" w:id="11"/>
       <w:bookmarkEnd w:id="11"/>
       <w:r>
         <w:rPr>
@@ -12168,7 +12165,41 @@
           <w:szCs w:val="21"/>
           <w:rtl w:val="0"/>
         </w:rPr>
-        <w:t xml:space="preserve">La formulación principal es el modelo B de arcos y flujo de producto, implementado en PuLP. Todas las sumas sobre arcos excluyen i = j. Las ecuaciones (1)–(7) y los dominios (9) definen el modelo; (8) explica por qué no admite ciclos aislados y no se agrega como una familia de restricciones. La carga se mide en las mismas unidades que qᵢ y Q.</w:t>
+        <w:t xml:space="preserve">Se emplea una formulación de arcos y flujo de producto. Las variables xᵢ</w:t>
+      </w:r>
+      <w:r>
+        <w:rPr>
+          <w:sz w:val="21"/>
+          <w:szCs w:val="21"/>
+          <w:vertAlign w:val="subscript"/>
+          <w:rtl w:val="0"/>
+        </w:rPr>
+        <w:t xml:space="preserve">j</w:t>
+      </w:r>
+      <w:r>
+        <w:rPr>
+          <w:sz w:val="21"/>
+          <w:szCs w:val="21"/>
+          <w:rtl w:val="0"/>
+        </w:rPr>
+        <w:t xml:space="preserve"> seleccionan los recorridos y fᵢ</w:t>
+      </w:r>
+      <w:r>
+        <w:rPr>
+          <w:sz w:val="21"/>
+          <w:szCs w:val="21"/>
+          <w:vertAlign w:val="subscript"/>
+          <w:rtl w:val="0"/>
+        </w:rPr>
+        <w:t xml:space="preserve">j</w:t>
+      </w:r>
+      <w:r>
+        <w:rPr>
+          <w:sz w:val="21"/>
+          <w:szCs w:val="21"/>
+          <w:rtl w:val="0"/>
+        </w:rPr>
+        <w:t xml:space="preserve"> representan la carga transportada. Las ecuaciones (1)–(7) y los dominios (9) describen el modelo; la expresión (8) demuestra su conectividad. Todas las sumas sobre arcos excluyen i = j.</w:t>
       </w:r>
     </w:p>
     <w:p>
@@ -12190,7 +12221,7 @@
           <wp:inline distB="114300" distT="114300" distL="114300" distR="114300">
             <wp:extent cx="2540000" cy="571500"/>
             <wp:effectExtent b="0" l="0" r="0" t="0"/>
-            <wp:docPr descr="(1) Minimizar la distancia total de los arcos seleccionados." id="12" name="image7.png"/>
+            <wp:docPr descr="(1) Minimizar la distancia total de los arcos seleccionados." id="2" name="image7.png"/>
             <a:graphic>
               <a:graphicData uri="http://schemas.openxmlformats.org/drawingml/2006/picture">
                 <pic:pic>
@@ -12261,12 +12292,12 @@
           <wp:inline distB="114300" distT="114300" distL="114300" distR="114300">
             <wp:extent cx="2768600" cy="571500"/>
             <wp:effectExtent b="0" l="0" r="0" t="0"/>
-            <wp:docPr descr="(2) Cada cliente recibe una única visita." id="14" name="image5.png"/>
+            <wp:docPr descr="(2) Cada cliente recibe una única visita." id="3" name="image12.png"/>
             <a:graphic>
               <a:graphicData uri="http://schemas.openxmlformats.org/drawingml/2006/picture">
                 <pic:pic>
                   <pic:nvPicPr>
-                    <pic:cNvPr descr="(2) Cada cliente recibe una única visita." id="0" name="image5.png"/>
+                    <pic:cNvPr descr="(2) Cada cliente recibe una única visita." id="0" name="image12.png"/>
                     <pic:cNvPicPr preferRelativeResize="0"/>
                   </pic:nvPicPr>
                   <pic:blipFill>
@@ -12332,12 +12363,12 @@
           <wp:inline distB="114300" distT="114300" distL="114300" distR="114300">
             <wp:extent cx="3492500" cy="571500"/>
             <wp:effectExtent b="0" l="0" r="0" t="0"/>
-            <wp:docPr descr="(3) Conservación del recorrido: por cada llegada hay una salida." id="6" name="image13.png"/>
+            <wp:docPr descr="(3) Conservación del recorrido: por cada llegada hay una salida." id="8" name="image10.png"/>
             <a:graphic>
               <a:graphicData uri="http://schemas.openxmlformats.org/drawingml/2006/picture">
                 <pic:pic>
                   <pic:nvPicPr>
-                    <pic:cNvPr descr="(3) Conservación del recorrido: por cada llegada hay una salida." id="0" name="image13.png"/>
+                    <pic:cNvPr descr="(3) Conservación del recorrido: por cada llegada hay una salida." id="0" name="image10.png"/>
                     <pic:cNvPicPr preferRelativeResize="0"/>
                   </pic:nvPicPr>
                   <pic:blipFill>
@@ -12403,12 +12434,12 @@
           <wp:inline distB="114300" distT="114300" distL="114300" distR="114300">
             <wp:extent cx="4965700" cy="571500"/>
             <wp:effectExtent b="0" l="0" r="0" t="0"/>
-            <wp:docPr descr="(4) Salidas y regresos al depósito; cota inferior de rutas." id="8" name="image9.png"/>
+            <wp:docPr descr="(4) Salidas y regresos al depósito; cota inferior de rutas." id="13" name="image13.png"/>
             <a:graphic>
               <a:graphicData uri="http://schemas.openxmlformats.org/drawingml/2006/picture">
                 <pic:pic>
                   <pic:nvPicPr>
-                    <pic:cNvPr descr="(4) Salidas y regresos al depósito; cota inferior de rutas." id="0" name="image9.png"/>
+                    <pic:cNvPr descr="(4) Salidas y regresos al depósito; cota inferior de rutas." id="0" name="image13.png"/>
                     <pic:cNvPicPr preferRelativeResize="0"/>
                   </pic:nvPicPr>
                   <pic:blipFill>
@@ -12474,12 +12505,12 @@
           <wp:inline distB="114300" distT="114300" distL="114300" distR="114300">
             <wp:extent cx="3810000" cy="571500"/>
             <wp:effectExtent b="0" l="0" r="0" t="0"/>
-            <wp:docPr descr="(5) Balance de producto: carga que llega menos carga que sale igual a la entrega." id="13" name="image8.png"/>
+            <wp:docPr descr="(5) Balance de producto: carga que llega menos carga que sale igual a la entrega." id="4" name="image11.png"/>
             <a:graphic>
               <a:graphicData uri="http://schemas.openxmlformats.org/drawingml/2006/picture">
                 <pic:pic>
                   <pic:nvPicPr>
-                    <pic:cNvPr descr="(5) Balance de producto: carga que llega menos carga que sale igual a la entrega." id="0" name="image8.png"/>
+                    <pic:cNvPr descr="(5) Balance de producto: carga que llega menos carga que sale igual a la entrega." id="0" name="image11.png"/>
                     <pic:cNvPicPr preferRelativeResize="0"/>
                   </pic:nvPicPr>
                   <pic:blipFill>
@@ -12545,12 +12576,12 @@
           <wp:inline distB="114300" distT="114300" distL="114300" distR="114300">
             <wp:extent cx="3644900" cy="368300"/>
             <wp:effectExtent b="0" l="0" r="0" t="0"/>
-            <wp:docPr descr="(6) Capacidad y vínculo entre carga y recorrido; sin arco no se transporta producto." id="11" name="image12.png"/>
+            <wp:docPr descr="(6) Capacidad y vínculo entre carga y recorrido; sin arco no se transporta producto." id="5" name="image8.png"/>
             <a:graphic>
               <a:graphicData uri="http://schemas.openxmlformats.org/drawingml/2006/picture">
                 <pic:pic>
                   <pic:nvPicPr>
-                    <pic:cNvPr descr="(6) Capacidad y vínculo entre carga y recorrido; sin arco no se transporta producto." id="0" name="image12.png"/>
+                    <pic:cNvPr descr="(6) Capacidad y vínculo entre carga y recorrido; sin arco no se transporta producto." id="0" name="image8.png"/>
                     <pic:cNvPicPr preferRelativeResize="0"/>
                   </pic:nvPicPr>
                   <pic:blipFill>
@@ -12616,12 +12647,12 @@
           <wp:inline distB="114300" distT="114300" distL="114300" distR="114300">
             <wp:extent cx="4419600" cy="571500"/>
             <wp:effectExtent b="0" l="0" r="0" t="0"/>
-            <wp:docPr descr="(7) Regreso vacío y carga total despachada desde el depósito." id="7" name="image11.png"/>
+            <wp:docPr descr="(7) Regreso vacío y carga total despachada desde el depósito." id="14" name="image9.png"/>
             <a:graphic>
               <a:graphicData uri="http://schemas.openxmlformats.org/drawingml/2006/picture">
                 <pic:pic>
                   <pic:nvPicPr>
-                    <pic:cNvPr descr="(7) Regreso vacío y carga total despachada desde el depósito." id="0" name="image11.png"/>
+                    <pic:cNvPr descr="(7) Regreso vacío y carga total despachada desde el depósito." id="0" name="image9.png"/>
                     <pic:cNvPicPr preferRelativeResize="0"/>
                   </pic:nvPicPr>
                   <pic:blipFill>
@@ -12687,7 +12718,7 @@
           <wp:inline distB="114300" distT="114300" distL="114300" distR="114300">
             <wp:extent cx="3937000" cy="520700"/>
             <wp:effectExtent b="0" l="0" r="0" t="0"/>
-            <wp:docPr descr="(8) Contradicción que excluye ciclos aislados: consecuencia de (5) y (6), no una restricción adicional." id="5" name="image6.png"/>
+            <wp:docPr descr="(8) Contradicción que excluye ciclos aislados: consecuencia de (5) y (6), no una restricción adicional." id="6" name="image6.png"/>
             <a:graphic>
               <a:graphicData uri="http://schemas.openxmlformats.org/drawingml/2006/picture">
                 <pic:pic>
@@ -12758,12 +12789,12 @@
           <wp:inline distB="114300" distT="114300" distL="114300" distR="114300">
             <wp:extent cx="3975100" cy="368300"/>
             <wp:effectExtent b="0" l="0" r="0" t="0"/>
-            <wp:docPr descr="(9) Dominio binario del recorrido y no negatividad de la carga." id="4" name="image10.png"/>
+            <wp:docPr descr="(9) Dominio binario del recorrido y no negatividad de la carga." id="11" name="image4.png"/>
             <a:graphic>
               <a:graphicData uri="http://schemas.openxmlformats.org/drawingml/2006/picture">
                 <pic:pic>
                   <pic:nvPicPr>
-                    <pic:cNvPr descr="(9) Dominio binario del recorrido y no negatividad de la carga." id="0" name="image10.png"/>
+                    <pic:cNvPr descr="(9) Dominio binario del recorrido y no negatividad de la carga." id="0" name="image4.png"/>
                     <pic:cNvPicPr preferRelativeResize="0"/>
                   </pic:nvPicPr>
                   <pic:blipFill>
@@ -12843,7 +12874,7 @@
           <w:szCs w:val="21"/>
           <w:rtl w:val="0"/>
         </w:rPr>
-        <w:t xml:space="preserve">La eliminación de subtours queda garantizada por el flujo de carga. Si un conjunto no vacío S de clientes estuviera aislado, no habría arcos seleccionados que cruzaran su frontera. Por (6), tampoco podría cruzar carga. Al sumar los balances (5), los flujos internos se cancelan y se obtiene (8), imposible porque todas las demandas son positivas. Junto con la entrada y salida únicas de cada cliente, esto obliga a conectar las rutas con el depósito. Si se admitieran clientes de demanda cero habría que revisar esta justificación y la formulación.</w:t>
+        <w:t xml:space="preserve">El flujo de producto garantiza la conexión con el depósito. Si un conjunto no vacío S de clientes quedara aislado, la restricción (6) impediría cualquier flujo de carga a través de su frontera. Al sumar los balances (5), los flujos internos se cancelarían y se obtendría (8), una contradicción porque qᵢ &gt; 0 para todos los clientes. Por tanto, cada ruta queda conectada con el depósito.</w:t>
       </w:r>
     </w:p>
     <w:p>
@@ -12862,7 +12893,7 @@
           <w:szCs w:val="21"/>
           <w:rtl w:val="0"/>
         </w:rPr>
-        <w:t xml:space="preserve">B contiene 110 variables binarias, 110 continuas y 154 restricciones; fijar m = 3 agrega una restricción. El modelo A histórico añade 1,013 restricciones explícitas de subtours y contiene 1,167 restricciones. Estas refuerzan su relajación lineal, pero no cambian las soluciones enteras factibles de esta instancia. La carga total despachada en (7) y m ≤ 10 son consecuencias de los balances y las visitas: se conservan por claridad y no se presentan como cortes adicionales. La cota m ≥ 3 redondea la cota de capacidad y sí puede reforzar la relajación. La certificación por particiones se mantiene como comprobación independiente.</w:t>
+        <w:t xml:space="preserve">La implementación contiene 110 variables binarias, 110 continuas y 154 restricciones. Fijar m = 3 añade una restricción. La carga total despachada y la cota m ≤ 10 se deducen de los balances y de las visitas; se incluyen explícitamente para facilitar la interpretación. La cota m ≥ 3 incorpora la capacidad total requerida.</w:t>
       </w:r>
     </w:p>
     <w:p>
@@ -12878,7 +12909,7 @@
           <w:szCs w:val="26"/>
         </w:rPr>
       </w:pPr>
-      <w:bookmarkStart w:colFirst="0" w:colLast="0" w:name="_78q1x38n2tea" w:id="12"/>
+      <w:bookmarkStart w:colFirst="0" w:colLast="0" w:name="_37jsgcgjj8rb" w:id="12"/>
       <w:bookmarkEnd w:id="12"/>
       <w:r>
         <w:rPr>
@@ -12906,41 +12937,7 @@
           <w:szCs w:val="21"/>
           <w:rtl w:val="0"/>
         </w:rPr>
-        <w:t xml:space="preserve">La figura siguiente representa una ruta concreta de la solución. Los arcos indican decisiones xᵢ</w:t>
-      </w:r>
-      <w:r>
-        <w:rPr>
-          <w:sz w:val="21"/>
-          <w:szCs w:val="21"/>
-          <w:vertAlign w:val="subscript"/>
-          <w:rtl w:val="0"/>
-        </w:rPr>
-        <w:t xml:space="preserve">j</w:t>
-      </w:r>
-      <w:r>
-        <w:rPr>
-          <w:sz w:val="21"/>
-          <w:szCs w:val="21"/>
-          <w:rtl w:val="0"/>
-        </w:rPr>
-        <w:t xml:space="preserve"> y transportan una cantidad fᵢ</w:t>
-      </w:r>
-      <w:r>
-        <w:rPr>
-          <w:sz w:val="21"/>
-          <w:szCs w:val="21"/>
-          <w:vertAlign w:val="subscript"/>
-          <w:rtl w:val="0"/>
-        </w:rPr>
-        <w:t xml:space="preserve">j</w:t>
-      </w:r>
-      <w:r>
-        <w:rPr>
-          <w:sz w:val="21"/>
-          <w:szCs w:val="21"/>
-          <w:rtl w:val="0"/>
-        </w:rPr>
-        <w:t xml:space="preserve">; en cada cliente la entrega modifica esa carga. Las conexiones laterales identifican qué ecuación controla cada acción. No es una secuencia de pasos del programa.</w:t>
+        <w:t xml:space="preserve">La Figura 1 relaciona las variables de recorrido y carga con las acciones de transporte y entrega y con las restricciones que las regulan. Se utiliza una de las rutas óptimas para mostrar cómo disminuye la carga al atender a cada cliente.</w:t>
       </w:r>
     </w:p>
     <w:p>
@@ -12962,17 +12959,17 @@
           <wp:inline distB="114300" distT="114300" distL="114300" distR="114300">
             <wp:extent cx="5524500" cy="3530600"/>
             <wp:effectExtent b="0" l="0" r="0" t="0"/>
-            <wp:docPr id="1" name="image15.png"/>
+            <wp:docPr descr="Figura 1. Relación entre variables, acciones y restricciones en la ruta 1 → 3 → 2 → 6 → 1." id="10" name="image15.png"/>
             <a:graphic>
               <a:graphicData uri="http://schemas.openxmlformats.org/drawingml/2006/picture">
                 <pic:pic>
                   <pic:nvPicPr>
-                    <pic:cNvPr id="0" name="image15.png"/>
+                    <pic:cNvPr descr="Figura 1. Relación entre variables, acciones y restricciones en la ruta 1 → 3 → 2 → 6 → 1." id="0" name="image15.png"/>
                     <pic:cNvPicPr preferRelativeResize="0"/>
                   </pic:nvPicPr>
                   <pic:blipFill>
                     <a:blip r:embed="rId16"/>
-                    <a:srcRect b="125" l="0" r="0" t="125"/>
+                    <a:srcRect b="0" l="0" r="0" t="0"/>
                     <a:stretch>
                       <a:fillRect/>
                     </a:stretch>
@@ -13013,7 +13010,7 @@
           <w:szCs w:val="18"/>
           <w:rtl w:val="0"/>
         </w:rPr>
-        <w:t xml:space="preserve">Figura 1. Variables de recorrido y carga conectadas con la función objetivo y las restricciones. Ejemplo: ruta 1 → 3 → 2 → 6 → 1; carga inicial 44 unidades.</w:t>
+        <w:t xml:space="preserve">Figura 1. Relación entre variables, acciones y restricciones en la ruta 1 → 3 → 2 → 6 → 1.</w:t>
       </w:r>
     </w:p>
     <w:p>
@@ -13027,12 +13024,11 @@
       </w:pPr>
       <w:r>
         <w:rPr>
-          <w:rFonts w:ascii="Arial Unicode MS" w:cs="Arial Unicode MS" w:eastAsia="Arial Unicode MS" w:hAnsi="Arial Unicode MS"/>
           <w:sz w:val="21"/>
           <w:szCs w:val="21"/>
           <w:rtl w:val="0"/>
         </w:rPr>
-        <w:t xml:space="preserve">En el ejemplo, x₁₃ = x₃₂ = x₂₆ = x₆₁ = 1; las cargas son f₁₃ = 44, f₃₂ = 26, f₂₆ = 14 y f₆₁ = 0. En el cliente 3 se entregan 44 − 26 = 18 unidades; en el 2, 26 − 14 = 12; en el 6, 14 − 0 = 14. La carga inicial cumple 44 ≤ 50. Un ciclo aislado entre esos tres clientes exigiría entregar 44 unidades sin recibir carga desde fuera, contradiciendo (5). La carga representada es producto restante a bordo, no demanda acumulada ni capacidad libre.</w:t>
+        <w:t xml:space="preserve">En la ruta ilustrada, x₁₃ = x₃₂ = x₂₆ = x₆₁ = 1. La carga parte con 44 unidades y disminuye a 26 después de atender al cliente 3, a 14 después del cliente 2 y a cero después del cliente 6. Cada diferencia coincide con la demanda entregada y la carga permanece por debajo de Q = 50. El diagrama muestra así la relación entre selección de arcos, continuidad, capacidad y balance de producto.</w:t>
       </w:r>
     </w:p>
     <w:p>
@@ -13048,7 +13044,7 @@
           <w:szCs w:val="26"/>
         </w:rPr>
       </w:pPr>
-      <w:bookmarkStart w:colFirst="0" w:colLast="0" w:name="_55bc6nr3uybh" w:id="13"/>
+      <w:bookmarkStart w:colFirst="0" w:colLast="0" w:name="_p6j6eom4ffs" w:id="13"/>
       <w:bookmarkEnd w:id="13"/>
       <w:r>
         <w:rPr>
@@ -13076,7 +13072,7 @@
           <w:szCs w:val="21"/>
           <w:rtl w:val="0"/>
         </w:rPr>
-        <w:t xml:space="preserve">El código src/resolver_cvrp_arcos.py utiliza B por defecto; --modelo A conserva la formulación histórica y --modelo C activa cotas de carga experimentales. Con PuLP 3.3.0 y CBC 2.10.3 se distinguen óptimo probado, solución factible sin prueba, ausencia de solución entera encontrada e incidencias del solver. Un límite de tiempo sin solución encontrada no demuestra infactibilidad. Se revisan sol_status, el registro CBC y la factibilidad de las rutas, sin usar LpStatus por sí solo como certificado. Los resultados principales proceden exclusivamente de results/medicion_modelo_B_2026-10-15/. Los diez registros de cada escenario prueban optimalidad y coinciden con la certificación independiente.</w:t>
+        <w:t xml:space="preserve">El modelo se implementó en Python con PuLP 3.3.0 y se resolvió mediante CBC 2.10.3. La optimalidad se comprobó con el estado de terminación del solver y se verificaron la cobertura de clientes, la capacidad y el regreso al depósito. Una programación dinámica por particiones proporcionó una certificación independiente de los dos escenarios.</w:t>
       </w:r>
     </w:p>
     <w:p>
@@ -13092,7 +13088,7 @@
           <w:szCs w:val="36"/>
         </w:rPr>
       </w:pPr>
-      <w:bookmarkStart w:colFirst="0" w:colLast="0" w:name="_k699tlrzh2q" w:id="14"/>
+      <w:bookmarkStart w:colFirst="0" w:colLast="0" w:name="_4tvgsrw7308o" w:id="14"/>
       <w:bookmarkEnd w:id="14"/>
       <w:r>
         <w:rPr>
@@ -13120,15 +13116,7 @@
           <w:szCs w:val="21"/>
           <w:rtl w:val="0"/>
         </w:rPr>
-        <w:t xml:space="preserve">Se adopta Clarke–Wright + 2-opt: el pseudocódigo, el Anexo A y las mediciones usan este algoritmo.</w:t>
-      </w:r>
-      <w:r>
-        <w:rPr>
-          <w:sz w:val="21"/>
-          <w:szCs w:val="21"/>
-          <w:rtl w:val="0"/>
-        </w:rPr>
-        <w:t xml:space="preserve"> Es una heurística clásica, no un algoritmo bioinspirado. Su función en esta primera etapa es ofrecer una solución rápida y verificable con la cual comparar el método exacto.</w:t>
+        <w:t xml:space="preserve">Se adopta el algoritmo de ahorros de Clarke–Wright con mejora 2-opt dentro de cada ruta. Esta heurística clásica construye una solución factible con rapidez y permite evaluar el intercambio entre calidad y tiempo frente al método exacto. Su pseudocódigo, implementación y resultados se presentan a continuación.</w:t>
       </w:r>
     </w:p>
     <w:p>
@@ -13182,7 +13170,7 @@
           <w:szCs w:val="26"/>
         </w:rPr>
       </w:pPr>
-      <w:bookmarkStart w:colFirst="0" w:colLast="0" w:name="_yiuj1o5vzeyz" w:id="15"/>
+      <w:bookmarkStart w:colFirst="0" w:colLast="0" w:name="_yct1nshi9vag" w:id="15"/>
       <w:bookmarkEnd w:id="15"/>
       <w:r>
         <w:rPr>
@@ -13474,14 +13462,38 @@
           <w:szCs w:val="36"/>
         </w:rPr>
       </w:pPr>
-      <w:bookmarkStart w:colFirst="0" w:colLast="0" w:name="_dszxn61u0gh" w:id="16"/>
+      <w:bookmarkStart w:colFirst="0" w:colLast="0" w:name="_4wu5z6bsu8g6" w:id="16"/>
       <w:bookmarkEnd w:id="16"/>
       <w:r>
+        <w:br w:type="page"/>
+      </w:r>
+      <w:r>
+        <w:rPr>
+          <w:rtl w:val="0"/>
+        </w:rPr>
+      </w:r>
+    </w:p>
+    <w:p>
+      <w:pPr>
+        <w:pStyle w:val="Heading1"/>
+        <w:keepNext w:val="1"/>
+        <w:keepLines w:val="0"/>
+        <w:spacing w:after="140" w:before="300" w:line="252.00000000000003" w:lineRule="auto"/>
         <w:rPr>
           <w:b w:val="1"/>
           <w:bCs w:val="1"/>
           <w:sz w:val="36"/>
           <w:szCs w:val="36"/>
+        </w:rPr>
+      </w:pPr>
+      <w:bookmarkStart w:colFirst="0" w:colLast="0" w:name="_6rv1ixqlz5bf" w:id="17"/>
+      <w:bookmarkEnd w:id="17"/>
+      <w:r>
+        <w:rPr>
+          <w:b w:val="1"/>
+          <w:bCs w:val="1"/>
+          <w:sz w:val="36"/>
+          <w:szCs w:val="36"/>
           <w:rtl w:val="0"/>
         </w:rPr>
         <w:t xml:space="preserve">6. Resultados y trazado de rutas</w:t>
@@ -13500,8 +13512,8 @@
           <w:szCs w:val="26"/>
         </w:rPr>
       </w:pPr>
-      <w:bookmarkStart w:colFirst="0" w:colLast="0" w:name="_3e6mrxci5ma7" w:id="17"/>
-      <w:bookmarkEnd w:id="17"/>
+      <w:bookmarkStart w:colFirst="0" w:colLast="0" w:name="_el0rwpn28e7y" w:id="18"/>
+      <w:bookmarkEnd w:id="18"/>
       <w:r>
         <w:rPr>
           <w:b w:val="1"/>
@@ -13528,12 +13540,11 @@
           <w:szCs w:val="21"/>
           <w:rtl w:val="0"/>
         </w:rPr>
-        <w:t xml:space="preserve">En las diez ejecuciones del modelo B sin flota fija, CBC indicó «Optimal solution found». La distancia óptima es Z* = 318.989487 unidades y se seleccionan cuatro rutas. La certificación por programación dinámica obtuvo el mismo valor. Se verificaron visitas, cargas y regreso al depósito. Las tablas y figuras mantienen una orientación representativa de cada recorrido; invertir una ruta conserva su distancia por la simetría de la matriz.</w:t>
+        <w:t xml:space="preserve">La solución exacta alcanza Z* = 318.989487 unidades con cuatro rutas. CBC probó su optimalidad en las diez ejecuciones y la certificación por programación dinámica coincidió con este valor. La Tabla 5 presenta los recorridos, cargas y capacidad no utilizada.</w:t>
       </w:r>
     </w:p>
     <w:p>
       <w:pPr>
-        <w:keepNext w:val="1"/>
         <w:spacing w:after="180" w:before="180" w:line="252.00000000000003" w:lineRule="auto"/>
         <w:rPr>
           <w:b w:val="1"/>
@@ -13570,25 +13581,25 @@
         <w:tblLook w:val="0600"/>
       </w:tblPr>
       <w:tblGrid>
-        <w:gridCol w:w="900"/>
-        <w:gridCol w:w="2970"/>
-        <w:gridCol w:w="1530"/>
+        <w:gridCol w:w="840"/>
+        <w:gridCol w:w="3030"/>
+        <w:gridCol w:w="1515"/>
         <w:gridCol w:w="1620"/>
-        <w:gridCol w:w="1875"/>
+        <w:gridCol w:w="1890"/>
         <w:tblGridChange w:id="0">
           <w:tblGrid>
-            <w:gridCol w:w="900"/>
-            <w:gridCol w:w="2970"/>
-            <w:gridCol w:w="1530"/>
+            <w:gridCol w:w="840"/>
+            <w:gridCol w:w="3030"/>
+            <w:gridCol w:w="1515"/>
             <w:gridCol w:w="1620"/>
-            <w:gridCol w:w="1875"/>
+            <w:gridCol w:w="1890"/>
           </w:tblGrid>
         </w:tblGridChange>
       </w:tblGrid>
       <w:tr>
         <w:trPr>
           <w:cantSplit w:val="0"/>
-          <w:trHeight w:val="375" w:hRule="atLeast"/>
+          <w:trHeight w:val="315" w:hRule="atLeast"/>
           <w:tblHeader w:val="0"/>
         </w:trPr>
         <w:tc>
@@ -13601,10 +13612,10 @@
             </w:tcBorders>
             <w:shd w:fill="e9eff3" w:val="clear"/>
             <w:tcMar>
-              <w:top w:w="80.0" w:type="dxa"/>
-              <w:left w:w="80.0" w:type="dxa"/>
-              <w:bottom w:w="80.0" w:type="dxa"/>
-              <w:right w:w="80.0" w:type="dxa"/>
+              <w:top w:w="40.0" w:type="dxa"/>
+              <w:left w:w="40.0" w:type="dxa"/>
+              <w:bottom w:w="40.0" w:type="dxa"/>
+              <w:right w:w="40.0" w:type="dxa"/>
             </w:tcMar>
             <w:vAlign w:val="top"/>
           </w:tcPr>
@@ -13644,10 +13655,10 @@
             </w:tcBorders>
             <w:shd w:fill="e9eff3" w:val="clear"/>
             <w:tcMar>
-              <w:top w:w="80.0" w:type="dxa"/>
-              <w:left w:w="80.0" w:type="dxa"/>
-              <w:bottom w:w="80.0" w:type="dxa"/>
-              <w:right w:w="80.0" w:type="dxa"/>
+              <w:top w:w="40.0" w:type="dxa"/>
+              <w:left w:w="40.0" w:type="dxa"/>
+              <w:bottom w:w="40.0" w:type="dxa"/>
+              <w:right w:w="40.0" w:type="dxa"/>
             </w:tcMar>
             <w:vAlign w:val="top"/>
           </w:tcPr>
@@ -13687,10 +13698,10 @@
             </w:tcBorders>
             <w:shd w:fill="e9eff3" w:val="clear"/>
             <w:tcMar>
-              <w:top w:w="80.0" w:type="dxa"/>
-              <w:left w:w="80.0" w:type="dxa"/>
-              <w:bottom w:w="80.0" w:type="dxa"/>
-              <w:right w:w="80.0" w:type="dxa"/>
+              <w:top w:w="40.0" w:type="dxa"/>
+              <w:left w:w="40.0" w:type="dxa"/>
+              <w:bottom w:w="40.0" w:type="dxa"/>
+              <w:right w:w="40.0" w:type="dxa"/>
             </w:tcMar>
             <w:vAlign w:val="top"/>
           </w:tcPr>
@@ -13730,10 +13741,10 @@
             </w:tcBorders>
             <w:shd w:fill="e9eff3" w:val="clear"/>
             <w:tcMar>
-              <w:top w:w="80.0" w:type="dxa"/>
-              <w:left w:w="80.0" w:type="dxa"/>
-              <w:bottom w:w="80.0" w:type="dxa"/>
-              <w:right w:w="80.0" w:type="dxa"/>
+              <w:top w:w="40.0" w:type="dxa"/>
+              <w:left w:w="40.0" w:type="dxa"/>
+              <w:bottom w:w="40.0" w:type="dxa"/>
+              <w:right w:w="40.0" w:type="dxa"/>
             </w:tcMar>
             <w:vAlign w:val="top"/>
           </w:tcPr>
@@ -13773,10 +13784,10 @@
             </w:tcBorders>
             <w:shd w:fill="e9eff3" w:val="clear"/>
             <w:tcMar>
-              <w:top w:w="80.0" w:type="dxa"/>
-              <w:left w:w="80.0" w:type="dxa"/>
-              <w:bottom w:w="80.0" w:type="dxa"/>
-              <w:right w:w="80.0" w:type="dxa"/>
+              <w:top w:w="40.0" w:type="dxa"/>
+              <w:left w:w="40.0" w:type="dxa"/>
+              <w:bottom w:w="40.0" w:type="dxa"/>
+              <w:right w:w="40.0" w:type="dxa"/>
             </w:tcMar>
             <w:vAlign w:val="top"/>
           </w:tcPr>
@@ -13810,7 +13821,7 @@
       <w:tr>
         <w:trPr>
           <w:cantSplit w:val="0"/>
-          <w:trHeight w:val="375" w:hRule="atLeast"/>
+          <w:trHeight w:val="315" w:hRule="atLeast"/>
           <w:tblHeader w:val="0"/>
         </w:trPr>
         <w:tc>
@@ -13823,10 +13834,10 @@
             </w:tcBorders>
             <w:shd w:fill="ffffff" w:val="clear"/>
             <w:tcMar>
-              <w:top w:w="80.0" w:type="dxa"/>
-              <w:left w:w="80.0" w:type="dxa"/>
-              <w:bottom w:w="80.0" w:type="dxa"/>
-              <w:right w:w="80.0" w:type="dxa"/>
+              <w:top w:w="40.0" w:type="dxa"/>
+              <w:left w:w="40.0" w:type="dxa"/>
+              <w:bottom w:w="40.0" w:type="dxa"/>
+              <w:right w:w="40.0" w:type="dxa"/>
             </w:tcMar>
             <w:vAlign w:val="top"/>
           </w:tcPr>
@@ -13864,10 +13875,10 @@
             </w:tcBorders>
             <w:shd w:fill="ffffff" w:val="clear"/>
             <w:tcMar>
-              <w:top w:w="80.0" w:type="dxa"/>
-              <w:left w:w="80.0" w:type="dxa"/>
-              <w:bottom w:w="80.0" w:type="dxa"/>
-              <w:right w:w="80.0" w:type="dxa"/>
+              <w:top w:w="40.0" w:type="dxa"/>
+              <w:left w:w="40.0" w:type="dxa"/>
+              <w:bottom w:w="40.0" w:type="dxa"/>
+              <w:right w:w="40.0" w:type="dxa"/>
             </w:tcMar>
             <w:vAlign w:val="top"/>
           </w:tcPr>
@@ -13906,10 +13917,10 @@
             </w:tcBorders>
             <w:shd w:fill="ffffff" w:val="clear"/>
             <w:tcMar>
-              <w:top w:w="80.0" w:type="dxa"/>
-              <w:left w:w="80.0" w:type="dxa"/>
-              <w:bottom w:w="80.0" w:type="dxa"/>
-              <w:right w:w="80.0" w:type="dxa"/>
+              <w:top w:w="40.0" w:type="dxa"/>
+              <w:left w:w="40.0" w:type="dxa"/>
+              <w:bottom w:w="40.0" w:type="dxa"/>
+              <w:right w:w="40.0" w:type="dxa"/>
             </w:tcMar>
             <w:vAlign w:val="top"/>
           </w:tcPr>
@@ -13947,10 +13958,10 @@
             </w:tcBorders>
             <w:shd w:fill="ffffff" w:val="clear"/>
             <w:tcMar>
-              <w:top w:w="80.0" w:type="dxa"/>
-              <w:left w:w="80.0" w:type="dxa"/>
-              <w:bottom w:w="80.0" w:type="dxa"/>
-              <w:right w:w="80.0" w:type="dxa"/>
+              <w:top w:w="40.0" w:type="dxa"/>
+              <w:left w:w="40.0" w:type="dxa"/>
+              <w:bottom w:w="40.0" w:type="dxa"/>
+              <w:right w:w="40.0" w:type="dxa"/>
             </w:tcMar>
             <w:vAlign w:val="top"/>
           </w:tcPr>
@@ -13988,10 +13999,10 @@
             </w:tcBorders>
             <w:shd w:fill="ffffff" w:val="clear"/>
             <w:tcMar>
-              <w:top w:w="80.0" w:type="dxa"/>
-              <w:left w:w="80.0" w:type="dxa"/>
-              <w:bottom w:w="80.0" w:type="dxa"/>
-              <w:right w:w="80.0" w:type="dxa"/>
+              <w:top w:w="40.0" w:type="dxa"/>
+              <w:left w:w="40.0" w:type="dxa"/>
+              <w:bottom w:w="40.0" w:type="dxa"/>
+              <w:right w:w="40.0" w:type="dxa"/>
             </w:tcMar>
             <w:vAlign w:val="top"/>
           </w:tcPr>
@@ -14023,7 +14034,7 @@
       <w:tr>
         <w:trPr>
           <w:cantSplit w:val="0"/>
-          <w:trHeight w:val="375" w:hRule="atLeast"/>
+          <w:trHeight w:val="315" w:hRule="atLeast"/>
           <w:tblHeader w:val="0"/>
         </w:trPr>
         <w:tc>
@@ -14036,10 +14047,10 @@
             </w:tcBorders>
             <w:shd w:fill="ffffff" w:val="clear"/>
             <w:tcMar>
-              <w:top w:w="80.0" w:type="dxa"/>
-              <w:left w:w="80.0" w:type="dxa"/>
-              <w:bottom w:w="80.0" w:type="dxa"/>
-              <w:right w:w="80.0" w:type="dxa"/>
+              <w:top w:w="40.0" w:type="dxa"/>
+              <w:left w:w="40.0" w:type="dxa"/>
+              <w:bottom w:w="40.0" w:type="dxa"/>
+              <w:right w:w="40.0" w:type="dxa"/>
             </w:tcMar>
             <w:vAlign w:val="top"/>
           </w:tcPr>
@@ -14077,10 +14088,10 @@
             </w:tcBorders>
             <w:shd w:fill="ffffff" w:val="clear"/>
             <w:tcMar>
-              <w:top w:w="80.0" w:type="dxa"/>
-              <w:left w:w="80.0" w:type="dxa"/>
-              <w:bottom w:w="80.0" w:type="dxa"/>
-              <w:right w:w="80.0" w:type="dxa"/>
+              <w:top w:w="40.0" w:type="dxa"/>
+              <w:left w:w="40.0" w:type="dxa"/>
+              <w:bottom w:w="40.0" w:type="dxa"/>
+              <w:right w:w="40.0" w:type="dxa"/>
             </w:tcMar>
             <w:vAlign w:val="top"/>
           </w:tcPr>
@@ -14119,10 +14130,10 @@
             </w:tcBorders>
             <w:shd w:fill="ffffff" w:val="clear"/>
             <w:tcMar>
-              <w:top w:w="80.0" w:type="dxa"/>
-              <w:left w:w="80.0" w:type="dxa"/>
-              <w:bottom w:w="80.0" w:type="dxa"/>
-              <w:right w:w="80.0" w:type="dxa"/>
+              <w:top w:w="40.0" w:type="dxa"/>
+              <w:left w:w="40.0" w:type="dxa"/>
+              <w:bottom w:w="40.0" w:type="dxa"/>
+              <w:right w:w="40.0" w:type="dxa"/>
             </w:tcMar>
             <w:vAlign w:val="top"/>
           </w:tcPr>
@@ -14160,10 +14171,10 @@
             </w:tcBorders>
             <w:shd w:fill="ffffff" w:val="clear"/>
             <w:tcMar>
-              <w:top w:w="80.0" w:type="dxa"/>
-              <w:left w:w="80.0" w:type="dxa"/>
-              <w:bottom w:w="80.0" w:type="dxa"/>
-              <w:right w:w="80.0" w:type="dxa"/>
+              <w:top w:w="40.0" w:type="dxa"/>
+              <w:left w:w="40.0" w:type="dxa"/>
+              <w:bottom w:w="40.0" w:type="dxa"/>
+              <w:right w:w="40.0" w:type="dxa"/>
             </w:tcMar>
             <w:vAlign w:val="top"/>
           </w:tcPr>
@@ -14201,10 +14212,10 @@
             </w:tcBorders>
             <w:shd w:fill="ffffff" w:val="clear"/>
             <w:tcMar>
-              <w:top w:w="80.0" w:type="dxa"/>
-              <w:left w:w="80.0" w:type="dxa"/>
-              <w:bottom w:w="80.0" w:type="dxa"/>
-              <w:right w:w="80.0" w:type="dxa"/>
+              <w:top w:w="40.0" w:type="dxa"/>
+              <w:left w:w="40.0" w:type="dxa"/>
+              <w:bottom w:w="40.0" w:type="dxa"/>
+              <w:right w:w="40.0" w:type="dxa"/>
             </w:tcMar>
             <w:vAlign w:val="top"/>
           </w:tcPr>
@@ -14236,7 +14247,7 @@
       <w:tr>
         <w:trPr>
           <w:cantSplit w:val="0"/>
-          <w:trHeight w:val="375" w:hRule="atLeast"/>
+          <w:trHeight w:val="315" w:hRule="atLeast"/>
           <w:tblHeader w:val="0"/>
         </w:trPr>
         <w:tc>
@@ -14249,10 +14260,10 @@
             </w:tcBorders>
             <w:shd w:fill="ffffff" w:val="clear"/>
             <w:tcMar>
-              <w:top w:w="80.0" w:type="dxa"/>
-              <w:left w:w="80.0" w:type="dxa"/>
-              <w:bottom w:w="80.0" w:type="dxa"/>
-              <w:right w:w="80.0" w:type="dxa"/>
+              <w:top w:w="40.0" w:type="dxa"/>
+              <w:left w:w="40.0" w:type="dxa"/>
+              <w:bottom w:w="40.0" w:type="dxa"/>
+              <w:right w:w="40.0" w:type="dxa"/>
             </w:tcMar>
             <w:vAlign w:val="top"/>
           </w:tcPr>
@@ -14290,10 +14301,10 @@
             </w:tcBorders>
             <w:shd w:fill="ffffff" w:val="clear"/>
             <w:tcMar>
-              <w:top w:w="80.0" w:type="dxa"/>
-              <w:left w:w="80.0" w:type="dxa"/>
-              <w:bottom w:w="80.0" w:type="dxa"/>
-              <w:right w:w="80.0" w:type="dxa"/>
+              <w:top w:w="40.0" w:type="dxa"/>
+              <w:left w:w="40.0" w:type="dxa"/>
+              <w:bottom w:w="40.0" w:type="dxa"/>
+              <w:right w:w="40.0" w:type="dxa"/>
             </w:tcMar>
             <w:vAlign w:val="top"/>
           </w:tcPr>
@@ -14332,10 +14343,10 @@
             </w:tcBorders>
             <w:shd w:fill="ffffff" w:val="clear"/>
             <w:tcMar>
-              <w:top w:w="80.0" w:type="dxa"/>
-              <w:left w:w="80.0" w:type="dxa"/>
-              <w:bottom w:w="80.0" w:type="dxa"/>
-              <w:right w:w="80.0" w:type="dxa"/>
+              <w:top w:w="40.0" w:type="dxa"/>
+              <w:left w:w="40.0" w:type="dxa"/>
+              <w:bottom w:w="40.0" w:type="dxa"/>
+              <w:right w:w="40.0" w:type="dxa"/>
             </w:tcMar>
             <w:vAlign w:val="top"/>
           </w:tcPr>
@@ -14373,10 +14384,10 @@
             </w:tcBorders>
             <w:shd w:fill="ffffff" w:val="clear"/>
             <w:tcMar>
-              <w:top w:w="80.0" w:type="dxa"/>
-              <w:left w:w="80.0" w:type="dxa"/>
-              <w:bottom w:w="80.0" w:type="dxa"/>
-              <w:right w:w="80.0" w:type="dxa"/>
+              <w:top w:w="40.0" w:type="dxa"/>
+              <w:left w:w="40.0" w:type="dxa"/>
+              <w:bottom w:w="40.0" w:type="dxa"/>
+              <w:right w:w="40.0" w:type="dxa"/>
             </w:tcMar>
             <w:vAlign w:val="top"/>
           </w:tcPr>
@@ -14414,10 +14425,10 @@
             </w:tcBorders>
             <w:shd w:fill="ffffff" w:val="clear"/>
             <w:tcMar>
-              <w:top w:w="80.0" w:type="dxa"/>
-              <w:left w:w="80.0" w:type="dxa"/>
-              <w:bottom w:w="80.0" w:type="dxa"/>
-              <w:right w:w="80.0" w:type="dxa"/>
+              <w:top w:w="40.0" w:type="dxa"/>
+              <w:left w:w="40.0" w:type="dxa"/>
+              <w:bottom w:w="40.0" w:type="dxa"/>
+              <w:right w:w="40.0" w:type="dxa"/>
             </w:tcMar>
             <w:vAlign w:val="top"/>
           </w:tcPr>
@@ -14449,7 +14460,7 @@
       <w:tr>
         <w:trPr>
           <w:cantSplit w:val="0"/>
-          <w:trHeight w:val="375" w:hRule="atLeast"/>
+          <w:trHeight w:val="315" w:hRule="atLeast"/>
           <w:tblHeader w:val="0"/>
         </w:trPr>
         <w:tc>
@@ -14462,10 +14473,10 @@
             </w:tcBorders>
             <w:shd w:fill="ffffff" w:val="clear"/>
             <w:tcMar>
-              <w:top w:w="80.0" w:type="dxa"/>
-              <w:left w:w="80.0" w:type="dxa"/>
-              <w:bottom w:w="80.0" w:type="dxa"/>
-              <w:right w:w="80.0" w:type="dxa"/>
+              <w:top w:w="40.0" w:type="dxa"/>
+              <w:left w:w="40.0" w:type="dxa"/>
+              <w:bottom w:w="40.0" w:type="dxa"/>
+              <w:right w:w="40.0" w:type="dxa"/>
             </w:tcMar>
             <w:vAlign w:val="top"/>
           </w:tcPr>
@@ -14503,10 +14514,10 @@
             </w:tcBorders>
             <w:shd w:fill="ffffff" w:val="clear"/>
             <w:tcMar>
-              <w:top w:w="80.0" w:type="dxa"/>
-              <w:left w:w="80.0" w:type="dxa"/>
-              <w:bottom w:w="80.0" w:type="dxa"/>
-              <w:right w:w="80.0" w:type="dxa"/>
+              <w:top w:w="40.0" w:type="dxa"/>
+              <w:left w:w="40.0" w:type="dxa"/>
+              <w:bottom w:w="40.0" w:type="dxa"/>
+              <w:right w:w="40.0" w:type="dxa"/>
             </w:tcMar>
             <w:vAlign w:val="top"/>
           </w:tcPr>
@@ -14545,10 +14556,10 @@
             </w:tcBorders>
             <w:shd w:fill="ffffff" w:val="clear"/>
             <w:tcMar>
-              <w:top w:w="80.0" w:type="dxa"/>
-              <w:left w:w="80.0" w:type="dxa"/>
-              <w:bottom w:w="80.0" w:type="dxa"/>
-              <w:right w:w="80.0" w:type="dxa"/>
+              <w:top w:w="40.0" w:type="dxa"/>
+              <w:left w:w="40.0" w:type="dxa"/>
+              <w:bottom w:w="40.0" w:type="dxa"/>
+              <w:right w:w="40.0" w:type="dxa"/>
             </w:tcMar>
             <w:vAlign w:val="top"/>
           </w:tcPr>
@@ -14586,10 +14597,10 @@
             </w:tcBorders>
             <w:shd w:fill="ffffff" w:val="clear"/>
             <w:tcMar>
-              <w:top w:w="80.0" w:type="dxa"/>
-              <w:left w:w="80.0" w:type="dxa"/>
-              <w:bottom w:w="80.0" w:type="dxa"/>
-              <w:right w:w="80.0" w:type="dxa"/>
+              <w:top w:w="40.0" w:type="dxa"/>
+              <w:left w:w="40.0" w:type="dxa"/>
+              <w:bottom w:w="40.0" w:type="dxa"/>
+              <w:right w:w="40.0" w:type="dxa"/>
             </w:tcMar>
             <w:vAlign w:val="top"/>
           </w:tcPr>
@@ -14627,10 +14638,10 @@
             </w:tcBorders>
             <w:shd w:fill="ffffff" w:val="clear"/>
             <w:tcMar>
-              <w:top w:w="80.0" w:type="dxa"/>
-              <w:left w:w="80.0" w:type="dxa"/>
-              <w:bottom w:w="80.0" w:type="dxa"/>
-              <w:right w:w="80.0" w:type="dxa"/>
+              <w:top w:w="40.0" w:type="dxa"/>
+              <w:left w:w="40.0" w:type="dxa"/>
+              <w:bottom w:w="40.0" w:type="dxa"/>
+              <w:right w:w="40.0" w:type="dxa"/>
             </w:tcMar>
             <w:vAlign w:val="top"/>
           </w:tcPr>
@@ -14712,7 +14723,7 @@
           <w:szCs w:val="21"/>
           <w:rtl w:val="0"/>
         </w:rPr>
-        <w:t xml:space="preserve">Las cuatro rutas ofrecen capacidad total de 200 unidades, de las cuales se utilizan 146: utilización global de 73% y capacidad no utilizada de 27%. Se trata de capacidad libre al salir del depósito, no de mercancía desperdiciada ni del espacio libre promedio durante el recorrido. El cliente 10 queda en una ruta individual: aunque su ocupación es baja, forzar su integración altera las asignaciones y aumenta la distancia bajo estas condiciones.</w:t>
+        <w:t xml:space="preserve">Las cuatro rutas ofrecen una capacidad conjunta de 200 unidades y transportan 146: la utilización global es 73% y la capacidad no utilizada es 27%. En la Figura 2 se distinguen tres grupos de clientes y una ruta corta para el cliente 10. Aunque esa ruta aprovecha sólo el 26% de su capacidad, permite reducir la distancia total; forzar su integración en otro recorrido altera las asignaciones óptimas.</w:t>
       </w:r>
     </w:p>
     <w:p>
@@ -14734,12 +14745,12 @@
           <wp:inline distB="114300" distT="114300" distL="114300" distR="114300">
             <wp:extent cx="4673600" cy="4737100"/>
             <wp:effectExtent b="0" l="0" r="0" t="0"/>
-            <wp:docPr descr="Figura 2. Rutas de la solución exacta. Los números identifican nodos, no colores ni vehículos. Las flechas indican el sentido de visita; el cuadrado negro es el depósito." id="10" name="image4.png"/>
+            <wp:docPr descr="Figura 2. Rutas de distancia mínima. Las flechas indican el sentido de visita y el cuadrado representa el depósito." id="7" name="image2.png"/>
             <a:graphic>
               <a:graphicData uri="http://schemas.openxmlformats.org/drawingml/2006/picture">
                 <pic:pic>
                   <pic:nvPicPr>
-                    <pic:cNvPr descr="Figura 2. Rutas de la solución exacta. Los números identifican nodos, no colores ni vehículos. Las flechas indican el sentido de visita; el cuadrado negro es el depósito." id="0" name="image4.png"/>
+                    <pic:cNvPr descr="Figura 2. Rutas de distancia mínima. Las flechas indican el sentido de visita y el cuadrado representa el depósito." id="0" name="image2.png"/>
                     <pic:cNvPicPr preferRelativeResize="0"/>
                   </pic:nvPicPr>
                   <pic:blipFill>
@@ -14784,7 +14795,7 @@
           <w:szCs w:val="18"/>
           <w:rtl w:val="0"/>
         </w:rPr>
-        <w:t xml:space="preserve">Figura 2. Rutas de la solución exacta. Los números identifican nodos, no colores ni vehículos. Las flechas indican el sentido de visita; el cuadrado negro es el depósito.</w:t>
+        <w:t xml:space="preserve">Figura 2. Rutas de distancia mínima. Las flechas indican el sentido de visita y el cuadrado representa el depósito.</w:t>
       </w:r>
     </w:p>
     <w:p>
@@ -14800,8 +14811,8 @@
           <w:szCs w:val="26"/>
         </w:rPr>
       </w:pPr>
-      <w:bookmarkStart w:colFirst="0" w:colLast="0" w:name="_8u1t49axoaop" w:id="18"/>
-      <w:bookmarkEnd w:id="18"/>
+      <w:bookmarkStart w:colFirst="0" w:colLast="0" w:name="_ast3lv8wcxe2" w:id="19"/>
+      <w:bookmarkEnd w:id="19"/>
       <w:r>
         <w:rPr>
           <w:b w:val="1"/>
@@ -14847,7 +14858,7 @@
           <w:szCs w:val="21"/>
           <w:rtl w:val="0"/>
         </w:rPr>
-        <w:t xml:space="preserve">La cota anterior descarta dos rutas, pero no demuestra por sí sola que tres sean factibles. El modelo B con m = 3 probó el óptimo Z₃ = 339.164674 unidades en las diez ejecuciones medidas. La programación dinámica por particiones certificó independientemente el mismo valor. Las rutas de la Tabla 6 y la Figura 3 son equivalentes a las obtenidas por CBC, permitiendo inversión del sentido y cambio de etiquetas.</w:t>
+        <w:t xml:space="preserve">La cota de capacidad establece un mínimo de tres rutas. Al imponer m = 3, el modelo obtiene Z₃ = 339.164674 unidades, con optimalidad probada en las diez ejecuciones y confirmada por programación dinámica. La Tabla 6 y la Figura 3 muestran una solución óptima para este escenario.</w:t>
       </w:r>
     </w:p>
     <w:p>
@@ -14865,30 +14876,11 @@
           <w:szCs w:val="21"/>
           <w:rtl w:val="0"/>
         </w:rPr>
-        <w:t xml:space="preserve">Como antecedente separado, la ejecución histórica del modelo A almacenada en results/cbc_3rutas.log se detuvo a los 120 s: obtuvo un incumbente de 361.000366 y una cota inferior de 299.712, sin probar optimalidad. Esa evidencia se conserva y no se atribuye a B. En una comparación posterior con orden rotado y diez repeticiones por variante, B probó el óptimo en 10/10 y A en 2/10 dentro de 120 s. Es un resultado de esta instancia, equipo y versión de CBC; no demuestra que eliminar restricciones siempre acelere un modelo.</w:t>
+        <w:t xml:space="preserve">Las cargas de 47, 50 y 49 unidades confirman que tres vehículos son suficientes. En la Figura 3 se observa una redistribución de clientes que aprovecha casi toda la capacidad: quedan libres cuatro de las 150 unidades disponibles, equivalentes al 2.67%. Frente a la solución de cuatro rutas, esta consolidación incrementa el recorrido en 20.175187 unidades, un 6.325%.</w:t>
       </w:r>
     </w:p>
     <w:p>
       <w:pPr>
-        <w:spacing w:after="140" w:line="288" w:lineRule="auto"/>
-        <w:jc w:val="both"/>
-        <w:rPr>
-          <w:sz w:val="21"/>
-          <w:szCs w:val="21"/>
-        </w:rPr>
-      </w:pPr>
-      <w:r>
-        <w:rPr>
-          <w:sz w:val="21"/>
-          <w:szCs w:val="21"/>
-          <w:rtl w:val="0"/>
-        </w:rPr>
-        <w:t xml:space="preserve">La certificación y las cargas de las rutas prueban que tres vehículos son suficientes; junto con la cota inferior, establecen que el mínimo necesario es tres. La solución de menor distancia sin flota fija utiliza cuatro. Reducir a tres incrementa el recorrido en 20.175187 unidades (6.32%) y baja la capacidad libre global a 4/150 = 2.67%.</w:t>
-      </w:r>
-    </w:p>
-    <w:p>
-      <w:pPr>
-        <w:keepNext w:val="1"/>
         <w:spacing w:after="180" w:before="180" w:line="252.00000000000003" w:lineRule="auto"/>
         <w:rPr>
           <w:b w:val="1"/>
@@ -14898,20 +14890,39 @@
         </w:rPr>
       </w:pPr>
       <w:r>
+        <w:br w:type="page"/>
+      </w:r>
+      <w:r>
+        <w:rPr>
+          <w:rtl w:val="0"/>
+        </w:rPr>
+      </w:r>
+    </w:p>
+    <w:p>
+      <w:pPr>
+        <w:spacing w:after="180" w:before="180" w:line="252.00000000000003" w:lineRule="auto"/>
         <w:rPr>
           <w:b w:val="1"/>
           <w:bCs w:val="1"/>
           <w:sz w:val="18"/>
           <w:szCs w:val="18"/>
-          <w:rtl w:val="0"/>
-        </w:rPr>
-        <w:t xml:space="preserve">Tabla 6. Óptimo con exactamente tres rutas, probado por CBC con B y certificado por particiones.</w:t>
+        </w:rPr>
+      </w:pPr>
+      <w:r>
+        <w:rPr>
+          <w:b w:val="1"/>
+          <w:bCs w:val="1"/>
+          <w:sz w:val="18"/>
+          <w:szCs w:val="18"/>
+          <w:rtl w:val="0"/>
+        </w:rPr>
+        <w:t xml:space="preserve">Tabla 6. Rutas óptimas con una flota de tres vehículos.</w:t>
       </w:r>
     </w:p>
     <w:tbl>
       <w:tblPr>
         <w:tblStyle w:val="Table6"/>
-        <w:tblW w:w="8895.0" w:type="dxa"/>
+        <w:tblW w:w="8880.0" w:type="dxa"/>
         <w:jc w:val="left"/>
         <w:tblBorders>
           <w:top w:color="000000" w:space="0" w:sz="0" w:val="nil"/>
@@ -14925,17 +14936,17 @@
         <w:tblLook w:val="0600"/>
       </w:tblPr>
       <w:tblGrid>
-        <w:gridCol w:w="840"/>
-        <w:gridCol w:w="3360"/>
-        <w:gridCol w:w="1425"/>
-        <w:gridCol w:w="1515"/>
+        <w:gridCol w:w="780"/>
+        <w:gridCol w:w="3435"/>
+        <w:gridCol w:w="1410"/>
+        <w:gridCol w:w="1500"/>
         <w:gridCol w:w="1755"/>
         <w:tblGridChange w:id="0">
           <w:tblGrid>
-            <w:gridCol w:w="840"/>
-            <w:gridCol w:w="3360"/>
-            <w:gridCol w:w="1425"/>
-            <w:gridCol w:w="1515"/>
+            <w:gridCol w:w="780"/>
+            <w:gridCol w:w="3435"/>
+            <w:gridCol w:w="1410"/>
+            <w:gridCol w:w="1500"/>
             <w:gridCol w:w="1755"/>
           </w:tblGrid>
         </w:tblGridChange>
@@ -14943,7 +14954,7 @@
       <w:tr>
         <w:trPr>
           <w:cantSplit w:val="0"/>
-          <w:trHeight w:val="375" w:hRule="atLeast"/>
+          <w:trHeight w:val="315" w:hRule="atLeast"/>
           <w:tblHeader w:val="0"/>
         </w:trPr>
         <w:tc>
@@ -14956,10 +14967,10 @@
             </w:tcBorders>
             <w:shd w:fill="e9eff3" w:val="clear"/>
             <w:tcMar>
-              <w:top w:w="80.0" w:type="dxa"/>
-              <w:left w:w="80.0" w:type="dxa"/>
-              <w:bottom w:w="80.0" w:type="dxa"/>
-              <w:right w:w="80.0" w:type="dxa"/>
+              <w:top w:w="40.0" w:type="dxa"/>
+              <w:left w:w="40.0" w:type="dxa"/>
+              <w:bottom w:w="40.0" w:type="dxa"/>
+              <w:right w:w="40.0" w:type="dxa"/>
             </w:tcMar>
             <w:vAlign w:val="top"/>
           </w:tcPr>
@@ -14999,10 +15010,10 @@
             </w:tcBorders>
             <w:shd w:fill="e9eff3" w:val="clear"/>
             <w:tcMar>
-              <w:top w:w="80.0" w:type="dxa"/>
-              <w:left w:w="80.0" w:type="dxa"/>
-              <w:bottom w:w="80.0" w:type="dxa"/>
-              <w:right w:w="80.0" w:type="dxa"/>
+              <w:top w:w="40.0" w:type="dxa"/>
+              <w:left w:w="40.0" w:type="dxa"/>
+              <w:bottom w:w="40.0" w:type="dxa"/>
+              <w:right w:w="40.0" w:type="dxa"/>
             </w:tcMar>
             <w:vAlign w:val="top"/>
           </w:tcPr>
@@ -15042,10 +15053,10 @@
             </w:tcBorders>
             <w:shd w:fill="e9eff3" w:val="clear"/>
             <w:tcMar>
-              <w:top w:w="80.0" w:type="dxa"/>
-              <w:left w:w="80.0" w:type="dxa"/>
-              <w:bottom w:w="80.0" w:type="dxa"/>
-              <w:right w:w="80.0" w:type="dxa"/>
+              <w:top w:w="40.0" w:type="dxa"/>
+              <w:left w:w="40.0" w:type="dxa"/>
+              <w:bottom w:w="40.0" w:type="dxa"/>
+              <w:right w:w="40.0" w:type="dxa"/>
             </w:tcMar>
             <w:vAlign w:val="top"/>
           </w:tcPr>
@@ -15085,10 +15096,10 @@
             </w:tcBorders>
             <w:shd w:fill="e9eff3" w:val="clear"/>
             <w:tcMar>
-              <w:top w:w="80.0" w:type="dxa"/>
-              <w:left w:w="80.0" w:type="dxa"/>
-              <w:bottom w:w="80.0" w:type="dxa"/>
-              <w:right w:w="80.0" w:type="dxa"/>
+              <w:top w:w="40.0" w:type="dxa"/>
+              <w:left w:w="40.0" w:type="dxa"/>
+              <w:bottom w:w="40.0" w:type="dxa"/>
+              <w:right w:w="40.0" w:type="dxa"/>
             </w:tcMar>
             <w:vAlign w:val="top"/>
           </w:tcPr>
@@ -15128,10 +15139,10 @@
             </w:tcBorders>
             <w:shd w:fill="e9eff3" w:val="clear"/>
             <w:tcMar>
-              <w:top w:w="80.0" w:type="dxa"/>
-              <w:left w:w="80.0" w:type="dxa"/>
-              <w:bottom w:w="80.0" w:type="dxa"/>
-              <w:right w:w="80.0" w:type="dxa"/>
+              <w:top w:w="40.0" w:type="dxa"/>
+              <w:left w:w="40.0" w:type="dxa"/>
+              <w:bottom w:w="40.0" w:type="dxa"/>
+              <w:right w:w="40.0" w:type="dxa"/>
             </w:tcMar>
             <w:vAlign w:val="top"/>
           </w:tcPr>
@@ -15165,7 +15176,7 @@
       <w:tr>
         <w:trPr>
           <w:cantSplit w:val="0"/>
-          <w:trHeight w:val="375" w:hRule="atLeast"/>
+          <w:trHeight w:val="315" w:hRule="atLeast"/>
           <w:tblHeader w:val="0"/>
         </w:trPr>
         <w:tc>
@@ -15178,10 +15189,10 @@
             </w:tcBorders>
             <w:shd w:fill="ffffff" w:val="clear"/>
             <w:tcMar>
-              <w:top w:w="80.0" w:type="dxa"/>
-              <w:left w:w="80.0" w:type="dxa"/>
-              <w:bottom w:w="80.0" w:type="dxa"/>
-              <w:right w:w="80.0" w:type="dxa"/>
+              <w:top w:w="40.0" w:type="dxa"/>
+              <w:left w:w="40.0" w:type="dxa"/>
+              <w:bottom w:w="40.0" w:type="dxa"/>
+              <w:right w:w="40.0" w:type="dxa"/>
             </w:tcMar>
             <w:vAlign w:val="top"/>
           </w:tcPr>
@@ -15219,10 +15230,10 @@
             </w:tcBorders>
             <w:shd w:fill="ffffff" w:val="clear"/>
             <w:tcMar>
-              <w:top w:w="80.0" w:type="dxa"/>
-              <w:left w:w="80.0" w:type="dxa"/>
-              <w:bottom w:w="80.0" w:type="dxa"/>
-              <w:right w:w="80.0" w:type="dxa"/>
+              <w:top w:w="40.0" w:type="dxa"/>
+              <w:left w:w="40.0" w:type="dxa"/>
+              <w:bottom w:w="40.0" w:type="dxa"/>
+              <w:right w:w="40.0" w:type="dxa"/>
             </w:tcMar>
             <w:vAlign w:val="top"/>
           </w:tcPr>
@@ -15261,10 +15272,10 @@
             </w:tcBorders>
             <w:shd w:fill="ffffff" w:val="clear"/>
             <w:tcMar>
-              <w:top w:w="80.0" w:type="dxa"/>
-              <w:left w:w="80.0" w:type="dxa"/>
-              <w:bottom w:w="80.0" w:type="dxa"/>
-              <w:right w:w="80.0" w:type="dxa"/>
+              <w:top w:w="40.0" w:type="dxa"/>
+              <w:left w:w="40.0" w:type="dxa"/>
+              <w:bottom w:w="40.0" w:type="dxa"/>
+              <w:right w:w="40.0" w:type="dxa"/>
             </w:tcMar>
             <w:vAlign w:val="top"/>
           </w:tcPr>
@@ -15302,10 +15313,10 @@
             </w:tcBorders>
             <w:shd w:fill="ffffff" w:val="clear"/>
             <w:tcMar>
-              <w:top w:w="80.0" w:type="dxa"/>
-              <w:left w:w="80.0" w:type="dxa"/>
-              <w:bottom w:w="80.0" w:type="dxa"/>
-              <w:right w:w="80.0" w:type="dxa"/>
+              <w:top w:w="40.0" w:type="dxa"/>
+              <w:left w:w="40.0" w:type="dxa"/>
+              <w:bottom w:w="40.0" w:type="dxa"/>
+              <w:right w:w="40.0" w:type="dxa"/>
             </w:tcMar>
             <w:vAlign w:val="top"/>
           </w:tcPr>
@@ -15343,10 +15354,10 @@
             </w:tcBorders>
             <w:shd w:fill="ffffff" w:val="clear"/>
             <w:tcMar>
-              <w:top w:w="80.0" w:type="dxa"/>
-              <w:left w:w="80.0" w:type="dxa"/>
-              <w:bottom w:w="80.0" w:type="dxa"/>
-              <w:right w:w="80.0" w:type="dxa"/>
+              <w:top w:w="40.0" w:type="dxa"/>
+              <w:left w:w="40.0" w:type="dxa"/>
+              <w:bottom w:w="40.0" w:type="dxa"/>
+              <w:right w:w="40.0" w:type="dxa"/>
             </w:tcMar>
             <w:vAlign w:val="top"/>
           </w:tcPr>
@@ -15378,7 +15389,7 @@
       <w:tr>
         <w:trPr>
           <w:cantSplit w:val="0"/>
-          <w:trHeight w:val="375" w:hRule="atLeast"/>
+          <w:trHeight w:val="315" w:hRule="atLeast"/>
           <w:tblHeader w:val="0"/>
         </w:trPr>
         <w:tc>
@@ -15391,10 +15402,10 @@
             </w:tcBorders>
             <w:shd w:fill="ffffff" w:val="clear"/>
             <w:tcMar>
-              <w:top w:w="80.0" w:type="dxa"/>
-              <w:left w:w="80.0" w:type="dxa"/>
-              <w:bottom w:w="80.0" w:type="dxa"/>
-              <w:right w:w="80.0" w:type="dxa"/>
+              <w:top w:w="40.0" w:type="dxa"/>
+              <w:left w:w="40.0" w:type="dxa"/>
+              <w:bottom w:w="40.0" w:type="dxa"/>
+              <w:right w:w="40.0" w:type="dxa"/>
             </w:tcMar>
             <w:vAlign w:val="top"/>
           </w:tcPr>
@@ -15432,10 +15443,10 @@
             </w:tcBorders>
             <w:shd w:fill="ffffff" w:val="clear"/>
             <w:tcMar>
-              <w:top w:w="80.0" w:type="dxa"/>
-              <w:left w:w="80.0" w:type="dxa"/>
-              <w:bottom w:w="80.0" w:type="dxa"/>
-              <w:right w:w="80.0" w:type="dxa"/>
+              <w:top w:w="40.0" w:type="dxa"/>
+              <w:left w:w="40.0" w:type="dxa"/>
+              <w:bottom w:w="40.0" w:type="dxa"/>
+              <w:right w:w="40.0" w:type="dxa"/>
             </w:tcMar>
             <w:vAlign w:val="top"/>
           </w:tcPr>
@@ -15474,10 +15485,10 @@
             </w:tcBorders>
             <w:shd w:fill="ffffff" w:val="clear"/>
             <w:tcMar>
-              <w:top w:w="80.0" w:type="dxa"/>
-              <w:left w:w="80.0" w:type="dxa"/>
-              <w:bottom w:w="80.0" w:type="dxa"/>
-              <w:right w:w="80.0" w:type="dxa"/>
+              <w:top w:w="40.0" w:type="dxa"/>
+              <w:left w:w="40.0" w:type="dxa"/>
+              <w:bottom w:w="40.0" w:type="dxa"/>
+              <w:right w:w="40.0" w:type="dxa"/>
             </w:tcMar>
             <w:vAlign w:val="top"/>
           </w:tcPr>
@@ -15515,10 +15526,10 @@
             </w:tcBorders>
             <w:shd w:fill="ffffff" w:val="clear"/>
             <w:tcMar>
-              <w:top w:w="80.0" w:type="dxa"/>
-              <w:left w:w="80.0" w:type="dxa"/>
-              <w:bottom w:w="80.0" w:type="dxa"/>
-              <w:right w:w="80.0" w:type="dxa"/>
+              <w:top w:w="40.0" w:type="dxa"/>
+              <w:left w:w="40.0" w:type="dxa"/>
+              <w:bottom w:w="40.0" w:type="dxa"/>
+              <w:right w:w="40.0" w:type="dxa"/>
             </w:tcMar>
             <w:vAlign w:val="top"/>
           </w:tcPr>
@@ -15556,10 +15567,10 @@
             </w:tcBorders>
             <w:shd w:fill="ffffff" w:val="clear"/>
             <w:tcMar>
-              <w:top w:w="80.0" w:type="dxa"/>
-              <w:left w:w="80.0" w:type="dxa"/>
-              <w:bottom w:w="80.0" w:type="dxa"/>
-              <w:right w:w="80.0" w:type="dxa"/>
+              <w:top w:w="40.0" w:type="dxa"/>
+              <w:left w:w="40.0" w:type="dxa"/>
+              <w:bottom w:w="40.0" w:type="dxa"/>
+              <w:right w:w="40.0" w:type="dxa"/>
             </w:tcMar>
             <w:vAlign w:val="top"/>
           </w:tcPr>
@@ -15591,7 +15602,7 @@
       <w:tr>
         <w:trPr>
           <w:cantSplit w:val="0"/>
-          <w:trHeight w:val="375" w:hRule="atLeast"/>
+          <w:trHeight w:val="315" w:hRule="atLeast"/>
           <w:tblHeader w:val="0"/>
         </w:trPr>
         <w:tc>
@@ -15604,10 +15615,10 @@
             </w:tcBorders>
             <w:shd w:fill="ffffff" w:val="clear"/>
             <w:tcMar>
-              <w:top w:w="80.0" w:type="dxa"/>
-              <w:left w:w="80.0" w:type="dxa"/>
-              <w:bottom w:w="80.0" w:type="dxa"/>
-              <w:right w:w="80.0" w:type="dxa"/>
+              <w:top w:w="40.0" w:type="dxa"/>
+              <w:left w:w="40.0" w:type="dxa"/>
+              <w:bottom w:w="40.0" w:type="dxa"/>
+              <w:right w:w="40.0" w:type="dxa"/>
             </w:tcMar>
             <w:vAlign w:val="top"/>
           </w:tcPr>
@@ -15645,10 +15656,10 @@
             </w:tcBorders>
             <w:shd w:fill="ffffff" w:val="clear"/>
             <w:tcMar>
-              <w:top w:w="80.0" w:type="dxa"/>
-              <w:left w:w="80.0" w:type="dxa"/>
-              <w:bottom w:w="80.0" w:type="dxa"/>
-              <w:right w:w="80.0" w:type="dxa"/>
+              <w:top w:w="40.0" w:type="dxa"/>
+              <w:left w:w="40.0" w:type="dxa"/>
+              <w:bottom w:w="40.0" w:type="dxa"/>
+              <w:right w:w="40.0" w:type="dxa"/>
             </w:tcMar>
             <w:vAlign w:val="top"/>
           </w:tcPr>
@@ -15687,10 +15698,10 @@
             </w:tcBorders>
             <w:shd w:fill="ffffff" w:val="clear"/>
             <w:tcMar>
-              <w:top w:w="80.0" w:type="dxa"/>
-              <w:left w:w="80.0" w:type="dxa"/>
-              <w:bottom w:w="80.0" w:type="dxa"/>
-              <w:right w:w="80.0" w:type="dxa"/>
+              <w:top w:w="40.0" w:type="dxa"/>
+              <w:left w:w="40.0" w:type="dxa"/>
+              <w:bottom w:w="40.0" w:type="dxa"/>
+              <w:right w:w="40.0" w:type="dxa"/>
             </w:tcMar>
             <w:vAlign w:val="top"/>
           </w:tcPr>
@@ -15728,10 +15739,10 @@
             </w:tcBorders>
             <w:shd w:fill="ffffff" w:val="clear"/>
             <w:tcMar>
-              <w:top w:w="80.0" w:type="dxa"/>
-              <w:left w:w="80.0" w:type="dxa"/>
-              <w:bottom w:w="80.0" w:type="dxa"/>
-              <w:right w:w="80.0" w:type="dxa"/>
+              <w:top w:w="40.0" w:type="dxa"/>
+              <w:left w:w="40.0" w:type="dxa"/>
+              <w:bottom w:w="40.0" w:type="dxa"/>
+              <w:right w:w="40.0" w:type="dxa"/>
             </w:tcMar>
             <w:vAlign w:val="top"/>
           </w:tcPr>
@@ -15769,10 +15780,10 @@
             </w:tcBorders>
             <w:shd w:fill="ffffff" w:val="clear"/>
             <w:tcMar>
-              <w:top w:w="80.0" w:type="dxa"/>
-              <w:left w:w="80.0" w:type="dxa"/>
-              <w:bottom w:w="80.0" w:type="dxa"/>
-              <w:right w:w="80.0" w:type="dxa"/>
+              <w:top w:w="40.0" w:type="dxa"/>
+              <w:left w:w="40.0" w:type="dxa"/>
+              <w:bottom w:w="40.0" w:type="dxa"/>
+              <w:right w:w="40.0" w:type="dxa"/>
             </w:tcMar>
             <w:vAlign w:val="top"/>
           </w:tcPr>
@@ -15823,12 +15834,12 @@
           <wp:inline distB="114300" distT="114300" distL="114300" distR="114300">
             <wp:extent cx="4673600" cy="4648200"/>
             <wp:effectExtent b="0" l="0" r="0" t="0"/>
-            <wp:docPr descr="Figura 3. Solución óptima de tres rutas del modelo B, verificada por particiones. Cargas de 47, 50 y 49 unidades; el sentido inverso conserva el costo." id="9" name="image2.png"/>
+            <wp:docPr descr="Figura 3. Rutas óptimas para una flota de tres vehículos, con cargas de 47, 50 y 49 unidades." id="15" name="image3.png"/>
             <a:graphic>
               <a:graphicData uri="http://schemas.openxmlformats.org/drawingml/2006/picture">
                 <pic:pic>
                   <pic:nvPicPr>
-                    <pic:cNvPr descr="Figura 3. Solución óptima de tres rutas del modelo B, verificada por particiones. Cargas de 47, 50 y 49 unidades; el sentido inverso conserva el costo." id="0" name="image2.png"/>
+                    <pic:cNvPr descr="Figura 3. Rutas óptimas para una flota de tres vehículos, con cargas de 47, 50 y 49 unidades." id="0" name="image3.png"/>
                     <pic:cNvPicPr preferRelativeResize="0"/>
                   </pic:nvPicPr>
                   <pic:blipFill>
@@ -15873,7 +15884,7 @@
           <w:szCs w:val="18"/>
           <w:rtl w:val="0"/>
         </w:rPr>
-        <w:t xml:space="preserve">Figura 3. Solución óptima de tres rutas del modelo B, verificada por particiones. Cargas de 47, 50 y 49 unidades; el sentido inverso conserva el costo.</w:t>
+        <w:t xml:space="preserve">Figura 3. Rutas óptimas para una flota de tres vehículos, con cargas de 47, 50 y 49 unidades.</w:t>
       </w:r>
     </w:p>
     <w:p>
@@ -15891,7 +15902,7 @@
           <w:szCs w:val="21"/>
           <w:rtl w:val="0"/>
         </w:rPr>
-        <w:t xml:space="preserve">Este contraste explica por qué minimizar distancia y minimizar vehículos son objetivos distintos. Si se compara únicamente estas dos soluciones e incorpora un costo fijo expresado en unidades equivalentes de distancia, la de tres rutas resulta preferible cuando dicho costo por ruta supera 20.175187. Esta observación compara los dos escenarios calculados; no asigna precios reales a los vehículos ni sustituye un análisis completo de costos.</w:t>
+        <w:t xml:space="preserve">La comparación muestra el compromiso entre distancia y tamaño de flota. Entre estos dos escenarios, la alternativa de tres vehículos conviene cuando el ahorro de un costo fijo por vehículo supera el costo de 20.175187 unidades adicionales de recorrido, conforme al marco económico de la sección 1.2.</w:t>
       </w:r>
     </w:p>
     <w:p>
@@ -15907,14 +15918,38 @@
           <w:szCs w:val="26"/>
         </w:rPr>
       </w:pPr>
-      <w:bookmarkStart w:colFirst="0" w:colLast="0" w:name="_8icum9ghmv93" w:id="19"/>
-      <w:bookmarkEnd w:id="19"/>
-      <w:r>
+      <w:bookmarkStart w:colFirst="0" w:colLast="0" w:name="_qrfuvojkoz2n" w:id="20"/>
+      <w:bookmarkEnd w:id="20"/>
+      <w:r>
+        <w:br w:type="page"/>
+      </w:r>
+      <w:r>
+        <w:rPr>
+          <w:rtl w:val="0"/>
+        </w:rPr>
+      </w:r>
+    </w:p>
+    <w:p>
+      <w:pPr>
+        <w:pStyle w:val="Heading2"/>
+        <w:keepNext w:val="1"/>
+        <w:keepLines w:val="0"/>
+        <w:spacing w:after="140" w:before="300" w:line="252.00000000000003" w:lineRule="auto"/>
         <w:rPr>
           <w:b w:val="1"/>
           <w:bCs w:val="1"/>
           <w:sz w:val="26"/>
           <w:szCs w:val="26"/>
+        </w:rPr>
+      </w:pPr>
+      <w:bookmarkStart w:colFirst="0" w:colLast="0" w:name="_2gv69gplzyox" w:id="21"/>
+      <w:bookmarkEnd w:id="21"/>
+      <w:r>
+        <w:rPr>
+          <w:b w:val="1"/>
+          <w:bCs w:val="1"/>
+          <w:sz w:val="26"/>
+          <w:szCs w:val="26"/>
           <w:rtl w:val="0"/>
         </w:rPr>
         <w:t xml:space="preserve">6.3. Solución heurística</w:t>
@@ -15922,7 +15957,6 @@
     </w:p>
     <w:p>
       <w:pPr>
-        <w:keepNext w:val="1"/>
         <w:spacing w:after="180" w:before="180" w:line="252.00000000000003" w:lineRule="auto"/>
         <w:rPr>
           <w:b w:val="1"/>
@@ -15945,7 +15979,7 @@
     <w:tbl>
       <w:tblPr>
         <w:tblStyle w:val="Table7"/>
-        <w:tblW w:w="8895.0" w:type="dxa"/>
+        <w:tblW w:w="8880.0" w:type="dxa"/>
         <w:jc w:val="left"/>
         <w:tblBorders>
           <w:top w:color="000000" w:space="0" w:sz="0" w:val="nil"/>
@@ -15959,17 +15993,17 @@
         <w:tblLook w:val="0600"/>
       </w:tblPr>
       <w:tblGrid>
-        <w:gridCol w:w="840"/>
-        <w:gridCol w:w="3360"/>
-        <w:gridCol w:w="1425"/>
-        <w:gridCol w:w="1515"/>
+        <w:gridCol w:w="780"/>
+        <w:gridCol w:w="3435"/>
+        <w:gridCol w:w="1410"/>
+        <w:gridCol w:w="1500"/>
         <w:gridCol w:w="1755"/>
         <w:tblGridChange w:id="0">
           <w:tblGrid>
-            <w:gridCol w:w="840"/>
-            <w:gridCol w:w="3360"/>
-            <w:gridCol w:w="1425"/>
-            <w:gridCol w:w="1515"/>
+            <w:gridCol w:w="780"/>
+            <w:gridCol w:w="3435"/>
+            <w:gridCol w:w="1410"/>
+            <w:gridCol w:w="1500"/>
             <w:gridCol w:w="1755"/>
           </w:tblGrid>
         </w:tblGridChange>
@@ -15977,7 +16011,7 @@
       <w:tr>
         <w:trPr>
           <w:cantSplit w:val="0"/>
-          <w:trHeight w:val="375" w:hRule="atLeast"/>
+          <w:trHeight w:val="315" w:hRule="atLeast"/>
           <w:tblHeader w:val="0"/>
         </w:trPr>
         <w:tc>
@@ -15990,10 +16024,10 @@
             </w:tcBorders>
             <w:shd w:fill="e9eff3" w:val="clear"/>
             <w:tcMar>
-              <w:top w:w="80.0" w:type="dxa"/>
-              <w:left w:w="80.0" w:type="dxa"/>
-              <w:bottom w:w="80.0" w:type="dxa"/>
-              <w:right w:w="80.0" w:type="dxa"/>
+              <w:top w:w="40.0" w:type="dxa"/>
+              <w:left w:w="40.0" w:type="dxa"/>
+              <w:bottom w:w="40.0" w:type="dxa"/>
+              <w:right w:w="40.0" w:type="dxa"/>
             </w:tcMar>
             <w:vAlign w:val="top"/>
           </w:tcPr>
@@ -16033,10 +16067,10 @@
             </w:tcBorders>
             <w:shd w:fill="e9eff3" w:val="clear"/>
             <w:tcMar>
-              <w:top w:w="80.0" w:type="dxa"/>
-              <w:left w:w="80.0" w:type="dxa"/>
-              <w:bottom w:w="80.0" w:type="dxa"/>
-              <w:right w:w="80.0" w:type="dxa"/>
+              <w:top w:w="40.0" w:type="dxa"/>
+              <w:left w:w="40.0" w:type="dxa"/>
+              <w:bottom w:w="40.0" w:type="dxa"/>
+              <w:right w:w="40.0" w:type="dxa"/>
             </w:tcMar>
             <w:vAlign w:val="top"/>
           </w:tcPr>
@@ -16076,10 +16110,10 @@
             </w:tcBorders>
             <w:shd w:fill="e9eff3" w:val="clear"/>
             <w:tcMar>
-              <w:top w:w="80.0" w:type="dxa"/>
-              <w:left w:w="80.0" w:type="dxa"/>
-              <w:bottom w:w="80.0" w:type="dxa"/>
-              <w:right w:w="80.0" w:type="dxa"/>
+              <w:top w:w="40.0" w:type="dxa"/>
+              <w:left w:w="40.0" w:type="dxa"/>
+              <w:bottom w:w="40.0" w:type="dxa"/>
+              <w:right w:w="40.0" w:type="dxa"/>
             </w:tcMar>
             <w:vAlign w:val="top"/>
           </w:tcPr>
@@ -16119,10 +16153,10 @@
             </w:tcBorders>
             <w:shd w:fill="e9eff3" w:val="clear"/>
             <w:tcMar>
-              <w:top w:w="80.0" w:type="dxa"/>
-              <w:left w:w="80.0" w:type="dxa"/>
-              <w:bottom w:w="80.0" w:type="dxa"/>
-              <w:right w:w="80.0" w:type="dxa"/>
+              <w:top w:w="40.0" w:type="dxa"/>
+              <w:left w:w="40.0" w:type="dxa"/>
+              <w:bottom w:w="40.0" w:type="dxa"/>
+              <w:right w:w="40.0" w:type="dxa"/>
             </w:tcMar>
             <w:vAlign w:val="top"/>
           </w:tcPr>
@@ -16162,10 +16196,10 @@
             </w:tcBorders>
             <w:shd w:fill="e9eff3" w:val="clear"/>
             <w:tcMar>
-              <w:top w:w="80.0" w:type="dxa"/>
-              <w:left w:w="80.0" w:type="dxa"/>
-              <w:bottom w:w="80.0" w:type="dxa"/>
-              <w:right w:w="80.0" w:type="dxa"/>
+              <w:top w:w="40.0" w:type="dxa"/>
+              <w:left w:w="40.0" w:type="dxa"/>
+              <w:bottom w:w="40.0" w:type="dxa"/>
+              <w:right w:w="40.0" w:type="dxa"/>
             </w:tcMar>
             <w:vAlign w:val="top"/>
           </w:tcPr>
@@ -16199,7 +16233,7 @@
       <w:tr>
         <w:trPr>
           <w:cantSplit w:val="0"/>
-          <w:trHeight w:val="375" w:hRule="atLeast"/>
+          <w:trHeight w:val="315" w:hRule="atLeast"/>
           <w:tblHeader w:val="0"/>
         </w:trPr>
         <w:tc>
@@ -16212,10 +16246,10 @@
             </w:tcBorders>
             <w:shd w:fill="ffffff" w:val="clear"/>
             <w:tcMar>
-              <w:top w:w="80.0" w:type="dxa"/>
-              <w:left w:w="80.0" w:type="dxa"/>
-              <w:bottom w:w="80.0" w:type="dxa"/>
-              <w:right w:w="80.0" w:type="dxa"/>
+              <w:top w:w="40.0" w:type="dxa"/>
+              <w:left w:w="40.0" w:type="dxa"/>
+              <w:bottom w:w="40.0" w:type="dxa"/>
+              <w:right w:w="40.0" w:type="dxa"/>
             </w:tcMar>
             <w:vAlign w:val="top"/>
           </w:tcPr>
@@ -16253,10 +16287,10 @@
             </w:tcBorders>
             <w:shd w:fill="ffffff" w:val="clear"/>
             <w:tcMar>
-              <w:top w:w="80.0" w:type="dxa"/>
-              <w:left w:w="80.0" w:type="dxa"/>
-              <w:bottom w:w="80.0" w:type="dxa"/>
-              <w:right w:w="80.0" w:type="dxa"/>
+              <w:top w:w="40.0" w:type="dxa"/>
+              <w:left w:w="40.0" w:type="dxa"/>
+              <w:bottom w:w="40.0" w:type="dxa"/>
+              <w:right w:w="40.0" w:type="dxa"/>
             </w:tcMar>
             <w:vAlign w:val="top"/>
           </w:tcPr>
@@ -16295,10 +16329,10 @@
             </w:tcBorders>
             <w:shd w:fill="ffffff" w:val="clear"/>
             <w:tcMar>
-              <w:top w:w="80.0" w:type="dxa"/>
-              <w:left w:w="80.0" w:type="dxa"/>
-              <w:bottom w:w="80.0" w:type="dxa"/>
-              <w:right w:w="80.0" w:type="dxa"/>
+              <w:top w:w="40.0" w:type="dxa"/>
+              <w:left w:w="40.0" w:type="dxa"/>
+              <w:bottom w:w="40.0" w:type="dxa"/>
+              <w:right w:w="40.0" w:type="dxa"/>
             </w:tcMar>
             <w:vAlign w:val="top"/>
           </w:tcPr>
@@ -16336,10 +16370,10 @@
             </w:tcBorders>
             <w:shd w:fill="ffffff" w:val="clear"/>
             <w:tcMar>
-              <w:top w:w="80.0" w:type="dxa"/>
-              <w:left w:w="80.0" w:type="dxa"/>
-              <w:bottom w:w="80.0" w:type="dxa"/>
-              <w:right w:w="80.0" w:type="dxa"/>
+              <w:top w:w="40.0" w:type="dxa"/>
+              <w:left w:w="40.0" w:type="dxa"/>
+              <w:bottom w:w="40.0" w:type="dxa"/>
+              <w:right w:w="40.0" w:type="dxa"/>
             </w:tcMar>
             <w:vAlign w:val="top"/>
           </w:tcPr>
@@ -16377,10 +16411,10 @@
             </w:tcBorders>
             <w:shd w:fill="ffffff" w:val="clear"/>
             <w:tcMar>
-              <w:top w:w="80.0" w:type="dxa"/>
-              <w:left w:w="80.0" w:type="dxa"/>
-              <w:bottom w:w="80.0" w:type="dxa"/>
-              <w:right w:w="80.0" w:type="dxa"/>
+              <w:top w:w="40.0" w:type="dxa"/>
+              <w:left w:w="40.0" w:type="dxa"/>
+              <w:bottom w:w="40.0" w:type="dxa"/>
+              <w:right w:w="40.0" w:type="dxa"/>
             </w:tcMar>
             <w:vAlign w:val="top"/>
           </w:tcPr>
@@ -16412,7 +16446,7 @@
       <w:tr>
         <w:trPr>
           <w:cantSplit w:val="0"/>
-          <w:trHeight w:val="375" w:hRule="atLeast"/>
+          <w:trHeight w:val="315" w:hRule="atLeast"/>
           <w:tblHeader w:val="0"/>
         </w:trPr>
         <w:tc>
@@ -16425,10 +16459,10 @@
             </w:tcBorders>
             <w:shd w:fill="ffffff" w:val="clear"/>
             <w:tcMar>
-              <w:top w:w="80.0" w:type="dxa"/>
-              <w:left w:w="80.0" w:type="dxa"/>
-              <w:bottom w:w="80.0" w:type="dxa"/>
-              <w:right w:w="80.0" w:type="dxa"/>
+              <w:top w:w="40.0" w:type="dxa"/>
+              <w:left w:w="40.0" w:type="dxa"/>
+              <w:bottom w:w="40.0" w:type="dxa"/>
+              <w:right w:w="40.0" w:type="dxa"/>
             </w:tcMar>
             <w:vAlign w:val="top"/>
           </w:tcPr>
@@ -16466,10 +16500,10 @@
             </w:tcBorders>
             <w:shd w:fill="ffffff" w:val="clear"/>
             <w:tcMar>
-              <w:top w:w="80.0" w:type="dxa"/>
-              <w:left w:w="80.0" w:type="dxa"/>
-              <w:bottom w:w="80.0" w:type="dxa"/>
-              <w:right w:w="80.0" w:type="dxa"/>
+              <w:top w:w="40.0" w:type="dxa"/>
+              <w:left w:w="40.0" w:type="dxa"/>
+              <w:bottom w:w="40.0" w:type="dxa"/>
+              <w:right w:w="40.0" w:type="dxa"/>
             </w:tcMar>
             <w:vAlign w:val="top"/>
           </w:tcPr>
@@ -16508,10 +16542,10 @@
             </w:tcBorders>
             <w:shd w:fill="ffffff" w:val="clear"/>
             <w:tcMar>
-              <w:top w:w="80.0" w:type="dxa"/>
-              <w:left w:w="80.0" w:type="dxa"/>
-              <w:bottom w:w="80.0" w:type="dxa"/>
-              <w:right w:w="80.0" w:type="dxa"/>
+              <w:top w:w="40.0" w:type="dxa"/>
+              <w:left w:w="40.0" w:type="dxa"/>
+              <w:bottom w:w="40.0" w:type="dxa"/>
+              <w:right w:w="40.0" w:type="dxa"/>
             </w:tcMar>
             <w:vAlign w:val="top"/>
           </w:tcPr>
@@ -16549,10 +16583,10 @@
             </w:tcBorders>
             <w:shd w:fill="ffffff" w:val="clear"/>
             <w:tcMar>
-              <w:top w:w="80.0" w:type="dxa"/>
-              <w:left w:w="80.0" w:type="dxa"/>
-              <w:bottom w:w="80.0" w:type="dxa"/>
-              <w:right w:w="80.0" w:type="dxa"/>
+              <w:top w:w="40.0" w:type="dxa"/>
+              <w:left w:w="40.0" w:type="dxa"/>
+              <w:bottom w:w="40.0" w:type="dxa"/>
+              <w:right w:w="40.0" w:type="dxa"/>
             </w:tcMar>
             <w:vAlign w:val="top"/>
           </w:tcPr>
@@ -16590,10 +16624,10 @@
             </w:tcBorders>
             <w:shd w:fill="ffffff" w:val="clear"/>
             <w:tcMar>
-              <w:top w:w="80.0" w:type="dxa"/>
-              <w:left w:w="80.0" w:type="dxa"/>
-              <w:bottom w:w="80.0" w:type="dxa"/>
-              <w:right w:w="80.0" w:type="dxa"/>
+              <w:top w:w="40.0" w:type="dxa"/>
+              <w:left w:w="40.0" w:type="dxa"/>
+              <w:bottom w:w="40.0" w:type="dxa"/>
+              <w:right w:w="40.0" w:type="dxa"/>
             </w:tcMar>
             <w:vAlign w:val="top"/>
           </w:tcPr>
@@ -16625,7 +16659,7 @@
       <w:tr>
         <w:trPr>
           <w:cantSplit w:val="0"/>
-          <w:trHeight w:val="375" w:hRule="atLeast"/>
+          <w:trHeight w:val="315" w:hRule="atLeast"/>
           <w:tblHeader w:val="0"/>
         </w:trPr>
         <w:tc>
@@ -16638,10 +16672,10 @@
             </w:tcBorders>
             <w:shd w:fill="ffffff" w:val="clear"/>
             <w:tcMar>
-              <w:top w:w="80.0" w:type="dxa"/>
-              <w:left w:w="80.0" w:type="dxa"/>
-              <w:bottom w:w="80.0" w:type="dxa"/>
-              <w:right w:w="80.0" w:type="dxa"/>
+              <w:top w:w="40.0" w:type="dxa"/>
+              <w:left w:w="40.0" w:type="dxa"/>
+              <w:bottom w:w="40.0" w:type="dxa"/>
+              <w:right w:w="40.0" w:type="dxa"/>
             </w:tcMar>
             <w:vAlign w:val="top"/>
           </w:tcPr>
@@ -16679,10 +16713,10 @@
             </w:tcBorders>
             <w:shd w:fill="ffffff" w:val="clear"/>
             <w:tcMar>
-              <w:top w:w="80.0" w:type="dxa"/>
-              <w:left w:w="80.0" w:type="dxa"/>
-              <w:bottom w:w="80.0" w:type="dxa"/>
-              <w:right w:w="80.0" w:type="dxa"/>
+              <w:top w:w="40.0" w:type="dxa"/>
+              <w:left w:w="40.0" w:type="dxa"/>
+              <w:bottom w:w="40.0" w:type="dxa"/>
+              <w:right w:w="40.0" w:type="dxa"/>
             </w:tcMar>
             <w:vAlign w:val="top"/>
           </w:tcPr>
@@ -16721,10 +16755,10 @@
             </w:tcBorders>
             <w:shd w:fill="ffffff" w:val="clear"/>
             <w:tcMar>
-              <w:top w:w="80.0" w:type="dxa"/>
-              <w:left w:w="80.0" w:type="dxa"/>
-              <w:bottom w:w="80.0" w:type="dxa"/>
-              <w:right w:w="80.0" w:type="dxa"/>
+              <w:top w:w="40.0" w:type="dxa"/>
+              <w:left w:w="40.0" w:type="dxa"/>
+              <w:bottom w:w="40.0" w:type="dxa"/>
+              <w:right w:w="40.0" w:type="dxa"/>
             </w:tcMar>
             <w:vAlign w:val="top"/>
           </w:tcPr>
@@ -16762,10 +16796,10 @@
             </w:tcBorders>
             <w:shd w:fill="ffffff" w:val="clear"/>
             <w:tcMar>
-              <w:top w:w="80.0" w:type="dxa"/>
-              <w:left w:w="80.0" w:type="dxa"/>
-              <w:bottom w:w="80.0" w:type="dxa"/>
-              <w:right w:w="80.0" w:type="dxa"/>
+              <w:top w:w="40.0" w:type="dxa"/>
+              <w:left w:w="40.0" w:type="dxa"/>
+              <w:bottom w:w="40.0" w:type="dxa"/>
+              <w:right w:w="40.0" w:type="dxa"/>
             </w:tcMar>
             <w:vAlign w:val="top"/>
           </w:tcPr>
@@ -16803,10 +16837,10 @@
             </w:tcBorders>
             <w:shd w:fill="ffffff" w:val="clear"/>
             <w:tcMar>
-              <w:top w:w="80.0" w:type="dxa"/>
-              <w:left w:w="80.0" w:type="dxa"/>
-              <w:bottom w:w="80.0" w:type="dxa"/>
-              <w:right w:w="80.0" w:type="dxa"/>
+              <w:top w:w="40.0" w:type="dxa"/>
+              <w:left w:w="40.0" w:type="dxa"/>
+              <w:bottom w:w="40.0" w:type="dxa"/>
+              <w:right w:w="40.0" w:type="dxa"/>
             </w:tcMar>
             <w:vAlign w:val="top"/>
           </w:tcPr>
@@ -16838,7 +16872,7 @@
       <w:tr>
         <w:trPr>
           <w:cantSplit w:val="0"/>
-          <w:trHeight w:val="375" w:hRule="atLeast"/>
+          <w:trHeight w:val="315" w:hRule="atLeast"/>
           <w:tblHeader w:val="0"/>
         </w:trPr>
         <w:tc>
@@ -16851,10 +16885,10 @@
             </w:tcBorders>
             <w:shd w:fill="ffffff" w:val="clear"/>
             <w:tcMar>
-              <w:top w:w="80.0" w:type="dxa"/>
-              <w:left w:w="80.0" w:type="dxa"/>
-              <w:bottom w:w="80.0" w:type="dxa"/>
-              <w:right w:w="80.0" w:type="dxa"/>
+              <w:top w:w="40.0" w:type="dxa"/>
+              <w:left w:w="40.0" w:type="dxa"/>
+              <w:bottom w:w="40.0" w:type="dxa"/>
+              <w:right w:w="40.0" w:type="dxa"/>
             </w:tcMar>
             <w:vAlign w:val="top"/>
           </w:tcPr>
@@ -16892,10 +16926,10 @@
             </w:tcBorders>
             <w:shd w:fill="ffffff" w:val="clear"/>
             <w:tcMar>
-              <w:top w:w="80.0" w:type="dxa"/>
-              <w:left w:w="80.0" w:type="dxa"/>
-              <w:bottom w:w="80.0" w:type="dxa"/>
-              <w:right w:w="80.0" w:type="dxa"/>
+              <w:top w:w="40.0" w:type="dxa"/>
+              <w:left w:w="40.0" w:type="dxa"/>
+              <w:bottom w:w="40.0" w:type="dxa"/>
+              <w:right w:w="40.0" w:type="dxa"/>
             </w:tcMar>
             <w:vAlign w:val="top"/>
           </w:tcPr>
@@ -16934,10 +16968,10 @@
             </w:tcBorders>
             <w:shd w:fill="ffffff" w:val="clear"/>
             <w:tcMar>
-              <w:top w:w="80.0" w:type="dxa"/>
-              <w:left w:w="80.0" w:type="dxa"/>
-              <w:bottom w:w="80.0" w:type="dxa"/>
-              <w:right w:w="80.0" w:type="dxa"/>
+              <w:top w:w="40.0" w:type="dxa"/>
+              <w:left w:w="40.0" w:type="dxa"/>
+              <w:bottom w:w="40.0" w:type="dxa"/>
+              <w:right w:w="40.0" w:type="dxa"/>
             </w:tcMar>
             <w:vAlign w:val="top"/>
           </w:tcPr>
@@ -16975,10 +17009,10 @@
             </w:tcBorders>
             <w:shd w:fill="ffffff" w:val="clear"/>
             <w:tcMar>
-              <w:top w:w="80.0" w:type="dxa"/>
-              <w:left w:w="80.0" w:type="dxa"/>
-              <w:bottom w:w="80.0" w:type="dxa"/>
-              <w:right w:w="80.0" w:type="dxa"/>
+              <w:top w:w="40.0" w:type="dxa"/>
+              <w:left w:w="40.0" w:type="dxa"/>
+              <w:bottom w:w="40.0" w:type="dxa"/>
+              <w:right w:w="40.0" w:type="dxa"/>
             </w:tcMar>
             <w:vAlign w:val="top"/>
           </w:tcPr>
@@ -17016,10 +17050,10 @@
             </w:tcBorders>
             <w:shd w:fill="ffffff" w:val="clear"/>
             <w:tcMar>
-              <w:top w:w="80.0" w:type="dxa"/>
-              <w:left w:w="80.0" w:type="dxa"/>
-              <w:bottom w:w="80.0" w:type="dxa"/>
-              <w:right w:w="80.0" w:type="dxa"/>
+              <w:top w:w="40.0" w:type="dxa"/>
+              <w:left w:w="40.0" w:type="dxa"/>
+              <w:bottom w:w="40.0" w:type="dxa"/>
+              <w:right w:w="40.0" w:type="dxa"/>
             </w:tcMar>
             <w:vAlign w:val="top"/>
           </w:tcPr>
@@ -17086,12 +17120,12 @@
           <wp:inline distB="114300" distT="114300" distL="114300" distR="114300">
             <wp:extent cx="4673600" cy="4737100"/>
             <wp:effectExtent b="0" l="0" r="0" t="0"/>
-            <wp:docPr descr="Figura 4. Rutas de la heurística. La agrupación de clientes difiere de la exacta aunque ambas utilizan cuatro vehículos bajo el supuesto de una ruta por vehículo." id="15" name="image3.png"/>
+            <wp:docPr descr="Figura 4. Rutas obtenidas mediante Clarke–Wright + 2-opt." id="12" name="image5.png"/>
             <a:graphic>
               <a:graphicData uri="http://schemas.openxmlformats.org/drawingml/2006/picture">
                 <pic:pic>
                   <pic:nvPicPr>
-                    <pic:cNvPr descr="Figura 4. Rutas de la heurística. La agrupación de clientes difiere de la exacta aunque ambas utilizan cuatro vehículos bajo el supuesto de una ruta por vehículo." id="0" name="image3.png"/>
+                    <pic:cNvPr descr="Figura 4. Rutas obtenidas mediante Clarke–Wright + 2-opt." id="0" name="image5.png"/>
                     <pic:cNvPicPr preferRelativeResize="0"/>
                   </pic:nvPicPr>
                   <pic:blipFill>
@@ -17136,7 +17170,7 @@
           <w:szCs w:val="18"/>
           <w:rtl w:val="0"/>
         </w:rPr>
-        <w:t xml:space="preserve">Figura 4. Rutas de la heurística. La agrupación de clientes difiere de la exacta aunque ambas utilizan cuatro vehículos bajo el supuesto de una ruta por vehículo.</w:t>
+        <w:t xml:space="preserve">Figura 4. Rutas obtenidas mediante Clarke–Wright + 2-opt.</w:t>
       </w:r>
     </w:p>
     <w:p>
@@ -17154,7 +17188,7 @@
           <w:szCs w:val="21"/>
           <w:rtl w:val="0"/>
         </w:rPr>
-        <w:t xml:space="preserve">La heurística conserva la agrupación 3–2–6, pero deja solo al cliente 11 y construye una ruta que conecta 9–5–4–10. La mejora 2-opt reordena clientes dentro de cada grupo; no corrige por sí misma la asignación entre vehículos. Una siguiente mejora razonable sería permitir traslados e intercambios entre rutas, siempre verificando capacidad.</w:t>
+        <w:t xml:space="preserve">La Figura 4 conserva el grupo 3–2–6 de la solución exacta, pero deja al cliente 11 en una ruta individual y reúne 9–5–4–10 en otra. Estas asignaciones explican el mayor recorrido. La mejora 2-opt optimiza el orden dentro de cada ruta y conserva sus cargas; para modificar la agrupación sería necesario incorporar traslados o intercambios de clientes entre vehículos.</w:t>
       </w:r>
     </w:p>
     <w:p>
@@ -17170,8 +17204,8 @@
           <w:szCs w:val="36"/>
         </w:rPr>
       </w:pPr>
-      <w:bookmarkStart w:colFirst="0" w:colLast="0" w:name="_r7t762vore8o" w:id="20"/>
-      <w:bookmarkEnd w:id="20"/>
+      <w:bookmarkStart w:colFirst="0" w:colLast="0" w:name="_iqq9zex62g79" w:id="22"/>
+      <w:bookmarkEnd w:id="22"/>
       <w:r>
         <w:rPr>
           <w:b w:val="1"/>
@@ -17196,8 +17230,8 @@
           <w:szCs w:val="26"/>
         </w:rPr>
       </w:pPr>
-      <w:bookmarkStart w:colFirst="0" w:colLast="0" w:name="_2l1mvsox56im" w:id="21"/>
-      <w:bookmarkEnd w:id="21"/>
+      <w:bookmarkStart w:colFirst="0" w:colLast="0" w:name="_ssug50qs1hw1" w:id="23"/>
+      <w:bookmarkEnd w:id="23"/>
       <w:r>
         <w:rPr>
           <w:b w:val="1"/>
@@ -17224,7 +17258,7 @@
           <w:szCs w:val="21"/>
           <w:rtl w:val="0"/>
         </w:rPr>
-        <w:t xml:space="preserve">Las mediciones principales del 15 de octubre de 2026 corresponden a B: Windows 11, Python 3.12.10, PuLP 3.3.0 y CBC 2.10.3, threads = 0 y tolerancias relativas y absolutas de brecha iguales a cero. Se descartó un calentamiento por escenario y de la heurística; después se midieron diez ejecuciones sin flota fija y diez con exactamente tres rutas, con límite de 120 s por llamada. La heurística se midió en las diez repeticiones del caso libre. El cronómetro time.perf_counter() suma construcción, solución y reconstrucción de rutas. En la heurística incluye ahorros, fusiones y 2-opt. Lectura, matriz, validación, certificación y figuras quedan fuera de esos tiempos.</w:t>
+        <w:t xml:space="preserve">Las mediciones se realizaron el 15 de octubre de 2026 en Windows 11, Python 3.12.10, PuLP 3.3.0 y CBC 2.10.3, con threads = 0 y tolerancias relativa y absoluta de brecha iguales a cero. Tras un calentamiento por escenario y de la heurística, se registraron diez ejecuciones sin flota fija y diez con exactamente tres rutas, con límite de 120 s por llamada al solver. La heurística se midió en las diez repeticiones del caso libre. El tiempo exacto comprende construcción del modelo, solución y reconstrucción de rutas; el heurístico comprende ahorros, fusiones y 2-opt. La lectura de datos, la matriz, la validación y las figuras se calcularon fuera del intervalo medido.</w:t>
       </w:r>
     </w:p>
     <w:p>
@@ -17242,12 +17276,11 @@
           <w:szCs w:val="21"/>
           <w:rtl w:val="0"/>
         </w:rPr>
-        <w:t xml:space="preserve">Las repeticiones permiten observar variación temporal; no constituyen diez instancias distintas. Se conservan los tiempos completos en mediciones.csv y se reporta desviación estándar muestral. La medición principal de B y la comparación A/B/C son experimentos separados: sus medias no se combinan. Los tiempos históricos de A se mantienen como evidencia en el repositorio, pero no se utilizan en las tablas y la Figura 5 de esta versión. Un equipo o momento diferente puede producir otros tiempos aun con las mismas rutas y contadores.</w:t>
+        <w:t xml:space="preserve">La Tabla 8 recoge las mediciones individuales y la Tabla 9 resume el caso sin flota fija mediante media, mediana y desviación estándar muestral. Las repeticiones corresponden a una misma instancia y permiten describir la variación temporal en este equipo.</w:t>
       </w:r>
     </w:p>
     <w:p>
       <w:pPr>
-        <w:keepNext w:val="1"/>
         <w:spacing w:after="180" w:before="180" w:line="252.00000000000003" w:lineRule="auto"/>
         <w:rPr>
           <w:b w:val="1"/>
@@ -17264,7 +17297,7 @@
           <w:szCs w:val="18"/>
           <w:rtl w:val="0"/>
         </w:rPr>
-        <w:t xml:space="preserve">Tabla 8. Diez mediciones del modelo B y la heurística, en milisegundos.</w:t>
+        <w:t xml:space="preserve">Tabla 8. Diez mediciones del modelo exacto y de la heurística, en milisegundos.</w:t>
       </w:r>
     </w:p>
     <w:tbl>
@@ -17284,25 +17317,25 @@
         <w:tblLook w:val="0600"/>
       </w:tblPr>
       <w:tblGrid>
+        <w:gridCol w:w="1425"/>
+        <w:gridCol w:w="2310"/>
         <w:gridCol w:w="1380"/>
-        <w:gridCol w:w="1560"/>
-        <w:gridCol w:w="2385"/>
-        <w:gridCol w:w="1410"/>
-        <w:gridCol w:w="2160"/>
+        <w:gridCol w:w="1455"/>
+        <w:gridCol w:w="2325"/>
         <w:tblGridChange w:id="0">
           <w:tblGrid>
+            <w:gridCol w:w="1425"/>
+            <w:gridCol w:w="2310"/>
             <w:gridCol w:w="1380"/>
-            <w:gridCol w:w="1560"/>
-            <w:gridCol w:w="2385"/>
-            <w:gridCol w:w="1410"/>
-            <w:gridCol w:w="2160"/>
+            <w:gridCol w:w="1455"/>
+            <w:gridCol w:w="2325"/>
           </w:tblGrid>
         </w:tblGridChange>
       </w:tblGrid>
       <w:tr>
         <w:trPr>
           <w:cantSplit w:val="0"/>
-          <w:trHeight w:val="375" w:hRule="atLeast"/>
+          <w:trHeight w:val="315" w:hRule="atLeast"/>
           <w:tblHeader w:val="0"/>
         </w:trPr>
         <w:tc>
@@ -17315,10 +17348,10 @@
             </w:tcBorders>
             <w:shd w:fill="e9eff3" w:val="clear"/>
             <w:tcMar>
-              <w:top w:w="80.0" w:type="dxa"/>
-              <w:left w:w="80.0" w:type="dxa"/>
-              <w:bottom w:w="80.0" w:type="dxa"/>
-              <w:right w:w="80.0" w:type="dxa"/>
+              <w:top w:w="40.0" w:type="dxa"/>
+              <w:left w:w="40.0" w:type="dxa"/>
+              <w:bottom w:w="40.0" w:type="dxa"/>
+              <w:right w:w="40.0" w:type="dxa"/>
             </w:tcMar>
             <w:vAlign w:val="top"/>
           </w:tcPr>
@@ -17358,10 +17391,10 @@
             </w:tcBorders>
             <w:shd w:fill="e9eff3" w:val="clear"/>
             <w:tcMar>
-              <w:top w:w="80.0" w:type="dxa"/>
-              <w:left w:w="80.0" w:type="dxa"/>
-              <w:bottom w:w="80.0" w:type="dxa"/>
-              <w:right w:w="80.0" w:type="dxa"/>
+              <w:top w:w="40.0" w:type="dxa"/>
+              <w:left w:w="40.0" w:type="dxa"/>
+              <w:bottom w:w="40.0" w:type="dxa"/>
+              <w:right w:w="40.0" w:type="dxa"/>
             </w:tcMar>
             <w:vAlign w:val="top"/>
           </w:tcPr>
@@ -17382,7 +17415,7 @@
                 <w:szCs w:val="18"/>
                 <w:rtl w:val="0"/>
               </w:rPr>
-              <w:t xml:space="preserve">B libre total</w:t>
+              <w:t xml:space="preserve">Exacto libre total</w:t>
             </w:r>
             <w:r>
               <w:rPr>
@@ -17401,10 +17434,10 @@
             </w:tcBorders>
             <w:shd w:fill="e9eff3" w:val="clear"/>
             <w:tcMar>
-              <w:top w:w="80.0" w:type="dxa"/>
-              <w:left w:w="80.0" w:type="dxa"/>
-              <w:bottom w:w="80.0" w:type="dxa"/>
-              <w:right w:w="80.0" w:type="dxa"/>
+              <w:top w:w="40.0" w:type="dxa"/>
+              <w:left w:w="40.0" w:type="dxa"/>
+              <w:bottom w:w="40.0" w:type="dxa"/>
+              <w:right w:w="40.0" w:type="dxa"/>
             </w:tcMar>
             <w:vAlign w:val="top"/>
           </w:tcPr>
@@ -17425,7 +17458,7 @@
                 <w:szCs w:val="18"/>
                 <w:rtl w:val="0"/>
               </w:rPr>
-              <w:t xml:space="preserve">Llamada CBC libre</w:t>
+              <w:t xml:space="preserve">CBC libre</w:t>
             </w:r>
             <w:r>
               <w:rPr>
@@ -17444,10 +17477,10 @@
             </w:tcBorders>
             <w:shd w:fill="e9eff3" w:val="clear"/>
             <w:tcMar>
-              <w:top w:w="80.0" w:type="dxa"/>
-              <w:left w:w="80.0" w:type="dxa"/>
-              <w:bottom w:w="80.0" w:type="dxa"/>
-              <w:right w:w="80.0" w:type="dxa"/>
+              <w:top w:w="40.0" w:type="dxa"/>
+              <w:left w:w="40.0" w:type="dxa"/>
+              <w:bottom w:w="40.0" w:type="dxa"/>
+              <w:right w:w="40.0" w:type="dxa"/>
             </w:tcMar>
             <w:vAlign w:val="top"/>
           </w:tcPr>
@@ -17487,10 +17520,10 @@
             </w:tcBorders>
             <w:shd w:fill="e9eff3" w:val="clear"/>
             <w:tcMar>
-              <w:top w:w="80.0" w:type="dxa"/>
-              <w:left w:w="80.0" w:type="dxa"/>
-              <w:bottom w:w="80.0" w:type="dxa"/>
-              <w:right w:w="80.0" w:type="dxa"/>
+              <w:top w:w="40.0" w:type="dxa"/>
+              <w:left w:w="40.0" w:type="dxa"/>
+              <w:bottom w:w="40.0" w:type="dxa"/>
+              <w:right w:w="40.0" w:type="dxa"/>
             </w:tcMar>
             <w:vAlign w:val="top"/>
           </w:tcPr>
@@ -17511,7 +17544,7 @@
                 <w:szCs w:val="18"/>
                 <w:rtl w:val="0"/>
               </w:rPr>
-              <w:t xml:space="preserve">B tres rutas total</w:t>
+              <w:t xml:space="preserve">Exacto tres rutas</w:t>
             </w:r>
             <w:r>
               <w:rPr>
@@ -17524,7 +17557,7 @@
       <w:tr>
         <w:trPr>
           <w:cantSplit w:val="0"/>
-          <w:trHeight w:val="375" w:hRule="atLeast"/>
+          <w:trHeight w:val="315" w:hRule="atLeast"/>
           <w:tblHeader w:val="0"/>
         </w:trPr>
         <w:tc>
@@ -17537,10 +17570,10 @@
             </w:tcBorders>
             <w:shd w:fill="ffffff" w:val="clear"/>
             <w:tcMar>
-              <w:top w:w="80.0" w:type="dxa"/>
-              <w:left w:w="80.0" w:type="dxa"/>
-              <w:bottom w:w="80.0" w:type="dxa"/>
-              <w:right w:w="80.0" w:type="dxa"/>
+              <w:top w:w="40.0" w:type="dxa"/>
+              <w:left w:w="40.0" w:type="dxa"/>
+              <w:bottom w:w="40.0" w:type="dxa"/>
+              <w:right w:w="40.0" w:type="dxa"/>
             </w:tcMar>
             <w:vAlign w:val="top"/>
           </w:tcPr>
@@ -17578,10 +17611,10 @@
             </w:tcBorders>
             <w:shd w:fill="ffffff" w:val="clear"/>
             <w:tcMar>
-              <w:top w:w="80.0" w:type="dxa"/>
-              <w:left w:w="80.0" w:type="dxa"/>
-              <w:bottom w:w="80.0" w:type="dxa"/>
-              <w:right w:w="80.0" w:type="dxa"/>
+              <w:top w:w="40.0" w:type="dxa"/>
+              <w:left w:w="40.0" w:type="dxa"/>
+              <w:bottom w:w="40.0" w:type="dxa"/>
+              <w:right w:w="40.0" w:type="dxa"/>
             </w:tcMar>
             <w:vAlign w:val="top"/>
           </w:tcPr>
@@ -17619,10 +17652,10 @@
             </w:tcBorders>
             <w:shd w:fill="ffffff" w:val="clear"/>
             <w:tcMar>
-              <w:top w:w="80.0" w:type="dxa"/>
-              <w:left w:w="80.0" w:type="dxa"/>
-              <w:bottom w:w="80.0" w:type="dxa"/>
-              <w:right w:w="80.0" w:type="dxa"/>
+              <w:top w:w="40.0" w:type="dxa"/>
+              <w:left w:w="40.0" w:type="dxa"/>
+              <w:bottom w:w="40.0" w:type="dxa"/>
+              <w:right w:w="40.0" w:type="dxa"/>
             </w:tcMar>
             <w:vAlign w:val="top"/>
           </w:tcPr>
@@ -17660,10 +17693,10 @@
             </w:tcBorders>
             <w:shd w:fill="ffffff" w:val="clear"/>
             <w:tcMar>
-              <w:top w:w="80.0" w:type="dxa"/>
-              <w:left w:w="80.0" w:type="dxa"/>
-              <w:bottom w:w="80.0" w:type="dxa"/>
-              <w:right w:w="80.0" w:type="dxa"/>
+              <w:top w:w="40.0" w:type="dxa"/>
+              <w:left w:w="40.0" w:type="dxa"/>
+              <w:bottom w:w="40.0" w:type="dxa"/>
+              <w:right w:w="40.0" w:type="dxa"/>
             </w:tcMar>
             <w:vAlign w:val="top"/>
           </w:tcPr>
@@ -17701,10 +17734,10 @@
             </w:tcBorders>
             <w:shd w:fill="ffffff" w:val="clear"/>
             <w:tcMar>
-              <w:top w:w="80.0" w:type="dxa"/>
-              <w:left w:w="80.0" w:type="dxa"/>
-              <w:bottom w:w="80.0" w:type="dxa"/>
-              <w:right w:w="80.0" w:type="dxa"/>
+              <w:top w:w="40.0" w:type="dxa"/>
+              <w:left w:w="40.0" w:type="dxa"/>
+              <w:bottom w:w="40.0" w:type="dxa"/>
+              <w:right w:w="40.0" w:type="dxa"/>
             </w:tcMar>
             <w:vAlign w:val="top"/>
           </w:tcPr>
@@ -17736,7 +17769,7 @@
       <w:tr>
         <w:trPr>
           <w:cantSplit w:val="0"/>
-          <w:trHeight w:val="375" w:hRule="atLeast"/>
+          <w:trHeight w:val="315" w:hRule="atLeast"/>
           <w:tblHeader w:val="0"/>
         </w:trPr>
         <w:tc>
@@ -17749,10 +17782,10 @@
             </w:tcBorders>
             <w:shd w:fill="ffffff" w:val="clear"/>
             <w:tcMar>
-              <w:top w:w="80.0" w:type="dxa"/>
-              <w:left w:w="80.0" w:type="dxa"/>
-              <w:bottom w:w="80.0" w:type="dxa"/>
-              <w:right w:w="80.0" w:type="dxa"/>
+              <w:top w:w="40.0" w:type="dxa"/>
+              <w:left w:w="40.0" w:type="dxa"/>
+              <w:bottom w:w="40.0" w:type="dxa"/>
+              <w:right w:w="40.0" w:type="dxa"/>
             </w:tcMar>
             <w:vAlign w:val="top"/>
           </w:tcPr>
@@ -17790,10 +17823,10 @@
             </w:tcBorders>
             <w:shd w:fill="ffffff" w:val="clear"/>
             <w:tcMar>
-              <w:top w:w="80.0" w:type="dxa"/>
-              <w:left w:w="80.0" w:type="dxa"/>
-              <w:bottom w:w="80.0" w:type="dxa"/>
-              <w:right w:w="80.0" w:type="dxa"/>
+              <w:top w:w="40.0" w:type="dxa"/>
+              <w:left w:w="40.0" w:type="dxa"/>
+              <w:bottom w:w="40.0" w:type="dxa"/>
+              <w:right w:w="40.0" w:type="dxa"/>
             </w:tcMar>
             <w:vAlign w:val="top"/>
           </w:tcPr>
@@ -17831,10 +17864,10 @@
             </w:tcBorders>
             <w:shd w:fill="ffffff" w:val="clear"/>
             <w:tcMar>
-              <w:top w:w="80.0" w:type="dxa"/>
-              <w:left w:w="80.0" w:type="dxa"/>
-              <w:bottom w:w="80.0" w:type="dxa"/>
-              <w:right w:w="80.0" w:type="dxa"/>
+              <w:top w:w="40.0" w:type="dxa"/>
+              <w:left w:w="40.0" w:type="dxa"/>
+              <w:bottom w:w="40.0" w:type="dxa"/>
+              <w:right w:w="40.0" w:type="dxa"/>
             </w:tcMar>
             <w:vAlign w:val="top"/>
           </w:tcPr>
@@ -17872,10 +17905,10 @@
             </w:tcBorders>
             <w:shd w:fill="ffffff" w:val="clear"/>
             <w:tcMar>
-              <w:top w:w="80.0" w:type="dxa"/>
-              <w:left w:w="80.0" w:type="dxa"/>
-              <w:bottom w:w="80.0" w:type="dxa"/>
-              <w:right w:w="80.0" w:type="dxa"/>
+              <w:top w:w="40.0" w:type="dxa"/>
+              <w:left w:w="40.0" w:type="dxa"/>
+              <w:bottom w:w="40.0" w:type="dxa"/>
+              <w:right w:w="40.0" w:type="dxa"/>
             </w:tcMar>
             <w:vAlign w:val="top"/>
           </w:tcPr>
@@ -17913,10 +17946,10 @@
             </w:tcBorders>
             <w:shd w:fill="ffffff" w:val="clear"/>
             <w:tcMar>
-              <w:top w:w="80.0" w:type="dxa"/>
-              <w:left w:w="80.0" w:type="dxa"/>
-              <w:bottom w:w="80.0" w:type="dxa"/>
-              <w:right w:w="80.0" w:type="dxa"/>
+              <w:top w:w="40.0" w:type="dxa"/>
+              <w:left w:w="40.0" w:type="dxa"/>
+              <w:bottom w:w="40.0" w:type="dxa"/>
+              <w:right w:w="40.0" w:type="dxa"/>
             </w:tcMar>
             <w:vAlign w:val="top"/>
           </w:tcPr>
@@ -17948,7 +17981,7 @@
       <w:tr>
         <w:trPr>
           <w:cantSplit w:val="0"/>
-          <w:trHeight w:val="375" w:hRule="atLeast"/>
+          <w:trHeight w:val="315" w:hRule="atLeast"/>
           <w:tblHeader w:val="0"/>
         </w:trPr>
         <w:tc>
@@ -17961,10 +17994,10 @@
             </w:tcBorders>
             <w:shd w:fill="ffffff" w:val="clear"/>
             <w:tcMar>
-              <w:top w:w="80.0" w:type="dxa"/>
-              <w:left w:w="80.0" w:type="dxa"/>
-              <w:bottom w:w="80.0" w:type="dxa"/>
-              <w:right w:w="80.0" w:type="dxa"/>
+              <w:top w:w="40.0" w:type="dxa"/>
+              <w:left w:w="40.0" w:type="dxa"/>
+              <w:bottom w:w="40.0" w:type="dxa"/>
+              <w:right w:w="40.0" w:type="dxa"/>
             </w:tcMar>
             <w:vAlign w:val="top"/>
           </w:tcPr>
@@ -18002,10 +18035,10 @@
             </w:tcBorders>
             <w:shd w:fill="ffffff" w:val="clear"/>
             <w:tcMar>
-              <w:top w:w="80.0" w:type="dxa"/>
-              <w:left w:w="80.0" w:type="dxa"/>
-              <w:bottom w:w="80.0" w:type="dxa"/>
-              <w:right w:w="80.0" w:type="dxa"/>
+              <w:top w:w="40.0" w:type="dxa"/>
+              <w:left w:w="40.0" w:type="dxa"/>
+              <w:bottom w:w="40.0" w:type="dxa"/>
+              <w:right w:w="40.0" w:type="dxa"/>
             </w:tcMar>
             <w:vAlign w:val="top"/>
           </w:tcPr>
@@ -18043,10 +18076,10 @@
             </w:tcBorders>
             <w:shd w:fill="ffffff" w:val="clear"/>
             <w:tcMar>
-              <w:top w:w="80.0" w:type="dxa"/>
-              <w:left w:w="80.0" w:type="dxa"/>
-              <w:bottom w:w="80.0" w:type="dxa"/>
-              <w:right w:w="80.0" w:type="dxa"/>
+              <w:top w:w="40.0" w:type="dxa"/>
+              <w:left w:w="40.0" w:type="dxa"/>
+              <w:bottom w:w="40.0" w:type="dxa"/>
+              <w:right w:w="40.0" w:type="dxa"/>
             </w:tcMar>
             <w:vAlign w:val="top"/>
           </w:tcPr>
@@ -18084,10 +18117,10 @@
             </w:tcBorders>
             <w:shd w:fill="ffffff" w:val="clear"/>
             <w:tcMar>
-              <w:top w:w="80.0" w:type="dxa"/>
-              <w:left w:w="80.0" w:type="dxa"/>
-              <w:bottom w:w="80.0" w:type="dxa"/>
-              <w:right w:w="80.0" w:type="dxa"/>
+              <w:top w:w="40.0" w:type="dxa"/>
+              <w:left w:w="40.0" w:type="dxa"/>
+              <w:bottom w:w="40.0" w:type="dxa"/>
+              <w:right w:w="40.0" w:type="dxa"/>
             </w:tcMar>
             <w:vAlign w:val="top"/>
           </w:tcPr>
@@ -18125,10 +18158,10 @@
             </w:tcBorders>
             <w:shd w:fill="ffffff" w:val="clear"/>
             <w:tcMar>
-              <w:top w:w="80.0" w:type="dxa"/>
-              <w:left w:w="80.0" w:type="dxa"/>
-              <w:bottom w:w="80.0" w:type="dxa"/>
-              <w:right w:w="80.0" w:type="dxa"/>
+              <w:top w:w="40.0" w:type="dxa"/>
+              <w:left w:w="40.0" w:type="dxa"/>
+              <w:bottom w:w="40.0" w:type="dxa"/>
+              <w:right w:w="40.0" w:type="dxa"/>
             </w:tcMar>
             <w:vAlign w:val="top"/>
           </w:tcPr>
@@ -18160,7 +18193,7 @@
       <w:tr>
         <w:trPr>
           <w:cantSplit w:val="0"/>
-          <w:trHeight w:val="375" w:hRule="atLeast"/>
+          <w:trHeight w:val="315" w:hRule="atLeast"/>
           <w:tblHeader w:val="0"/>
         </w:trPr>
         <w:tc>
@@ -18173,10 +18206,10 @@
             </w:tcBorders>
             <w:shd w:fill="ffffff" w:val="clear"/>
             <w:tcMar>
-              <w:top w:w="80.0" w:type="dxa"/>
-              <w:left w:w="80.0" w:type="dxa"/>
-              <w:bottom w:w="80.0" w:type="dxa"/>
-              <w:right w:w="80.0" w:type="dxa"/>
+              <w:top w:w="40.0" w:type="dxa"/>
+              <w:left w:w="40.0" w:type="dxa"/>
+              <w:bottom w:w="40.0" w:type="dxa"/>
+              <w:right w:w="40.0" w:type="dxa"/>
             </w:tcMar>
             <w:vAlign w:val="top"/>
           </w:tcPr>
@@ -18214,10 +18247,10 @@
             </w:tcBorders>
             <w:shd w:fill="ffffff" w:val="clear"/>
             <w:tcMar>
-              <w:top w:w="80.0" w:type="dxa"/>
-              <w:left w:w="80.0" w:type="dxa"/>
-              <w:bottom w:w="80.0" w:type="dxa"/>
-              <w:right w:w="80.0" w:type="dxa"/>
+              <w:top w:w="40.0" w:type="dxa"/>
+              <w:left w:w="40.0" w:type="dxa"/>
+              <w:bottom w:w="40.0" w:type="dxa"/>
+              <w:right w:w="40.0" w:type="dxa"/>
             </w:tcMar>
             <w:vAlign w:val="top"/>
           </w:tcPr>
@@ -18255,10 +18288,10 @@
             </w:tcBorders>
             <w:shd w:fill="ffffff" w:val="clear"/>
             <w:tcMar>
-              <w:top w:w="80.0" w:type="dxa"/>
-              <w:left w:w="80.0" w:type="dxa"/>
-              <w:bottom w:w="80.0" w:type="dxa"/>
-              <w:right w:w="80.0" w:type="dxa"/>
+              <w:top w:w="40.0" w:type="dxa"/>
+              <w:left w:w="40.0" w:type="dxa"/>
+              <w:bottom w:w="40.0" w:type="dxa"/>
+              <w:right w:w="40.0" w:type="dxa"/>
             </w:tcMar>
             <w:vAlign w:val="top"/>
           </w:tcPr>
@@ -18296,10 +18329,10 @@
             </w:tcBorders>
             <w:shd w:fill="ffffff" w:val="clear"/>
             <w:tcMar>
-              <w:top w:w="80.0" w:type="dxa"/>
-              <w:left w:w="80.0" w:type="dxa"/>
-              <w:bottom w:w="80.0" w:type="dxa"/>
-              <w:right w:w="80.0" w:type="dxa"/>
+              <w:top w:w="40.0" w:type="dxa"/>
+              <w:left w:w="40.0" w:type="dxa"/>
+              <w:bottom w:w="40.0" w:type="dxa"/>
+              <w:right w:w="40.0" w:type="dxa"/>
             </w:tcMar>
             <w:vAlign w:val="top"/>
           </w:tcPr>
@@ -18337,10 +18370,10 @@
             </w:tcBorders>
             <w:shd w:fill="ffffff" w:val="clear"/>
             <w:tcMar>
-              <w:top w:w="80.0" w:type="dxa"/>
-              <w:left w:w="80.0" w:type="dxa"/>
-              <w:bottom w:w="80.0" w:type="dxa"/>
-              <w:right w:w="80.0" w:type="dxa"/>
+              <w:top w:w="40.0" w:type="dxa"/>
+              <w:left w:w="40.0" w:type="dxa"/>
+              <w:bottom w:w="40.0" w:type="dxa"/>
+              <w:right w:w="40.0" w:type="dxa"/>
             </w:tcMar>
             <w:vAlign w:val="top"/>
           </w:tcPr>
@@ -18372,7 +18405,7 @@
       <w:tr>
         <w:trPr>
           <w:cantSplit w:val="0"/>
-          <w:trHeight w:val="375" w:hRule="atLeast"/>
+          <w:trHeight w:val="315" w:hRule="atLeast"/>
           <w:tblHeader w:val="0"/>
         </w:trPr>
         <w:tc>
@@ -18385,10 +18418,10 @@
             </w:tcBorders>
             <w:shd w:fill="ffffff" w:val="clear"/>
             <w:tcMar>
-              <w:top w:w="80.0" w:type="dxa"/>
-              <w:left w:w="80.0" w:type="dxa"/>
-              <w:bottom w:w="80.0" w:type="dxa"/>
-              <w:right w:w="80.0" w:type="dxa"/>
+              <w:top w:w="40.0" w:type="dxa"/>
+              <w:left w:w="40.0" w:type="dxa"/>
+              <w:bottom w:w="40.0" w:type="dxa"/>
+              <w:right w:w="40.0" w:type="dxa"/>
             </w:tcMar>
             <w:vAlign w:val="top"/>
           </w:tcPr>
@@ -18426,10 +18459,10 @@
             </w:tcBorders>
             <w:shd w:fill="ffffff" w:val="clear"/>
             <w:tcMar>
-              <w:top w:w="80.0" w:type="dxa"/>
-              <w:left w:w="80.0" w:type="dxa"/>
-              <w:bottom w:w="80.0" w:type="dxa"/>
-              <w:right w:w="80.0" w:type="dxa"/>
+              <w:top w:w="40.0" w:type="dxa"/>
+              <w:left w:w="40.0" w:type="dxa"/>
+              <w:bottom w:w="40.0" w:type="dxa"/>
+              <w:right w:w="40.0" w:type="dxa"/>
             </w:tcMar>
             <w:vAlign w:val="top"/>
           </w:tcPr>
@@ -18467,10 +18500,10 @@
             </w:tcBorders>
             <w:shd w:fill="ffffff" w:val="clear"/>
             <w:tcMar>
-              <w:top w:w="80.0" w:type="dxa"/>
-              <w:left w:w="80.0" w:type="dxa"/>
-              <w:bottom w:w="80.0" w:type="dxa"/>
-              <w:right w:w="80.0" w:type="dxa"/>
+              <w:top w:w="40.0" w:type="dxa"/>
+              <w:left w:w="40.0" w:type="dxa"/>
+              <w:bottom w:w="40.0" w:type="dxa"/>
+              <w:right w:w="40.0" w:type="dxa"/>
             </w:tcMar>
             <w:vAlign w:val="top"/>
           </w:tcPr>
@@ -18508,10 +18541,10 @@
             </w:tcBorders>
             <w:shd w:fill="ffffff" w:val="clear"/>
             <w:tcMar>
-              <w:top w:w="80.0" w:type="dxa"/>
-              <w:left w:w="80.0" w:type="dxa"/>
-              <w:bottom w:w="80.0" w:type="dxa"/>
-              <w:right w:w="80.0" w:type="dxa"/>
+              <w:top w:w="40.0" w:type="dxa"/>
+              <w:left w:w="40.0" w:type="dxa"/>
+              <w:bottom w:w="40.0" w:type="dxa"/>
+              <w:right w:w="40.0" w:type="dxa"/>
             </w:tcMar>
             <w:vAlign w:val="top"/>
           </w:tcPr>
@@ -18549,10 +18582,10 @@
             </w:tcBorders>
             <w:shd w:fill="ffffff" w:val="clear"/>
             <w:tcMar>
-              <w:top w:w="80.0" w:type="dxa"/>
-              <w:left w:w="80.0" w:type="dxa"/>
-              <w:bottom w:w="80.0" w:type="dxa"/>
-              <w:right w:w="80.0" w:type="dxa"/>
+              <w:top w:w="40.0" w:type="dxa"/>
+              <w:left w:w="40.0" w:type="dxa"/>
+              <w:bottom w:w="40.0" w:type="dxa"/>
+              <w:right w:w="40.0" w:type="dxa"/>
             </w:tcMar>
             <w:vAlign w:val="top"/>
           </w:tcPr>
@@ -18584,7 +18617,7 @@
       <w:tr>
         <w:trPr>
           <w:cantSplit w:val="0"/>
-          <w:trHeight w:val="375" w:hRule="atLeast"/>
+          <w:trHeight w:val="315" w:hRule="atLeast"/>
           <w:tblHeader w:val="0"/>
         </w:trPr>
         <w:tc>
@@ -18597,10 +18630,10 @@
             </w:tcBorders>
             <w:shd w:fill="ffffff" w:val="clear"/>
             <w:tcMar>
-              <w:top w:w="80.0" w:type="dxa"/>
-              <w:left w:w="80.0" w:type="dxa"/>
-              <w:bottom w:w="80.0" w:type="dxa"/>
-              <w:right w:w="80.0" w:type="dxa"/>
+              <w:top w:w="40.0" w:type="dxa"/>
+              <w:left w:w="40.0" w:type="dxa"/>
+              <w:bottom w:w="40.0" w:type="dxa"/>
+              <w:right w:w="40.0" w:type="dxa"/>
             </w:tcMar>
             <w:vAlign w:val="top"/>
           </w:tcPr>
@@ -18638,10 +18671,10 @@
             </w:tcBorders>
             <w:shd w:fill="ffffff" w:val="clear"/>
             <w:tcMar>
-              <w:top w:w="80.0" w:type="dxa"/>
-              <w:left w:w="80.0" w:type="dxa"/>
-              <w:bottom w:w="80.0" w:type="dxa"/>
-              <w:right w:w="80.0" w:type="dxa"/>
+              <w:top w:w="40.0" w:type="dxa"/>
+              <w:left w:w="40.0" w:type="dxa"/>
+              <w:bottom w:w="40.0" w:type="dxa"/>
+              <w:right w:w="40.0" w:type="dxa"/>
             </w:tcMar>
             <w:vAlign w:val="top"/>
           </w:tcPr>
@@ -18679,10 +18712,10 @@
             </w:tcBorders>
             <w:shd w:fill="ffffff" w:val="clear"/>
             <w:tcMar>
-              <w:top w:w="80.0" w:type="dxa"/>
-              <w:left w:w="80.0" w:type="dxa"/>
-              <w:bottom w:w="80.0" w:type="dxa"/>
-              <w:right w:w="80.0" w:type="dxa"/>
+              <w:top w:w="40.0" w:type="dxa"/>
+              <w:left w:w="40.0" w:type="dxa"/>
+              <w:bottom w:w="40.0" w:type="dxa"/>
+              <w:right w:w="40.0" w:type="dxa"/>
             </w:tcMar>
             <w:vAlign w:val="top"/>
           </w:tcPr>
@@ -18720,10 +18753,10 @@
             </w:tcBorders>
             <w:shd w:fill="ffffff" w:val="clear"/>
             <w:tcMar>
-              <w:top w:w="80.0" w:type="dxa"/>
-              <w:left w:w="80.0" w:type="dxa"/>
-              <w:bottom w:w="80.0" w:type="dxa"/>
-              <w:right w:w="80.0" w:type="dxa"/>
+              <w:top w:w="40.0" w:type="dxa"/>
+              <w:left w:w="40.0" w:type="dxa"/>
+              <w:bottom w:w="40.0" w:type="dxa"/>
+              <w:right w:w="40.0" w:type="dxa"/>
             </w:tcMar>
             <w:vAlign w:val="top"/>
           </w:tcPr>
@@ -18761,10 +18794,10 @@
             </w:tcBorders>
             <w:shd w:fill="ffffff" w:val="clear"/>
             <w:tcMar>
-              <w:top w:w="80.0" w:type="dxa"/>
-              <w:left w:w="80.0" w:type="dxa"/>
-              <w:bottom w:w="80.0" w:type="dxa"/>
-              <w:right w:w="80.0" w:type="dxa"/>
+              <w:top w:w="40.0" w:type="dxa"/>
+              <w:left w:w="40.0" w:type="dxa"/>
+              <w:bottom w:w="40.0" w:type="dxa"/>
+              <w:right w:w="40.0" w:type="dxa"/>
             </w:tcMar>
             <w:vAlign w:val="top"/>
           </w:tcPr>
@@ -18796,7 +18829,7 @@
       <w:tr>
         <w:trPr>
           <w:cantSplit w:val="0"/>
-          <w:trHeight w:val="375" w:hRule="atLeast"/>
+          <w:trHeight w:val="315" w:hRule="atLeast"/>
           <w:tblHeader w:val="0"/>
         </w:trPr>
         <w:tc>
@@ -18809,10 +18842,10 @@
             </w:tcBorders>
             <w:shd w:fill="ffffff" w:val="clear"/>
             <w:tcMar>
-              <w:top w:w="80.0" w:type="dxa"/>
-              <w:left w:w="80.0" w:type="dxa"/>
-              <w:bottom w:w="80.0" w:type="dxa"/>
-              <w:right w:w="80.0" w:type="dxa"/>
+              <w:top w:w="40.0" w:type="dxa"/>
+              <w:left w:w="40.0" w:type="dxa"/>
+              <w:bottom w:w="40.0" w:type="dxa"/>
+              <w:right w:w="40.0" w:type="dxa"/>
             </w:tcMar>
             <w:vAlign w:val="top"/>
           </w:tcPr>
@@ -18850,10 +18883,10 @@
             </w:tcBorders>
             <w:shd w:fill="ffffff" w:val="clear"/>
             <w:tcMar>
-              <w:top w:w="80.0" w:type="dxa"/>
-              <w:left w:w="80.0" w:type="dxa"/>
-              <w:bottom w:w="80.0" w:type="dxa"/>
-              <w:right w:w="80.0" w:type="dxa"/>
+              <w:top w:w="40.0" w:type="dxa"/>
+              <w:left w:w="40.0" w:type="dxa"/>
+              <w:bottom w:w="40.0" w:type="dxa"/>
+              <w:right w:w="40.0" w:type="dxa"/>
             </w:tcMar>
             <w:vAlign w:val="top"/>
           </w:tcPr>
@@ -18891,10 +18924,10 @@
             </w:tcBorders>
             <w:shd w:fill="ffffff" w:val="clear"/>
             <w:tcMar>
-              <w:top w:w="80.0" w:type="dxa"/>
-              <w:left w:w="80.0" w:type="dxa"/>
-              <w:bottom w:w="80.0" w:type="dxa"/>
-              <w:right w:w="80.0" w:type="dxa"/>
+              <w:top w:w="40.0" w:type="dxa"/>
+              <w:left w:w="40.0" w:type="dxa"/>
+              <w:bottom w:w="40.0" w:type="dxa"/>
+              <w:right w:w="40.0" w:type="dxa"/>
             </w:tcMar>
             <w:vAlign w:val="top"/>
           </w:tcPr>
@@ -18932,10 +18965,10 @@
             </w:tcBorders>
             <w:shd w:fill="ffffff" w:val="clear"/>
             <w:tcMar>
-              <w:top w:w="80.0" w:type="dxa"/>
-              <w:left w:w="80.0" w:type="dxa"/>
-              <w:bottom w:w="80.0" w:type="dxa"/>
-              <w:right w:w="80.0" w:type="dxa"/>
+              <w:top w:w="40.0" w:type="dxa"/>
+              <w:left w:w="40.0" w:type="dxa"/>
+              <w:bottom w:w="40.0" w:type="dxa"/>
+              <w:right w:w="40.0" w:type="dxa"/>
             </w:tcMar>
             <w:vAlign w:val="top"/>
           </w:tcPr>
@@ -18973,10 +19006,10 @@
             </w:tcBorders>
             <w:shd w:fill="ffffff" w:val="clear"/>
             <w:tcMar>
-              <w:top w:w="80.0" w:type="dxa"/>
-              <w:left w:w="80.0" w:type="dxa"/>
-              <w:bottom w:w="80.0" w:type="dxa"/>
-              <w:right w:w="80.0" w:type="dxa"/>
+              <w:top w:w="40.0" w:type="dxa"/>
+              <w:left w:w="40.0" w:type="dxa"/>
+              <w:bottom w:w="40.0" w:type="dxa"/>
+              <w:right w:w="40.0" w:type="dxa"/>
             </w:tcMar>
             <w:vAlign w:val="top"/>
           </w:tcPr>
@@ -19008,7 +19041,7 @@
       <w:tr>
         <w:trPr>
           <w:cantSplit w:val="0"/>
-          <w:trHeight w:val="375" w:hRule="atLeast"/>
+          <w:trHeight w:val="315" w:hRule="atLeast"/>
           <w:tblHeader w:val="0"/>
         </w:trPr>
         <w:tc>
@@ -19021,10 +19054,10 @@
             </w:tcBorders>
             <w:shd w:fill="ffffff" w:val="clear"/>
             <w:tcMar>
-              <w:top w:w="80.0" w:type="dxa"/>
-              <w:left w:w="80.0" w:type="dxa"/>
-              <w:bottom w:w="80.0" w:type="dxa"/>
-              <w:right w:w="80.0" w:type="dxa"/>
+              <w:top w:w="40.0" w:type="dxa"/>
+              <w:left w:w="40.0" w:type="dxa"/>
+              <w:bottom w:w="40.0" w:type="dxa"/>
+              <w:right w:w="40.0" w:type="dxa"/>
             </w:tcMar>
             <w:vAlign w:val="top"/>
           </w:tcPr>
@@ -19062,10 +19095,10 @@
             </w:tcBorders>
             <w:shd w:fill="ffffff" w:val="clear"/>
             <w:tcMar>
-              <w:top w:w="80.0" w:type="dxa"/>
-              <w:left w:w="80.0" w:type="dxa"/>
-              <w:bottom w:w="80.0" w:type="dxa"/>
-              <w:right w:w="80.0" w:type="dxa"/>
+              <w:top w:w="40.0" w:type="dxa"/>
+              <w:left w:w="40.0" w:type="dxa"/>
+              <w:bottom w:w="40.0" w:type="dxa"/>
+              <w:right w:w="40.0" w:type="dxa"/>
             </w:tcMar>
             <w:vAlign w:val="top"/>
           </w:tcPr>
@@ -19103,10 +19136,10 @@
             </w:tcBorders>
             <w:shd w:fill="ffffff" w:val="clear"/>
             <w:tcMar>
-              <w:top w:w="80.0" w:type="dxa"/>
-              <w:left w:w="80.0" w:type="dxa"/>
-              <w:bottom w:w="80.0" w:type="dxa"/>
-              <w:right w:w="80.0" w:type="dxa"/>
+              <w:top w:w="40.0" w:type="dxa"/>
+              <w:left w:w="40.0" w:type="dxa"/>
+              <w:bottom w:w="40.0" w:type="dxa"/>
+              <w:right w:w="40.0" w:type="dxa"/>
             </w:tcMar>
             <w:vAlign w:val="top"/>
           </w:tcPr>
@@ -19144,10 +19177,10 @@
             </w:tcBorders>
             <w:shd w:fill="ffffff" w:val="clear"/>
             <w:tcMar>
-              <w:top w:w="80.0" w:type="dxa"/>
-              <w:left w:w="80.0" w:type="dxa"/>
-              <w:bottom w:w="80.0" w:type="dxa"/>
-              <w:right w:w="80.0" w:type="dxa"/>
+              <w:top w:w="40.0" w:type="dxa"/>
+              <w:left w:w="40.0" w:type="dxa"/>
+              <w:bottom w:w="40.0" w:type="dxa"/>
+              <w:right w:w="40.0" w:type="dxa"/>
             </w:tcMar>
             <w:vAlign w:val="top"/>
           </w:tcPr>
@@ -19185,10 +19218,10 @@
             </w:tcBorders>
             <w:shd w:fill="ffffff" w:val="clear"/>
             <w:tcMar>
-              <w:top w:w="80.0" w:type="dxa"/>
-              <w:left w:w="80.0" w:type="dxa"/>
-              <w:bottom w:w="80.0" w:type="dxa"/>
-              <w:right w:w="80.0" w:type="dxa"/>
+              <w:top w:w="40.0" w:type="dxa"/>
+              <w:left w:w="40.0" w:type="dxa"/>
+              <w:bottom w:w="40.0" w:type="dxa"/>
+              <w:right w:w="40.0" w:type="dxa"/>
             </w:tcMar>
             <w:vAlign w:val="top"/>
           </w:tcPr>
@@ -19220,7 +19253,7 @@
       <w:tr>
         <w:trPr>
           <w:cantSplit w:val="0"/>
-          <w:trHeight w:val="375" w:hRule="atLeast"/>
+          <w:trHeight w:val="315" w:hRule="atLeast"/>
           <w:tblHeader w:val="0"/>
         </w:trPr>
         <w:tc>
@@ -19233,10 +19266,10 @@
             </w:tcBorders>
             <w:shd w:fill="ffffff" w:val="clear"/>
             <w:tcMar>
-              <w:top w:w="80.0" w:type="dxa"/>
-              <w:left w:w="80.0" w:type="dxa"/>
-              <w:bottom w:w="80.0" w:type="dxa"/>
-              <w:right w:w="80.0" w:type="dxa"/>
+              <w:top w:w="40.0" w:type="dxa"/>
+              <w:left w:w="40.0" w:type="dxa"/>
+              <w:bottom w:w="40.0" w:type="dxa"/>
+              <w:right w:w="40.0" w:type="dxa"/>
             </w:tcMar>
             <w:vAlign w:val="top"/>
           </w:tcPr>
@@ -19274,10 +19307,10 @@
             </w:tcBorders>
             <w:shd w:fill="ffffff" w:val="clear"/>
             <w:tcMar>
-              <w:top w:w="80.0" w:type="dxa"/>
-              <w:left w:w="80.0" w:type="dxa"/>
-              <w:bottom w:w="80.0" w:type="dxa"/>
-              <w:right w:w="80.0" w:type="dxa"/>
+              <w:top w:w="40.0" w:type="dxa"/>
+              <w:left w:w="40.0" w:type="dxa"/>
+              <w:bottom w:w="40.0" w:type="dxa"/>
+              <w:right w:w="40.0" w:type="dxa"/>
             </w:tcMar>
             <w:vAlign w:val="top"/>
           </w:tcPr>
@@ -19315,10 +19348,10 @@
             </w:tcBorders>
             <w:shd w:fill="ffffff" w:val="clear"/>
             <w:tcMar>
-              <w:top w:w="80.0" w:type="dxa"/>
-              <w:left w:w="80.0" w:type="dxa"/>
-              <w:bottom w:w="80.0" w:type="dxa"/>
-              <w:right w:w="80.0" w:type="dxa"/>
+              <w:top w:w="40.0" w:type="dxa"/>
+              <w:left w:w="40.0" w:type="dxa"/>
+              <w:bottom w:w="40.0" w:type="dxa"/>
+              <w:right w:w="40.0" w:type="dxa"/>
             </w:tcMar>
             <w:vAlign w:val="top"/>
           </w:tcPr>
@@ -19356,10 +19389,10 @@
             </w:tcBorders>
             <w:shd w:fill="ffffff" w:val="clear"/>
             <w:tcMar>
-              <w:top w:w="80.0" w:type="dxa"/>
-              <w:left w:w="80.0" w:type="dxa"/>
-              <w:bottom w:w="80.0" w:type="dxa"/>
-              <w:right w:w="80.0" w:type="dxa"/>
+              <w:top w:w="40.0" w:type="dxa"/>
+              <w:left w:w="40.0" w:type="dxa"/>
+              <w:bottom w:w="40.0" w:type="dxa"/>
+              <w:right w:w="40.0" w:type="dxa"/>
             </w:tcMar>
             <w:vAlign w:val="top"/>
           </w:tcPr>
@@ -19397,10 +19430,10 @@
             </w:tcBorders>
             <w:shd w:fill="ffffff" w:val="clear"/>
             <w:tcMar>
-              <w:top w:w="80.0" w:type="dxa"/>
-              <w:left w:w="80.0" w:type="dxa"/>
-              <w:bottom w:w="80.0" w:type="dxa"/>
-              <w:right w:w="80.0" w:type="dxa"/>
+              <w:top w:w="40.0" w:type="dxa"/>
+              <w:left w:w="40.0" w:type="dxa"/>
+              <w:bottom w:w="40.0" w:type="dxa"/>
+              <w:right w:w="40.0" w:type="dxa"/>
             </w:tcMar>
             <w:vAlign w:val="top"/>
           </w:tcPr>
@@ -19432,7 +19465,7 @@
       <w:tr>
         <w:trPr>
           <w:cantSplit w:val="0"/>
-          <w:trHeight w:val="375" w:hRule="atLeast"/>
+          <w:trHeight w:val="315" w:hRule="atLeast"/>
           <w:tblHeader w:val="0"/>
         </w:trPr>
         <w:tc>
@@ -19445,10 +19478,10 @@
             </w:tcBorders>
             <w:shd w:fill="ffffff" w:val="clear"/>
             <w:tcMar>
-              <w:top w:w="80.0" w:type="dxa"/>
-              <w:left w:w="80.0" w:type="dxa"/>
-              <w:bottom w:w="80.0" w:type="dxa"/>
-              <w:right w:w="80.0" w:type="dxa"/>
+              <w:top w:w="40.0" w:type="dxa"/>
+              <w:left w:w="40.0" w:type="dxa"/>
+              <w:bottom w:w="40.0" w:type="dxa"/>
+              <w:right w:w="40.0" w:type="dxa"/>
             </w:tcMar>
             <w:vAlign w:val="top"/>
           </w:tcPr>
@@ -19486,10 +19519,10 @@
             </w:tcBorders>
             <w:shd w:fill="ffffff" w:val="clear"/>
             <w:tcMar>
-              <w:top w:w="80.0" w:type="dxa"/>
-              <w:left w:w="80.0" w:type="dxa"/>
-              <w:bottom w:w="80.0" w:type="dxa"/>
-              <w:right w:w="80.0" w:type="dxa"/>
+              <w:top w:w="40.0" w:type="dxa"/>
+              <w:left w:w="40.0" w:type="dxa"/>
+              <w:bottom w:w="40.0" w:type="dxa"/>
+              <w:right w:w="40.0" w:type="dxa"/>
             </w:tcMar>
             <w:vAlign w:val="top"/>
           </w:tcPr>
@@ -19527,10 +19560,10 @@
             </w:tcBorders>
             <w:shd w:fill="ffffff" w:val="clear"/>
             <w:tcMar>
-              <w:top w:w="80.0" w:type="dxa"/>
-              <w:left w:w="80.0" w:type="dxa"/>
-              <w:bottom w:w="80.0" w:type="dxa"/>
-              <w:right w:w="80.0" w:type="dxa"/>
+              <w:top w:w="40.0" w:type="dxa"/>
+              <w:left w:w="40.0" w:type="dxa"/>
+              <w:bottom w:w="40.0" w:type="dxa"/>
+              <w:right w:w="40.0" w:type="dxa"/>
             </w:tcMar>
             <w:vAlign w:val="top"/>
           </w:tcPr>
@@ -19568,10 +19601,10 @@
             </w:tcBorders>
             <w:shd w:fill="ffffff" w:val="clear"/>
             <w:tcMar>
-              <w:top w:w="80.0" w:type="dxa"/>
-              <w:left w:w="80.0" w:type="dxa"/>
-              <w:bottom w:w="80.0" w:type="dxa"/>
-              <w:right w:w="80.0" w:type="dxa"/>
+              <w:top w:w="40.0" w:type="dxa"/>
+              <w:left w:w="40.0" w:type="dxa"/>
+              <w:bottom w:w="40.0" w:type="dxa"/>
+              <w:right w:w="40.0" w:type="dxa"/>
             </w:tcMar>
             <w:vAlign w:val="top"/>
           </w:tcPr>
@@ -19609,10 +19642,10 @@
             </w:tcBorders>
             <w:shd w:fill="ffffff" w:val="clear"/>
             <w:tcMar>
-              <w:top w:w="80.0" w:type="dxa"/>
-              <w:left w:w="80.0" w:type="dxa"/>
-              <w:bottom w:w="80.0" w:type="dxa"/>
-              <w:right w:w="80.0" w:type="dxa"/>
+              <w:top w:w="40.0" w:type="dxa"/>
+              <w:left w:w="40.0" w:type="dxa"/>
+              <w:bottom w:w="40.0" w:type="dxa"/>
+              <w:right w:w="40.0" w:type="dxa"/>
             </w:tcMar>
             <w:vAlign w:val="top"/>
           </w:tcPr>
@@ -19644,7 +19677,6 @@
     </w:tbl>
     <w:p>
       <w:pPr>
-        <w:keepNext w:val="1"/>
         <w:spacing w:after="180" w:before="180" w:line="252.00000000000003" w:lineRule="auto"/>
         <w:rPr>
           <w:b w:val="1"/>
@@ -19661,7 +19693,7 @@
           <w:szCs w:val="18"/>
           <w:rtl w:val="0"/>
         </w:rPr>
-        <w:t xml:space="preserve">Tabla 9. Resumen del caso libre del modelo B frente a la heurística.</w:t>
+        <w:t xml:space="preserve">Tabla 9. Resumen del modelo exacto y de la heurística sin flota fija.</w:t>
       </w:r>
     </w:p>
     <w:tbl>
@@ -19681,21 +19713,21 @@
         <w:tblLook w:val="0600"/>
       </w:tblPr>
       <w:tblGrid>
-        <w:gridCol w:w="4935"/>
-        <w:gridCol w:w="2175"/>
-        <w:gridCol w:w="1785"/>
+        <w:gridCol w:w="5235"/>
+        <w:gridCol w:w="1830"/>
+        <w:gridCol w:w="1830"/>
         <w:tblGridChange w:id="0">
           <w:tblGrid>
-            <w:gridCol w:w="4935"/>
-            <w:gridCol w:w="2175"/>
-            <w:gridCol w:w="1785"/>
+            <w:gridCol w:w="5235"/>
+            <w:gridCol w:w="1830"/>
+            <w:gridCol w:w="1830"/>
           </w:tblGrid>
         </w:tblGridChange>
       </w:tblGrid>
       <w:tr>
         <w:trPr>
           <w:cantSplit w:val="0"/>
-          <w:trHeight w:val="375" w:hRule="atLeast"/>
+          <w:trHeight w:val="315" w:hRule="atLeast"/>
           <w:tblHeader w:val="0"/>
         </w:trPr>
         <w:tc>
@@ -19708,10 +19740,10 @@
             </w:tcBorders>
             <w:shd w:fill="e9eff3" w:val="clear"/>
             <w:tcMar>
-              <w:top w:w="80.0" w:type="dxa"/>
-              <w:left w:w="80.0" w:type="dxa"/>
-              <w:bottom w:w="80.0" w:type="dxa"/>
-              <w:right w:w="80.0" w:type="dxa"/>
+              <w:top w:w="40.0" w:type="dxa"/>
+              <w:left w:w="40.0" w:type="dxa"/>
+              <w:bottom w:w="40.0" w:type="dxa"/>
+              <w:right w:w="40.0" w:type="dxa"/>
             </w:tcMar>
             <w:vAlign w:val="top"/>
           </w:tcPr>
@@ -19751,10 +19783,10 @@
             </w:tcBorders>
             <w:shd w:fill="e9eff3" w:val="clear"/>
             <w:tcMar>
-              <w:top w:w="80.0" w:type="dxa"/>
-              <w:left w:w="80.0" w:type="dxa"/>
-              <w:bottom w:w="80.0" w:type="dxa"/>
-              <w:right w:w="80.0" w:type="dxa"/>
+              <w:top w:w="40.0" w:type="dxa"/>
+              <w:left w:w="40.0" w:type="dxa"/>
+              <w:bottom w:w="40.0" w:type="dxa"/>
+              <w:right w:w="40.0" w:type="dxa"/>
             </w:tcMar>
             <w:vAlign w:val="top"/>
           </w:tcPr>
@@ -19775,7 +19807,7 @@
                 <w:szCs w:val="18"/>
                 <w:rtl w:val="0"/>
               </w:rPr>
-              <w:t xml:space="preserve">Exacto B libre</w:t>
+              <w:t xml:space="preserve">Exacto</w:t>
             </w:r>
             <w:r>
               <w:rPr>
@@ -19794,10 +19826,10 @@
             </w:tcBorders>
             <w:shd w:fill="e9eff3" w:val="clear"/>
             <w:tcMar>
-              <w:top w:w="80.0" w:type="dxa"/>
-              <w:left w:w="80.0" w:type="dxa"/>
-              <w:bottom w:w="80.0" w:type="dxa"/>
-              <w:right w:w="80.0" w:type="dxa"/>
+              <w:top w:w="40.0" w:type="dxa"/>
+              <w:left w:w="40.0" w:type="dxa"/>
+              <w:bottom w:w="40.0" w:type="dxa"/>
+              <w:right w:w="40.0" w:type="dxa"/>
             </w:tcMar>
             <w:vAlign w:val="top"/>
           </w:tcPr>
@@ -19831,7 +19863,7 @@
       <w:tr>
         <w:trPr>
           <w:cantSplit w:val="0"/>
-          <w:trHeight w:val="375" w:hRule="atLeast"/>
+          <w:trHeight w:val="315" w:hRule="atLeast"/>
           <w:tblHeader w:val="0"/>
         </w:trPr>
         <w:tc>
@@ -19844,10 +19876,10 @@
             </w:tcBorders>
             <w:shd w:fill="ffffff" w:val="clear"/>
             <w:tcMar>
-              <w:top w:w="80.0" w:type="dxa"/>
-              <w:left w:w="80.0" w:type="dxa"/>
-              <w:bottom w:w="80.0" w:type="dxa"/>
-              <w:right w:w="80.0" w:type="dxa"/>
+              <w:top w:w="40.0" w:type="dxa"/>
+              <w:left w:w="40.0" w:type="dxa"/>
+              <w:bottom w:w="40.0" w:type="dxa"/>
+              <w:right w:w="40.0" w:type="dxa"/>
             </w:tcMar>
             <w:vAlign w:val="top"/>
           </w:tcPr>
@@ -19885,10 +19917,10 @@
             </w:tcBorders>
             <w:shd w:fill="ffffff" w:val="clear"/>
             <w:tcMar>
-              <w:top w:w="80.0" w:type="dxa"/>
-              <w:left w:w="80.0" w:type="dxa"/>
-              <w:bottom w:w="80.0" w:type="dxa"/>
-              <w:right w:w="80.0" w:type="dxa"/>
+              <w:top w:w="40.0" w:type="dxa"/>
+              <w:left w:w="40.0" w:type="dxa"/>
+              <w:bottom w:w="40.0" w:type="dxa"/>
+              <w:right w:w="40.0" w:type="dxa"/>
             </w:tcMar>
             <w:vAlign w:val="top"/>
           </w:tcPr>
@@ -19926,10 +19958,10 @@
             </w:tcBorders>
             <w:shd w:fill="ffffff" w:val="clear"/>
             <w:tcMar>
-              <w:top w:w="80.0" w:type="dxa"/>
-              <w:left w:w="80.0" w:type="dxa"/>
-              <w:bottom w:w="80.0" w:type="dxa"/>
-              <w:right w:w="80.0" w:type="dxa"/>
+              <w:top w:w="40.0" w:type="dxa"/>
+              <w:left w:w="40.0" w:type="dxa"/>
+              <w:bottom w:w="40.0" w:type="dxa"/>
+              <w:right w:w="40.0" w:type="dxa"/>
             </w:tcMar>
             <w:vAlign w:val="top"/>
           </w:tcPr>
@@ -19961,7 +19993,7 @@
       <w:tr>
         <w:trPr>
           <w:cantSplit w:val="0"/>
-          <w:trHeight w:val="375" w:hRule="atLeast"/>
+          <w:trHeight w:val="315" w:hRule="atLeast"/>
           <w:tblHeader w:val="0"/>
         </w:trPr>
         <w:tc>
@@ -19974,10 +20006,10 @@
             </w:tcBorders>
             <w:shd w:fill="ffffff" w:val="clear"/>
             <w:tcMar>
-              <w:top w:w="80.0" w:type="dxa"/>
-              <w:left w:w="80.0" w:type="dxa"/>
-              <w:bottom w:w="80.0" w:type="dxa"/>
-              <w:right w:w="80.0" w:type="dxa"/>
+              <w:top w:w="40.0" w:type="dxa"/>
+              <w:left w:w="40.0" w:type="dxa"/>
+              <w:bottom w:w="40.0" w:type="dxa"/>
+              <w:right w:w="40.0" w:type="dxa"/>
             </w:tcMar>
             <w:vAlign w:val="top"/>
           </w:tcPr>
@@ -20015,10 +20047,10 @@
             </w:tcBorders>
             <w:shd w:fill="ffffff" w:val="clear"/>
             <w:tcMar>
-              <w:top w:w="80.0" w:type="dxa"/>
-              <w:left w:w="80.0" w:type="dxa"/>
-              <w:bottom w:w="80.0" w:type="dxa"/>
-              <w:right w:w="80.0" w:type="dxa"/>
+              <w:top w:w="40.0" w:type="dxa"/>
+              <w:left w:w="40.0" w:type="dxa"/>
+              <w:bottom w:w="40.0" w:type="dxa"/>
+              <w:right w:w="40.0" w:type="dxa"/>
             </w:tcMar>
             <w:vAlign w:val="top"/>
           </w:tcPr>
@@ -20056,10 +20088,10 @@
             </w:tcBorders>
             <w:shd w:fill="ffffff" w:val="clear"/>
             <w:tcMar>
-              <w:top w:w="80.0" w:type="dxa"/>
-              <w:left w:w="80.0" w:type="dxa"/>
-              <w:bottom w:w="80.0" w:type="dxa"/>
-              <w:right w:w="80.0" w:type="dxa"/>
+              <w:top w:w="40.0" w:type="dxa"/>
+              <w:left w:w="40.0" w:type="dxa"/>
+              <w:bottom w:w="40.0" w:type="dxa"/>
+              <w:right w:w="40.0" w:type="dxa"/>
             </w:tcMar>
             <w:vAlign w:val="top"/>
           </w:tcPr>
@@ -20091,7 +20123,7 @@
       <w:tr>
         <w:trPr>
           <w:cantSplit w:val="0"/>
-          <w:trHeight w:val="375" w:hRule="atLeast"/>
+          <w:trHeight w:val="315" w:hRule="atLeast"/>
           <w:tblHeader w:val="0"/>
         </w:trPr>
         <w:tc>
@@ -20104,10 +20136,10 @@
             </w:tcBorders>
             <w:shd w:fill="ffffff" w:val="clear"/>
             <w:tcMar>
-              <w:top w:w="80.0" w:type="dxa"/>
-              <w:left w:w="80.0" w:type="dxa"/>
-              <w:bottom w:w="80.0" w:type="dxa"/>
-              <w:right w:w="80.0" w:type="dxa"/>
+              <w:top w:w="40.0" w:type="dxa"/>
+              <w:left w:w="40.0" w:type="dxa"/>
+              <w:bottom w:w="40.0" w:type="dxa"/>
+              <w:right w:w="40.0" w:type="dxa"/>
             </w:tcMar>
             <w:vAlign w:val="top"/>
           </w:tcPr>
@@ -20145,10 +20177,10 @@
             </w:tcBorders>
             <w:shd w:fill="ffffff" w:val="clear"/>
             <w:tcMar>
-              <w:top w:w="80.0" w:type="dxa"/>
-              <w:left w:w="80.0" w:type="dxa"/>
-              <w:bottom w:w="80.0" w:type="dxa"/>
-              <w:right w:w="80.0" w:type="dxa"/>
+              <w:top w:w="40.0" w:type="dxa"/>
+              <w:left w:w="40.0" w:type="dxa"/>
+              <w:bottom w:w="40.0" w:type="dxa"/>
+              <w:right w:w="40.0" w:type="dxa"/>
             </w:tcMar>
             <w:vAlign w:val="top"/>
           </w:tcPr>
@@ -20186,10 +20218,10 @@
             </w:tcBorders>
             <w:shd w:fill="ffffff" w:val="clear"/>
             <w:tcMar>
-              <w:top w:w="80.0" w:type="dxa"/>
-              <w:left w:w="80.0" w:type="dxa"/>
-              <w:bottom w:w="80.0" w:type="dxa"/>
-              <w:right w:w="80.0" w:type="dxa"/>
+              <w:top w:w="40.0" w:type="dxa"/>
+              <w:left w:w="40.0" w:type="dxa"/>
+              <w:bottom w:w="40.0" w:type="dxa"/>
+              <w:right w:w="40.0" w:type="dxa"/>
             </w:tcMar>
             <w:vAlign w:val="top"/>
           </w:tcPr>
@@ -20221,7 +20253,7 @@
       <w:tr>
         <w:trPr>
           <w:cantSplit w:val="0"/>
-          <w:trHeight w:val="375" w:hRule="atLeast"/>
+          <w:trHeight w:val="315" w:hRule="atLeast"/>
           <w:tblHeader w:val="0"/>
         </w:trPr>
         <w:tc>
@@ -20234,10 +20266,10 @@
             </w:tcBorders>
             <w:shd w:fill="ffffff" w:val="clear"/>
             <w:tcMar>
-              <w:top w:w="80.0" w:type="dxa"/>
-              <w:left w:w="80.0" w:type="dxa"/>
-              <w:bottom w:w="80.0" w:type="dxa"/>
-              <w:right w:w="80.0" w:type="dxa"/>
+              <w:top w:w="40.0" w:type="dxa"/>
+              <w:left w:w="40.0" w:type="dxa"/>
+              <w:bottom w:w="40.0" w:type="dxa"/>
+              <w:right w:w="40.0" w:type="dxa"/>
             </w:tcMar>
             <w:vAlign w:val="top"/>
           </w:tcPr>
@@ -20275,10 +20307,10 @@
             </w:tcBorders>
             <w:shd w:fill="ffffff" w:val="clear"/>
             <w:tcMar>
-              <w:top w:w="80.0" w:type="dxa"/>
-              <w:left w:w="80.0" w:type="dxa"/>
-              <w:bottom w:w="80.0" w:type="dxa"/>
-              <w:right w:w="80.0" w:type="dxa"/>
+              <w:top w:w="40.0" w:type="dxa"/>
+              <w:left w:w="40.0" w:type="dxa"/>
+              <w:bottom w:w="40.0" w:type="dxa"/>
+              <w:right w:w="40.0" w:type="dxa"/>
             </w:tcMar>
             <w:vAlign w:val="top"/>
           </w:tcPr>
@@ -20316,10 +20348,10 @@
             </w:tcBorders>
             <w:shd w:fill="ffffff" w:val="clear"/>
             <w:tcMar>
-              <w:top w:w="80.0" w:type="dxa"/>
-              <w:left w:w="80.0" w:type="dxa"/>
-              <w:bottom w:w="80.0" w:type="dxa"/>
-              <w:right w:w="80.0" w:type="dxa"/>
+              <w:top w:w="40.0" w:type="dxa"/>
+              <w:left w:w="40.0" w:type="dxa"/>
+              <w:bottom w:w="40.0" w:type="dxa"/>
+              <w:right w:w="40.0" w:type="dxa"/>
             </w:tcMar>
             <w:vAlign w:val="top"/>
           </w:tcPr>
@@ -20351,7 +20383,7 @@
       <w:tr>
         <w:trPr>
           <w:cantSplit w:val="0"/>
-          <w:trHeight w:val="375" w:hRule="atLeast"/>
+          <w:trHeight w:val="315" w:hRule="atLeast"/>
           <w:tblHeader w:val="0"/>
         </w:trPr>
         <w:tc>
@@ -20364,10 +20396,10 @@
             </w:tcBorders>
             <w:shd w:fill="ffffff" w:val="clear"/>
             <w:tcMar>
-              <w:top w:w="80.0" w:type="dxa"/>
-              <w:left w:w="80.0" w:type="dxa"/>
-              <w:bottom w:w="80.0" w:type="dxa"/>
-              <w:right w:w="80.0" w:type="dxa"/>
+              <w:top w:w="40.0" w:type="dxa"/>
+              <w:left w:w="40.0" w:type="dxa"/>
+              <w:bottom w:w="40.0" w:type="dxa"/>
+              <w:right w:w="40.0" w:type="dxa"/>
             </w:tcMar>
             <w:vAlign w:val="top"/>
           </w:tcPr>
@@ -20405,10 +20437,10 @@
             </w:tcBorders>
             <w:shd w:fill="ffffff" w:val="clear"/>
             <w:tcMar>
-              <w:top w:w="80.0" w:type="dxa"/>
-              <w:left w:w="80.0" w:type="dxa"/>
-              <w:bottom w:w="80.0" w:type="dxa"/>
-              <w:right w:w="80.0" w:type="dxa"/>
+              <w:top w:w="40.0" w:type="dxa"/>
+              <w:left w:w="40.0" w:type="dxa"/>
+              <w:bottom w:w="40.0" w:type="dxa"/>
+              <w:right w:w="40.0" w:type="dxa"/>
             </w:tcMar>
             <w:vAlign w:val="top"/>
           </w:tcPr>
@@ -20446,10 +20478,10 @@
             </w:tcBorders>
             <w:shd w:fill="ffffff" w:val="clear"/>
             <w:tcMar>
-              <w:top w:w="80.0" w:type="dxa"/>
-              <w:left w:w="80.0" w:type="dxa"/>
-              <w:bottom w:w="80.0" w:type="dxa"/>
-              <w:right w:w="80.0" w:type="dxa"/>
+              <w:top w:w="40.0" w:type="dxa"/>
+              <w:left w:w="40.0" w:type="dxa"/>
+              <w:bottom w:w="40.0" w:type="dxa"/>
+              <w:right w:w="40.0" w:type="dxa"/>
             </w:tcMar>
             <w:vAlign w:val="top"/>
           </w:tcPr>
@@ -20481,7 +20513,7 @@
       <w:tr>
         <w:trPr>
           <w:cantSplit w:val="0"/>
-          <w:trHeight w:val="375" w:hRule="atLeast"/>
+          <w:trHeight w:val="315" w:hRule="atLeast"/>
           <w:tblHeader w:val="0"/>
         </w:trPr>
         <w:tc>
@@ -20494,10 +20526,10 @@
             </w:tcBorders>
             <w:shd w:fill="ffffff" w:val="clear"/>
             <w:tcMar>
-              <w:top w:w="80.0" w:type="dxa"/>
-              <w:left w:w="80.0" w:type="dxa"/>
-              <w:bottom w:w="80.0" w:type="dxa"/>
-              <w:right w:w="80.0" w:type="dxa"/>
+              <w:top w:w="40.0" w:type="dxa"/>
+              <w:left w:w="40.0" w:type="dxa"/>
+              <w:bottom w:w="40.0" w:type="dxa"/>
+              <w:right w:w="40.0" w:type="dxa"/>
             </w:tcMar>
             <w:vAlign w:val="top"/>
           </w:tcPr>
@@ -20535,10 +20567,10 @@
             </w:tcBorders>
             <w:shd w:fill="ffffff" w:val="clear"/>
             <w:tcMar>
-              <w:top w:w="80.0" w:type="dxa"/>
-              <w:left w:w="80.0" w:type="dxa"/>
-              <w:bottom w:w="80.0" w:type="dxa"/>
-              <w:right w:w="80.0" w:type="dxa"/>
+              <w:top w:w="40.0" w:type="dxa"/>
+              <w:left w:w="40.0" w:type="dxa"/>
+              <w:bottom w:w="40.0" w:type="dxa"/>
+              <w:right w:w="40.0" w:type="dxa"/>
             </w:tcMar>
             <w:vAlign w:val="top"/>
           </w:tcPr>
@@ -20576,10 +20608,10 @@
             </w:tcBorders>
             <w:shd w:fill="ffffff" w:val="clear"/>
             <w:tcMar>
-              <w:top w:w="80.0" w:type="dxa"/>
-              <w:left w:w="80.0" w:type="dxa"/>
-              <w:bottom w:w="80.0" w:type="dxa"/>
-              <w:right w:w="80.0" w:type="dxa"/>
+              <w:top w:w="40.0" w:type="dxa"/>
+              <w:left w:w="40.0" w:type="dxa"/>
+              <w:bottom w:w="40.0" w:type="dxa"/>
+              <w:right w:w="40.0" w:type="dxa"/>
             </w:tcMar>
             <w:vAlign w:val="top"/>
           </w:tcPr>
@@ -20611,7 +20643,7 @@
       <w:tr>
         <w:trPr>
           <w:cantSplit w:val="0"/>
-          <w:trHeight w:val="375" w:hRule="atLeast"/>
+          <w:trHeight w:val="315" w:hRule="atLeast"/>
           <w:tblHeader w:val="0"/>
         </w:trPr>
         <w:tc>
@@ -20624,10 +20656,10 @@
             </w:tcBorders>
             <w:shd w:fill="ffffff" w:val="clear"/>
             <w:tcMar>
-              <w:top w:w="80.0" w:type="dxa"/>
-              <w:left w:w="80.0" w:type="dxa"/>
-              <w:bottom w:w="80.0" w:type="dxa"/>
-              <w:right w:w="80.0" w:type="dxa"/>
+              <w:top w:w="40.0" w:type="dxa"/>
+              <w:left w:w="40.0" w:type="dxa"/>
+              <w:bottom w:w="40.0" w:type="dxa"/>
+              <w:right w:w="40.0" w:type="dxa"/>
             </w:tcMar>
             <w:vAlign w:val="top"/>
           </w:tcPr>
@@ -20665,10 +20697,10 @@
             </w:tcBorders>
             <w:shd w:fill="ffffff" w:val="clear"/>
             <w:tcMar>
-              <w:top w:w="80.0" w:type="dxa"/>
-              <w:left w:w="80.0" w:type="dxa"/>
-              <w:bottom w:w="80.0" w:type="dxa"/>
-              <w:right w:w="80.0" w:type="dxa"/>
+              <w:top w:w="40.0" w:type="dxa"/>
+              <w:left w:w="40.0" w:type="dxa"/>
+              <w:bottom w:w="40.0" w:type="dxa"/>
+              <w:right w:w="40.0" w:type="dxa"/>
             </w:tcMar>
             <w:vAlign w:val="top"/>
           </w:tcPr>
@@ -20706,10 +20738,10 @@
             </w:tcBorders>
             <w:shd w:fill="ffffff" w:val="clear"/>
             <w:tcMar>
-              <w:top w:w="80.0" w:type="dxa"/>
-              <w:left w:w="80.0" w:type="dxa"/>
-              <w:bottom w:w="80.0" w:type="dxa"/>
-              <w:right w:w="80.0" w:type="dxa"/>
+              <w:top w:w="40.0" w:type="dxa"/>
+              <w:left w:w="40.0" w:type="dxa"/>
+              <w:bottom w:w="40.0" w:type="dxa"/>
+              <w:right w:w="40.0" w:type="dxa"/>
             </w:tcMar>
             <w:vAlign w:val="top"/>
           </w:tcPr>
@@ -20793,7 +20825,7 @@
           <w:szCs w:val="21"/>
           <w:rtl w:val="0"/>
         </w:rPr>
-        <w:t xml:space="preserve">Reducción del tiempo heurístico (%) = 100 × (tE − tH) / tE, donde tE es la media del exacto B sin flota fija y tH la media de la heurística.</w:t>
+        <w:t xml:space="preserve">Reducción del tiempo heurístico (%) = 100 × (tE − tH) / tE, donde tE es la media del exacto sin flota fija y tH la media de la heurística.</w:t>
       </w:r>
     </w:p>
     <w:p>
@@ -20812,7 +20844,7 @@
           <w:szCs w:val="21"/>
           <w:rtl w:val="0"/>
         </w:rPr>
-        <w:t xml:space="preserve">Reducción temporal = 99.9933%; la diferencia con signo 100 × (tH − tE) / tE sería −99.9933%. No es una brecha de optimalidad.</w:t>
+        <w:t xml:space="preserve">La reducción temporal es 99.9933%, calculada respecto del tiempo medio exacto. La diferencia porcentual con signo, tomando heurística menos exacto, es −99.9933%.</w:t>
       </w:r>
     </w:p>
     <w:p>
@@ -20830,7 +20862,7 @@
           <w:szCs w:val="21"/>
           <w:rtl w:val="0"/>
         </w:rPr>
-        <w:t xml:space="preserve">La heurística recorre 20.263383 unidades adicionales: un GAP de costo de 6.352% con base en el óptimo. En sentido inverso, el exacto reduce 5.973% la distancia con base en la heurística, que es el porcentaje usado en la sección ambiental. El exacto B tarda 2.975 s en promedio y la heurística 0.198 ms: la razón entre medias es aproximadamente 15,008. Esta razón depende de la implementación y del equipo; los tiempos submilisegundo son particularmente sensibles al ruido de medición. La heurística es rápida, pero no certifica optimalidad.</w:t>
+        <w:t xml:space="preserve">La Figura 5 compara la calidad y el tiempo de ambos métodos. La heurística recorre 20.263383 unidades adicionales, con GAP de 6.352% respecto del óptimo. El método exacto tarda 2.975 s en promedio y la heurística 0.198 ms, una razón entre medias cercana a 15,008. La escala logarítmica del panel temporal permite representar esta diferencia de órdenes de magnitud. En esta instancia, la heurística ofrece una respuesta muy rápida a cambio de una distancia mayor; las magnitudes temporales dependen de la implementación y del equipo.</w:t>
       </w:r>
     </w:p>
     <w:p>
@@ -20852,12 +20884,12 @@
           <wp:inline distB="114300" distT="114300" distL="114300" distR="114300">
             <wp:extent cx="5524500" cy="2489200"/>
             <wp:effectExtent b="0" l="0" r="0" t="0"/>
-            <wp:docPr descr="Figura 5. Distancia y tiempo medio del modelo B sin flota fija y de Clarke–Wright + 2-opt. Medición principal del 15 de octubre de 2026; tiempos en escala logarítmica." id="2" name="image14.png"/>
+            <wp:docPr descr="Figura 5. Distancia y tiempo medio del método exacto y la heurística. Diez ejecuciones; tiempo en escala logarítmica." id="1" name="image14.png"/>
             <a:graphic>
               <a:graphicData uri="http://schemas.openxmlformats.org/drawingml/2006/picture">
                 <pic:pic>
                   <pic:nvPicPr>
-                    <pic:cNvPr descr="Figura 5. Distancia y tiempo medio del modelo B sin flota fija y de Clarke–Wright + 2-opt. Medición principal del 15 de octubre de 2026; tiempos en escala logarítmica." id="0" name="image14.png"/>
+                    <pic:cNvPr descr="Figura 5. Distancia y tiempo medio del método exacto y la heurística. Diez ejecuciones; tiempo en escala logarítmica." id="0" name="image14.png"/>
                     <pic:cNvPicPr preferRelativeResize="0"/>
                   </pic:nvPicPr>
                   <pic:blipFill>
@@ -20902,7 +20934,7 @@
           <w:szCs w:val="18"/>
           <w:rtl w:val="0"/>
         </w:rPr>
-        <w:t xml:space="preserve">Figura 5. Distancia y tiempo medio del modelo B sin flota fija y de Clarke–Wright + 2-opt. Medición principal del 15 de octubre de 2026; tiempos en escala logarítmica.</w:t>
+        <w:t xml:space="preserve">Figura 5. Distancia y tiempo medio del método exacto y la heurística. Diez ejecuciones; tiempo en escala logarítmica.</w:t>
       </w:r>
     </w:p>
     <w:p>
@@ -20920,7 +20952,7 @@
           <w:szCs w:val="21"/>
           <w:rtl w:val="0"/>
         </w:rPr>
-        <w:t xml:space="preserve">En el caso libre, los diez registros de B reportan 240 nodos y 20,066 iteraciones cada uno. Con tres rutas reportan 8,247 nodos y 204,300 iteraciones, y un tiempo medio de 10.979 ± 0.641 s. Fijar la flota vuelve más exigente la búsqueda en esta instancia. Las iteraciones de CBC no son comparables con las fusiones o inversiones 2-opt de la heurística. Las pruebas de optimalidad y la certificación por particiones respaldan los dos valores objetivos.</w:t>
+        <w:t xml:space="preserve">En el caso sin flota fija, CBC registra 240 nodos de búsqueda y 20,066 iteraciones en cada ejecución. Con tres rutas, estos valores aumentan a 8,247 nodos y 204,300 iteraciones, y el tiempo medio llega a 10.979 ± 0.641 s. La mayor exploración muestra que fijar la flota hace más exigente la resolución de esta instancia.</w:t>
       </w:r>
     </w:p>
     <w:p>
@@ -20936,8 +20968,8 @@
           <w:szCs w:val="26"/>
         </w:rPr>
       </w:pPr>
-      <w:bookmarkStart w:colFirst="0" w:colLast="0" w:name="_a6ojoh2u87l" w:id="22"/>
-      <w:bookmarkEnd w:id="22"/>
+      <w:bookmarkStart w:colFirst="0" w:colLast="0" w:name="_5mr1k71lsr5d" w:id="24"/>
+      <w:bookmarkEnd w:id="24"/>
       <w:r>
         <w:rPr>
           <w:b w:val="1"/>
@@ -20964,7 +20996,77 @@
           <w:szCs w:val="21"/>
           <w:rtl w:val="0"/>
         </w:rPr>
-        <w:t xml:space="preserve">La comparación adicional utilizó calentamientos por variante y escenario, diez repeticiones y orden rotado A/B/C. Está guardada en results/comparacion_variantes_2026-10-15/. Sin flota fija, las medias fueron A = 5.49 s, B = 2.07 s y C = 1.78 s, con optimalidad en todas las repeticiones. Con tres rutas, B y C probaron 10/10 con medias de 17.4 s y 23.4 s; A probó 2/10 y consumió en promedio 113.5 s. Este último promedio incluye detenciones por tiempo y no representa tiempo hasta el óptimo.</w:t>
+        <w:t xml:space="preserve">Para evaluar el efecto de la formulación, se compararon tres variantes: A añade al modelo de flujo restricciones explícitas de eliminación de subrutas; B es la formulación principal de la sección 4; C refuerza B con las cotas q</w:t>
+      </w:r>
+      <w:r>
+        <w:rPr>
+          <w:sz w:val="21"/>
+          <w:szCs w:val="21"/>
+          <w:vertAlign w:val="subscript"/>
+          <w:rtl w:val="0"/>
+        </w:rPr>
+        <w:t xml:space="preserve">j</w:t>
+      </w:r>
+      <w:r>
+        <w:rPr>
+          <w:sz w:val="21"/>
+          <w:szCs w:val="21"/>
+          <w:rtl w:val="0"/>
+        </w:rPr>
+        <w:t xml:space="preserve"> xᵢ</w:t>
+      </w:r>
+      <w:r>
+        <w:rPr>
+          <w:sz w:val="21"/>
+          <w:szCs w:val="21"/>
+          <w:vertAlign w:val="subscript"/>
+          <w:rtl w:val="0"/>
+        </w:rPr>
+        <w:t xml:space="preserve">j</w:t>
+      </w:r>
+      <w:r>
+        <w:rPr>
+          <w:rFonts w:ascii="Caudex" w:cs="Caudex" w:eastAsia="Caudex" w:hAnsi="Caudex"/>
+          <w:sz w:val="21"/>
+          <w:szCs w:val="21"/>
+          <w:rtl w:val="0"/>
+        </w:rPr>
+        <w:t xml:space="preserve"> ≤ fᵢ</w:t>
+      </w:r>
+      <w:r>
+        <w:rPr>
+          <w:sz w:val="21"/>
+          <w:szCs w:val="21"/>
+          <w:vertAlign w:val="subscript"/>
+          <w:rtl w:val="0"/>
+        </w:rPr>
+        <w:t xml:space="preserve">j</w:t>
+      </w:r>
+      <w:r>
+        <w:rPr>
+          <w:rFonts w:ascii="Caudex" w:cs="Caudex" w:eastAsia="Caudex" w:hAnsi="Caudex"/>
+          <w:sz w:val="21"/>
+          <w:szCs w:val="21"/>
+          <w:rtl w:val="0"/>
+        </w:rPr>
+        <w:t xml:space="preserve"> ≤ (Q − qᵢ)xᵢ</w:t>
+      </w:r>
+      <w:r>
+        <w:rPr>
+          <w:sz w:val="21"/>
+          <w:szCs w:val="21"/>
+          <w:vertAlign w:val="subscript"/>
+          <w:rtl w:val="0"/>
+        </w:rPr>
+        <w:t xml:space="preserve">j</w:t>
+      </w:r>
+      <w:r>
+        <w:rPr>
+          <w:sz w:val="21"/>
+          <w:szCs w:val="21"/>
+          <w:rtl w:val="0"/>
+        </w:rPr>
+        <w:t xml:space="preserve">. La variante A incluye 1,013 restricciones por subconjuntos de clientes y tiene 1,167 restricciones en total; B tiene 154 y C, 264. Las tres describen las mismas soluciones enteras factibles para esta instancia.</w:t>
       </w:r>
     </w:p>
     <w:p>
@@ -20982,7 +21084,7 @@
           <w:szCs w:val="21"/>
           <w:rtl w:val="0"/>
         </w:rPr>
-        <w:t xml:space="preserve">Aunque C fortalece la relajación de B mediante cotas de carga, fue más lenta en el escenario de tres rutas. B ofrece una formulación compacta y resolvió ambos escenarios en las pruebas. La diferencia entre 2.07 s en esta comparación y 2.975 s en la medición principal ilustra la variación entre experimentos; no se mezclan ambas medias ni se atribuye su causa a un componente del equipo sin mediciones adicionales.</w:t>
+        <w:t xml:space="preserve">Esta comparación empleó diez repeticiones, un calentamiento por variante y escenario, orden rotado A/B/C y límite de 120 s por ejecución. Sin flota fija, los tiempos medios fueron 5.49 s, 2.07 s y 1.78 s para A, B y C, respectivamente, con optimalidad probada en todas las corridas. Con tres rutas, B y C probaron el óptimo en diez de diez ejecuciones y tardaron 17.4 s y 23.4 s en promedio. A lo probó en dos de diez y consumió 113.5 s en promedio, incluyendo las corridas detenidas por tiempo. La formulación compacta fue favorable en estos ensayos, mientras que reforzar sus cotas no mejoró ambos escenarios. Este experimento se analiza por separado de la medición principal de la sección 7.1.</w:t>
       </w:r>
     </w:p>
     <w:p>
@@ -20998,8 +21100,8 @@
           <w:szCs w:val="36"/>
         </w:rPr>
       </w:pPr>
-      <w:bookmarkStart w:colFirst="0" w:colLast="0" w:name="_ug3n2vwbibnd" w:id="23"/>
-      <w:bookmarkEnd w:id="23"/>
+      <w:bookmarkStart w:colFirst="0" w:colLast="0" w:name="_q9ymidp3jfd2" w:id="25"/>
+      <w:bookmarkEnd w:id="25"/>
       <w:r>
         <w:rPr>
           <w:b w:val="1"/>
@@ -21031,6 +21133,7 @@
     </w:p>
     <w:p>
       <w:pPr>
+        <w:keepNext w:val="1"/>
         <w:spacing w:after="140" w:line="288" w:lineRule="auto"/>
         <w:jc w:val="both"/>
         <w:rPr>
@@ -21078,8 +21181,8 @@
           <w:szCs w:val="36"/>
         </w:rPr>
       </w:pPr>
-      <w:bookmarkStart w:colFirst="0" w:colLast="0" w:name="_nkvbssqi0l2y" w:id="24"/>
-      <w:bookmarkEnd w:id="24"/>
+      <w:bookmarkStart w:colFirst="0" w:colLast="0" w:name="_xig72eb1n5mb" w:id="26"/>
+      <w:bookmarkEnd w:id="26"/>
       <w:r>
         <w:rPr>
           <w:b w:val="1"/>
@@ -21106,7 +21209,7 @@
           <w:szCs w:val="21"/>
           <w:rtl w:val="0"/>
         </w:rPr>
-        <w:t xml:space="preserve">Se necesitan al menos tres rutas y se puede atender a todos los clientes con ellas, pero minimizar sólo distancia produce cuatro rutas y 318.989487 unidades. Con exactamente tres rutas, B prueba 339.164674 unidades: 6.325% más recorrido a cambio de una mayor ocupación. La certificación independiente coincide con ambas soluciones. Por ello, elegir entre tres y cuatro vehículos exige conocer el costo fijo por vehículo y el objetivo operativo, además de los kilómetros.</w:t>
+        <w:t xml:space="preserve">La instancia requiere al menos tres rutas y puede atenderse con esa flota, pero la menor distancia se alcanza con cuatro rutas y 318.989487 unidades. Con tres vehículos, la distancia sube a 339.164674 unidades: un incremento de 6.325% acompañado de mayor utilización de capacidad. La elección operativa depende, por tanto, del costo fijo de los vehículos y del valor asignado al recorrido.</w:t>
       </w:r>
     </w:p>
     <w:p>
@@ -21124,7 +21227,7 @@
           <w:szCs w:val="21"/>
           <w:rtl w:val="0"/>
         </w:rPr>
-        <w:t xml:space="preserve">La heurística produce una solución factible de 339.252870 unidades, con GAP de 6.352%. En la medición principal tarda 0.198 ms frente a 2.975 s del exacto B sin flota fija. El modelo compacto conserva explícitamente recorrido, carga, visitas y capacidad; la conectividad se demuestra mediante balances de producto. Estos resultados pertenecen a una instancia didáctica, sin congestión, ventanas de tiempo ni mediciones de emisiones. La simetría permite recorridos inversos equivalentes y puede añadir soluciones simétricas a la búsqueda; no invalida el modelo. Una extensión futura debería evaluar mejoras entre rutas con varias instancias y protocolos comparables.</w:t>
+        <w:t xml:space="preserve">Clarke–Wright + 2-opt produce una solución factible de 339.252870 unidades, con GAP de 6.352%. Su tiempo medio de 0.198 ms, frente a 2.975 s del modelo exacto, muestra su utilidad como procedimiento rápido para esta instancia. El modelo de flujo permite representar explícitamente recorridos, cargas, visitas y capacidad, y certificar la calidad de la solución heurística. Como siguiente etapa se propone incorporar mejoras entre rutas y evaluar varias instancias antes de extender el análisis a congestión, horarios y emisiones.</w:t>
       </w:r>
     </w:p>
     <w:p>
@@ -21140,8 +21243,8 @@
           <w:szCs w:val="36"/>
         </w:rPr>
       </w:pPr>
-      <w:bookmarkStart w:colFirst="0" w:colLast="0" w:name="_2rgrvl3oypk" w:id="25"/>
-      <w:bookmarkEnd w:id="25"/>
+      <w:bookmarkStart w:colFirst="0" w:colLast="0" w:name="_jm0rr5oe7ch" w:id="27"/>
+      <w:bookmarkEnd w:id="27"/>
       <w:r>
         <w:rPr>
           <w:b w:val="1"/>
@@ -21937,8 +22040,8 @@
           <w:szCs w:val="36"/>
         </w:rPr>
       </w:pPr>
-      <w:bookmarkStart w:colFirst="0" w:colLast="0" w:name="_bsr8grqjc2i3" w:id="26"/>
-      <w:bookmarkEnd w:id="26"/>
+      <w:bookmarkStart w:colFirst="0" w:colLast="0" w:name="_heqdnrq79eot" w:id="28"/>
+      <w:bookmarkEnd w:id="28"/>
       <w:r>
         <w:rPr>
           <w:b w:val="1"/>
@@ -21965,7 +22068,7 @@
           <w:szCs w:val="21"/>
           <w:rtl w:val="0"/>
         </w:rPr>
-        <w:t xml:space="preserve">El repositorio</w:t>
+        <w:t xml:space="preserve">El código completo, la instancia y los resultados se encuentran en</w:t>
       </w:r>
       <w:hyperlink r:id="rId53">
         <w:r>
@@ -21986,7 +22089,7 @@
             <w:u w:val="single"/>
             <w:rtl w:val="0"/>
           </w:rPr>
-          <w:t xml:space="preserve">https://github.com/Leo-issacs/cvrp-logistica-urbana</w:t>
+          <w:t xml:space="preserve">https://github.com/Leo-issacs/cvrp-logistica-urbana.</w:t>
         </w:r>
       </w:hyperlink>
       <w:r>
@@ -21995,7 +22098,7 @@
           <w:szCs w:val="21"/>
           <w:rtl w:val="0"/>
         </w:rPr>
-        <w:t xml:space="preserve"> contiene src/resolver_cvrp_arcos.py completo, datos, pruebas y registros. Los extractos siguientes muestran el constructor de las variantes y la heurística vigentes en el commit 1cef187. Las funciones auxiliares, la clasificación de estados y las mediciones se consultan en el archivo completo. B es el valor predeterminado; A se conserva para reproducir antecedentes y C para experimentación.</w:t>
+        <w:t xml:space="preserve"> Los siguientes extractos muestran la construcción del modelo y la heurística. Las opciones A, B y C corresponden a las variantes definidas en la sección 7.2; B selecciona la formulación principal.</w:t>
       </w:r>
     </w:p>
     <w:p>
@@ -22051,7 +22154,7 @@
           <w:szCs w:val="21"/>
           <w:rtl w:val="0"/>
         </w:rPr>
-        <w:t xml:space="preserve">El constructor siguiente genera los arcos x y la carga f. Sus dependencias son math, itertools como it, pulp y el diccionario MODELOS del mismo módulo. La rama A agrega subtours; la rama B conserva únicamente las restricciones de flujo y capacidad descritas en la sección 4.</w:t>
+        <w:t xml:space="preserve">La función construir_modelo genera las variables de recorrido y carga, la función objetivo y las restricciones. Utiliza math, itertools como it, PuLP y el diccionario MODELOS del módulo. El parámetro fixed_k permite fijar el número de rutas.</w:t>
       </w:r>
     </w:p>
     <w:p>
@@ -23265,7 +23368,7 @@
           <w:szCs w:val="21"/>
           <w:rtl w:val="0"/>
         </w:rPr>
-        <w:t xml:space="preserve">La función exacto devuelve rutas e información del solver. Sólo optimo_probado permite afirmar optimalidad; factible_sin_prueba conserva un incumbente, sin_solucion_factible identifica que no se dispone de solución entera y fallo_solver registra incidencias. La causa distingue una infactibilidad demostrada de un límite sin solución encontrada. La verificación de cobertura, capacidad, flujo y la certificación por particiones se realizan fuera del tiempo medido. En esta versión el lector admite únicamente demandas positivas de clientes; la posible extensión a demandas nulas requiere adaptar también esa validación de entrada.</w:t>
+        <w:t xml:space="preserve">El programa verifica la cobertura de clientes, la capacidad y la continuidad de las rutas. La clasificación del solver distingue optimalidad probada de una solución factible obtenida al alcanzar el límite de tiempo. La certificación por particiones se realiza fuera del intervalo usado para medir el tiempo de solución.</w:t>
       </w:r>
     </w:p>
     <w:p>

</xml_diff>